<commit_message>
add Project Objectives to the Document
</commit_message>
<xml_diff>
--- a/Documentation/Analysis/System Proposal/System proposal.docx
+++ b/Documentation/Analysis/System Proposal/System proposal.docx
@@ -1,6 +1,6 @@
 
 <file path=word/document.xml><?xml version="1.0" encoding="utf-8"?>
-<w:document xmlns:wpc="http://schemas.microsoft.com/office/word/2010/wordprocessingCanvas" xmlns:cx="http://schemas.microsoft.com/office/drawing/2014/chartex" xmlns:cx1="http://schemas.microsoft.com/office/drawing/2015/9/8/chartex" xmlns:cx2="http://schemas.microsoft.com/office/drawing/2015/10/21/chartex" xmlns:cx3="http://schemas.microsoft.com/office/drawing/2016/5/9/chartex" xmlns:cx4="http://schemas.microsoft.com/office/drawing/2016/5/10/chartex" xmlns:cx5="http://schemas.microsoft.com/office/drawing/2016/5/11/chartex" xmlns:cx6="http://schemas.microsoft.com/office/drawing/2016/5/12/chartex" xmlns:cx7="http://schemas.microsoft.com/office/drawing/2016/5/13/chartex" xmlns:cx8="http://schemas.microsoft.com/office/drawing/2016/5/14/chartex" xmlns:mc="http://schemas.openxmlformats.org/markup-compatibility/2006" xmlns:aink="http://schemas.microsoft.com/office/drawing/2016/ink" xmlns:am3d="http://schemas.microsoft.com/office/drawing/2017/model3d" xmlns:o="urn:schemas-microsoft-com:office:office" xmlns:oel="http://schemas.microsoft.com/office/2019/extlst" xmlns:r="http://schemas.openxmlformats.org/officeDocument/2006/relationships" xmlns:m="http://schemas.openxmlformats.org/officeDocument/2006/math" xmlns:v="urn:schemas-microsoft-com:vml" xmlns:wp14="http://schemas.microsoft.com/office/word/2010/wordprocessingDrawing" xmlns:wp="http://schemas.openxmlformats.org/drawingml/2006/wordprocessingDrawing" xmlns:w10="urn:schemas-microsoft-com:office:word" xmlns:w="http://schemas.openxmlformats.org/wordprocessingml/2006/main" xmlns:w14="http://schemas.microsoft.com/office/word/2010/wordml" xmlns:w15="http://schemas.microsoft.com/office/word/2012/wordml" xmlns:w16cex="http://schemas.microsoft.com/office/word/2018/wordml/cex" xmlns:w16cid="http://schemas.microsoft.com/office/word/2016/wordml/cid" xmlns:w16="http://schemas.microsoft.com/office/word/2018/wordml" xmlns:w16sdtdh="http://schemas.microsoft.com/office/word/2020/wordml/sdtdatahash" xmlns:w16se="http://schemas.microsoft.com/office/word/2015/wordml/symex" xmlns:wpg="http://schemas.microsoft.com/office/word/2010/wordprocessingGroup" xmlns:wpi="http://schemas.microsoft.com/office/word/2010/wordprocessingInk" xmlns:wne="http://schemas.microsoft.com/office/word/2006/wordml" xmlns:wps="http://schemas.microsoft.com/office/word/2010/wordprocessingShape" mc:Ignorable="w14 w15 w16se w16cid w16 w16cex w16sdtdh wp14">
+<w:document xmlns:wpc="http://schemas.microsoft.com/office/word/2010/wordprocessingCanvas" xmlns:cx="http://schemas.microsoft.com/office/drawing/2014/chartex" xmlns:cx1="http://schemas.microsoft.com/office/drawing/2015/9/8/chartex" xmlns:cx2="http://schemas.microsoft.com/office/drawing/2015/10/21/chartex" xmlns:cx3="http://schemas.microsoft.com/office/drawing/2016/5/9/chartex" xmlns:cx4="http://schemas.microsoft.com/office/drawing/2016/5/10/chartex" xmlns:cx5="http://schemas.microsoft.com/office/drawing/2016/5/11/chartex" xmlns:cx6="http://schemas.microsoft.com/office/drawing/2016/5/12/chartex" xmlns:cx7="http://schemas.microsoft.com/office/drawing/2016/5/13/chartex" xmlns:cx8="http://schemas.microsoft.com/office/drawing/2016/5/14/chartex" xmlns:mc="http://schemas.openxmlformats.org/markup-compatibility/2006" xmlns:aink="http://schemas.microsoft.com/office/drawing/2016/ink" xmlns:am3d="http://schemas.microsoft.com/office/drawing/2017/model3d" xmlns:o="urn:schemas-microsoft-com:office:office" xmlns:r="http://schemas.openxmlformats.org/officeDocument/2006/relationships" xmlns:m="http://schemas.openxmlformats.org/officeDocument/2006/math" xmlns:v="urn:schemas-microsoft-com:vml" xmlns:wp14="http://schemas.microsoft.com/office/word/2010/wordprocessingDrawing" xmlns:wp="http://schemas.openxmlformats.org/drawingml/2006/wordprocessingDrawing" xmlns:w10="urn:schemas-microsoft-com:office:word" xmlns:w="http://schemas.openxmlformats.org/wordprocessingml/2006/main" xmlns:w14="http://schemas.microsoft.com/office/word/2010/wordml" xmlns:w15="http://schemas.microsoft.com/office/word/2012/wordml" xmlns:w16cex="http://schemas.microsoft.com/office/word/2018/wordml/cex" xmlns:w16cid="http://schemas.microsoft.com/office/word/2016/wordml/cid" xmlns:w16="http://schemas.microsoft.com/office/word/2018/wordml" xmlns:w16sdtdh="http://schemas.microsoft.com/office/word/2020/wordml/sdtdatahash" xmlns:w16se="http://schemas.microsoft.com/office/word/2015/wordml/symex" xmlns:wpg="http://schemas.microsoft.com/office/word/2010/wordprocessingGroup" xmlns:wpi="http://schemas.microsoft.com/office/word/2010/wordprocessingInk" xmlns:wne="http://schemas.microsoft.com/office/word/2006/wordml" xmlns:wps="http://schemas.microsoft.com/office/word/2010/wordprocessingShape" mc:Ignorable="w14 w15 w16se w16cid w16 w16cex w16sdtdh wp14">
   <w:body>
     <w:p>
       <w:pPr>
@@ -266,10 +266,13 @@
     <w:sdt>
       <w:sdtPr>
         <w:rPr>
+          <w:b w:val="0"/>
+          <w:bCs w:val="0"/>
           <w:color w:val="000000"/>
           <w:sz w:val="22"/>
           <w:szCs w:val="22"/>
           <w:rtl/>
+          <w:lang w:bidi="ar-SA"/>
         </w:rPr>
         <w:id w:val="-2046367612"/>
         <w:docPartObj>
@@ -280,8 +283,6 @@
       <w:sdtEndPr>
         <w:rPr>
           <w:rFonts w:ascii="Vazirmatn" w:hAnsi="Vazirmatn" w:hint="cs"/>
-          <w:b w:val="0"/>
-          <w:bCs w:val="0"/>
           <w:noProof/>
         </w:rPr>
       </w:sdtEndPr>
@@ -3570,7 +3571,7 @@
         <w:p>
           <w:pPr>
             <w:rPr>
-              <w:rFonts w:ascii="Vazirmatn" w:hAnsi="Vazirmatn" w:hint="cs"/>
+              <w:rFonts w:ascii="Vazirmatn" w:hAnsi="Vazirmatn"/>
               <w:noProof/>
               <w:lang w:bidi="fa-IR"/>
             </w:rPr>
@@ -4338,7 +4339,6 @@
     <w:p>
       <w:pPr>
         <w:rPr>
-          <w:rFonts w:hint="cs"/>
           <w:lang w:bidi="fa-IR"/>
         </w:rPr>
       </w:pPr>
@@ -4384,7 +4384,575 @@
     </w:p>
     <w:p>
       <w:pPr>
-        <w:bidi w:val="0"/>
+        <w:spacing w:before="0" w:line="240" w:lineRule="auto"/>
+        <w:jc w:val="left"/>
+        <w:rPr>
+          <w:rtl/>
+          <w:lang w:bidi="fa-IR"/>
+        </w:rPr>
+      </w:pPr>
+    </w:p>
+    <w:p>
+      <w:pPr>
+        <w:spacing w:before="0" w:line="240" w:lineRule="auto"/>
+        <w:jc w:val="left"/>
+        <w:rPr>
+          <w:rtl/>
+          <w:lang w:bidi="fa-IR"/>
+        </w:rPr>
+      </w:pPr>
+    </w:p>
+    <w:p>
+      <w:pPr>
+        <w:pStyle w:val="ListParagraph"/>
+        <w:numPr>
+          <w:ilvl w:val="0"/>
+          <w:numId w:val="11"/>
+        </w:numPr>
+        <w:spacing w:before="0" w:line="240" w:lineRule="auto"/>
+        <w:jc w:val="left"/>
+        <w:rPr>
+          <w:b/>
+          <w:bCs/>
+          <w:color w:val="00A2FF"/>
+          <w:lang w:bidi="fa-IR"/>
+        </w:rPr>
+      </w:pPr>
+      <w:r>
+        <w:rPr>
+          <w:rtl/>
+        </w:rPr>
+        <w:t>تسهیل رزرو نوبت بدون محدودیت زمان و مکان و بدون نیاز به تماس تلفنی</w:t>
+      </w:r>
+    </w:p>
+    <w:p>
+      <w:pPr>
+        <w:pStyle w:val="ListParagraph"/>
+        <w:spacing w:before="0" w:line="240" w:lineRule="auto"/>
+        <w:jc w:val="left"/>
+        <w:rPr>
+          <w:b/>
+          <w:bCs/>
+          <w:color w:val="00A2FF"/>
+          <w:lang w:bidi="fa-IR"/>
+        </w:rPr>
+      </w:pPr>
+    </w:p>
+    <w:p>
+      <w:pPr>
+        <w:pStyle w:val="ListParagraph"/>
+        <w:numPr>
+          <w:ilvl w:val="0"/>
+          <w:numId w:val="11"/>
+        </w:numPr>
+        <w:spacing w:before="0" w:line="240" w:lineRule="auto"/>
+        <w:jc w:val="left"/>
+        <w:rPr>
+          <w:b/>
+          <w:bCs/>
+          <w:color w:val="00A2FF"/>
+          <w:lang w:bidi="fa-IR"/>
+        </w:rPr>
+      </w:pPr>
+      <w:r>
+        <w:rPr>
+          <w:rtl/>
+        </w:rPr>
+        <w:t>معرفی و دیده</w:t>
+      </w:r>
+      <w:r>
+        <w:rPr>
+          <w:rFonts w:ascii="Times New Roman" w:hAnsi="Times New Roman" w:cs="Times New Roman"/>
+        </w:rPr>
+        <w:t>‌</w:t>
+      </w:r>
+      <w:r>
+        <w:rPr>
+          <w:rtl/>
+        </w:rPr>
+        <w:t>شدن کسب</w:t>
+      </w:r>
+      <w:r>
+        <w:rPr>
+          <w:rFonts w:ascii="Times New Roman" w:hAnsi="Times New Roman" w:cs="Times New Roman"/>
+        </w:rPr>
+        <w:t>‌</w:t>
+      </w:r>
+      <w:r>
+        <w:rPr>
+          <w:rtl/>
+        </w:rPr>
+        <w:t>وکارهای مختلف در یک پلتفرم واحد</w:t>
+      </w:r>
+    </w:p>
+    <w:p>
+      <w:pPr>
+        <w:spacing w:before="0" w:line="240" w:lineRule="auto"/>
+        <w:jc w:val="left"/>
+        <w:rPr>
+          <w:b/>
+          <w:bCs/>
+          <w:color w:val="00A2FF"/>
+          <w:lang w:bidi="fa-IR"/>
+        </w:rPr>
+      </w:pPr>
+    </w:p>
+    <w:p>
+      <w:pPr>
+        <w:pStyle w:val="ListParagraph"/>
+        <w:numPr>
+          <w:ilvl w:val="0"/>
+          <w:numId w:val="11"/>
+        </w:numPr>
+        <w:spacing w:before="0" w:line="240" w:lineRule="auto"/>
+        <w:jc w:val="left"/>
+        <w:rPr>
+          <w:b/>
+          <w:bCs/>
+          <w:color w:val="00A2FF"/>
+          <w:lang w:bidi="fa-IR"/>
+        </w:rPr>
+      </w:pPr>
+      <w:r>
+        <w:rPr>
+          <w:rtl/>
+        </w:rPr>
+        <w:t>گسترش بازار و جذب مشتری حتی از شهرهای دیگر برای کسب</w:t>
+      </w:r>
+      <w:r>
+        <w:rPr>
+          <w:rFonts w:ascii="Times New Roman" w:hAnsi="Times New Roman" w:cs="Times New Roman"/>
+        </w:rPr>
+        <w:t>‌</w:t>
+      </w:r>
+      <w:r>
+        <w:rPr>
+          <w:rtl/>
+        </w:rPr>
+        <w:t>وکارها</w:t>
+      </w:r>
+    </w:p>
+    <w:p>
+      <w:pPr>
+        <w:spacing w:before="0" w:line="240" w:lineRule="auto"/>
+        <w:jc w:val="left"/>
+        <w:rPr>
+          <w:b/>
+          <w:bCs/>
+          <w:color w:val="00A2FF"/>
+          <w:lang w:bidi="fa-IR"/>
+        </w:rPr>
+      </w:pPr>
+    </w:p>
+    <w:p>
+      <w:pPr>
+        <w:pStyle w:val="ListParagraph"/>
+        <w:numPr>
+          <w:ilvl w:val="0"/>
+          <w:numId w:val="11"/>
+        </w:numPr>
+        <w:spacing w:before="0" w:line="240" w:lineRule="auto"/>
+        <w:jc w:val="left"/>
+        <w:rPr>
+          <w:b/>
+          <w:bCs/>
+          <w:color w:val="00A2FF"/>
+          <w:lang w:bidi="fa-IR"/>
+        </w:rPr>
+      </w:pPr>
+      <w:r>
+        <w:rPr>
+          <w:rtl/>
+        </w:rPr>
+        <w:t>ایجاد تجربه</w:t>
+      </w:r>
+      <w:r>
+        <w:rPr>
+          <w:rFonts w:ascii="Times New Roman" w:hAnsi="Times New Roman" w:cs="Times New Roman"/>
+        </w:rPr>
+        <w:t>‌</w:t>
+      </w:r>
+      <w:r>
+        <w:rPr>
+          <w:rtl/>
+        </w:rPr>
+        <w:t>ی بهتر از رزرو نوبت برای کاربران</w:t>
+      </w:r>
+    </w:p>
+    <w:p>
+      <w:pPr>
+        <w:spacing w:before="0" w:line="240" w:lineRule="auto"/>
+        <w:jc w:val="left"/>
+        <w:rPr>
+          <w:b/>
+          <w:bCs/>
+          <w:color w:val="00A2FF"/>
+          <w:lang w:bidi="fa-IR"/>
+        </w:rPr>
+      </w:pPr>
+    </w:p>
+    <w:p>
+      <w:pPr>
+        <w:pStyle w:val="ListParagraph"/>
+        <w:numPr>
+          <w:ilvl w:val="0"/>
+          <w:numId w:val="11"/>
+        </w:numPr>
+        <w:spacing w:before="0" w:line="240" w:lineRule="auto"/>
+        <w:jc w:val="left"/>
+        <w:rPr>
+          <w:b/>
+          <w:bCs/>
+          <w:color w:val="00A2FF"/>
+          <w:lang w:bidi="fa-IR"/>
+        </w:rPr>
+      </w:pPr>
+      <w:r>
+        <w:rPr>
+          <w:rtl/>
+        </w:rPr>
+        <w:t>کاهش ازدحام و زمان انتظار مراجعه</w:t>
+      </w:r>
+      <w:r>
+        <w:rPr>
+          <w:rFonts w:ascii="Times New Roman" w:hAnsi="Times New Roman" w:cs="Times New Roman"/>
+        </w:rPr>
+        <w:t>‌</w:t>
+      </w:r>
+      <w:r>
+        <w:rPr>
+          <w:rtl/>
+        </w:rPr>
+        <w:t>کنندگان با مدیریت دقیق</w:t>
+      </w:r>
+      <w:r>
+        <w:rPr>
+          <w:rFonts w:ascii="Times New Roman" w:hAnsi="Times New Roman" w:cs="Times New Roman"/>
+        </w:rPr>
+        <w:t>‌</w:t>
+      </w:r>
+      <w:r>
+        <w:rPr>
+          <w:rtl/>
+        </w:rPr>
+        <w:t>تر نوبت</w:t>
+      </w:r>
+      <w:r>
+        <w:rPr>
+          <w:rFonts w:ascii="Times New Roman" w:hAnsi="Times New Roman" w:cs="Times New Roman"/>
+        </w:rPr>
+        <w:t>‌</w:t>
+      </w:r>
+      <w:r>
+        <w:rPr>
+          <w:rtl/>
+        </w:rPr>
+        <w:t>ها</w:t>
+      </w:r>
+    </w:p>
+    <w:p>
+      <w:pPr>
+        <w:spacing w:before="0" w:line="240" w:lineRule="auto"/>
+        <w:jc w:val="left"/>
+        <w:rPr>
+          <w:b/>
+          <w:bCs/>
+          <w:color w:val="00A2FF"/>
+          <w:lang w:bidi="fa-IR"/>
+        </w:rPr>
+      </w:pPr>
+    </w:p>
+    <w:p>
+      <w:pPr>
+        <w:pStyle w:val="ListParagraph"/>
+        <w:numPr>
+          <w:ilvl w:val="0"/>
+          <w:numId w:val="11"/>
+        </w:numPr>
+        <w:spacing w:before="0" w:line="240" w:lineRule="auto"/>
+        <w:jc w:val="left"/>
+        <w:rPr>
+          <w:b/>
+          <w:bCs/>
+          <w:color w:val="00A2FF"/>
+          <w:lang w:bidi="fa-IR"/>
+        </w:rPr>
+      </w:pPr>
+      <w:r>
+        <w:rPr>
+          <w:rtl/>
+        </w:rPr>
+        <w:t>کاهش خطاهای انسانی در ثبت و مدیریت نوبت</w:t>
+      </w:r>
+      <w:r>
+        <w:rPr>
+          <w:rFonts w:ascii="Times New Roman" w:hAnsi="Times New Roman" w:cs="Times New Roman"/>
+        </w:rPr>
+        <w:t>‌</w:t>
+      </w:r>
+      <w:r>
+        <w:rPr>
+          <w:rtl/>
+        </w:rPr>
+        <w:t>ها نسبت به روش</w:t>
+      </w:r>
+      <w:r>
+        <w:rPr>
+          <w:rFonts w:ascii="Times New Roman" w:hAnsi="Times New Roman" w:cs="Times New Roman"/>
+        </w:rPr>
+        <w:t>‌</w:t>
+      </w:r>
+      <w:r>
+        <w:rPr>
+          <w:rtl/>
+        </w:rPr>
+        <w:t>های سنتی</w:t>
+      </w:r>
+    </w:p>
+    <w:p>
+      <w:pPr>
+        <w:spacing w:before="0" w:line="240" w:lineRule="auto"/>
+        <w:jc w:val="left"/>
+        <w:rPr>
+          <w:b/>
+          <w:bCs/>
+          <w:color w:val="00A2FF"/>
+          <w:lang w:bidi="fa-IR"/>
+        </w:rPr>
+      </w:pPr>
+    </w:p>
+    <w:p>
+      <w:pPr>
+        <w:pStyle w:val="ListParagraph"/>
+        <w:numPr>
+          <w:ilvl w:val="0"/>
+          <w:numId w:val="11"/>
+        </w:numPr>
+        <w:spacing w:before="0" w:line="240" w:lineRule="auto"/>
+        <w:jc w:val="left"/>
+        <w:rPr>
+          <w:b/>
+          <w:bCs/>
+          <w:color w:val="00A2FF"/>
+          <w:lang w:bidi="fa-IR"/>
+        </w:rPr>
+      </w:pPr>
+      <w:r>
+        <w:rPr>
+          <w:rtl/>
+        </w:rPr>
+        <w:t>کاهش هزینه</w:t>
+      </w:r>
+      <w:r>
+        <w:rPr>
+          <w:rFonts w:ascii="Times New Roman" w:hAnsi="Times New Roman" w:cs="Times New Roman"/>
+        </w:rPr>
+        <w:t>‌</w:t>
+      </w:r>
+      <w:r>
+        <w:rPr>
+          <w:rtl/>
+        </w:rPr>
+        <w:t>های نی</w:t>
+      </w:r>
+      <w:r>
+        <w:rPr>
+          <w:rFonts w:hint="cs"/>
+          <w:rtl/>
+        </w:rPr>
+        <w:t>روی</w:t>
+      </w:r>
+      <w:r>
+        <w:rPr>
+          <w:rtl/>
+        </w:rPr>
+        <w:t xml:space="preserve"> انسانی و زمانی مربوط به هماهنگی نوبت</w:t>
+      </w:r>
+      <w:r>
+        <w:rPr>
+          <w:rFonts w:ascii="Times New Roman" w:hAnsi="Times New Roman" w:cs="Times New Roman"/>
+        </w:rPr>
+        <w:t>‌</w:t>
+      </w:r>
+      <w:r>
+        <w:rPr>
+          <w:rtl/>
+        </w:rPr>
+        <w:t>ها</w:t>
+      </w:r>
+    </w:p>
+    <w:p>
+      <w:pPr>
+        <w:spacing w:before="0" w:line="240" w:lineRule="auto"/>
+        <w:jc w:val="left"/>
+        <w:rPr>
+          <w:b/>
+          <w:bCs/>
+          <w:color w:val="00A2FF"/>
+          <w:lang w:bidi="fa-IR"/>
+        </w:rPr>
+      </w:pPr>
+    </w:p>
+    <w:p>
+      <w:pPr>
+        <w:pStyle w:val="ListParagraph"/>
+        <w:numPr>
+          <w:ilvl w:val="0"/>
+          <w:numId w:val="11"/>
+        </w:numPr>
+        <w:spacing w:before="0" w:line="240" w:lineRule="auto"/>
+        <w:jc w:val="left"/>
+        <w:rPr>
+          <w:b/>
+          <w:bCs/>
+          <w:color w:val="00A2FF"/>
+          <w:lang w:bidi="fa-IR"/>
+        </w:rPr>
+      </w:pPr>
+      <w:r>
+        <w:rPr>
+          <w:rtl/>
+        </w:rPr>
+        <w:t>امکان مشاهده</w:t>
+      </w:r>
+      <w:r>
+        <w:rPr>
+          <w:rFonts w:ascii="Times New Roman" w:hAnsi="Times New Roman" w:cs="Times New Roman"/>
+        </w:rPr>
+        <w:t>‌</w:t>
+      </w:r>
+      <w:r>
+        <w:rPr>
+          <w:rtl/>
+        </w:rPr>
+        <w:t>ی امتیاز و اعتبار کسب</w:t>
+      </w:r>
+      <w:r>
+        <w:rPr>
+          <w:rFonts w:ascii="Times New Roman" w:hAnsi="Times New Roman" w:cs="Times New Roman"/>
+        </w:rPr>
+        <w:t>‌</w:t>
+      </w:r>
+      <w:r>
+        <w:rPr>
+          <w:rtl/>
+        </w:rPr>
+        <w:t>وکارها توسط کاربران</w:t>
+      </w:r>
+    </w:p>
+    <w:p>
+      <w:pPr>
+        <w:spacing w:before="0" w:line="240" w:lineRule="auto"/>
+        <w:jc w:val="left"/>
+        <w:rPr>
+          <w:b/>
+          <w:bCs/>
+          <w:color w:val="00A2FF"/>
+          <w:lang w:bidi="fa-IR"/>
+        </w:rPr>
+      </w:pPr>
+    </w:p>
+    <w:p>
+      <w:pPr>
+        <w:pStyle w:val="ListParagraph"/>
+        <w:numPr>
+          <w:ilvl w:val="0"/>
+          <w:numId w:val="11"/>
+        </w:numPr>
+        <w:spacing w:before="0" w:line="240" w:lineRule="auto"/>
+        <w:jc w:val="left"/>
+        <w:rPr>
+          <w:b/>
+          <w:bCs/>
+          <w:color w:val="00A2FF"/>
+          <w:lang w:bidi="fa-IR"/>
+        </w:rPr>
+      </w:pPr>
+      <w:r>
+        <w:rPr>
+          <w:rtl/>
+        </w:rPr>
+        <w:t>مدیریت متمرکز و آسان نوبت</w:t>
+      </w:r>
+      <w:r>
+        <w:rPr>
+          <w:rFonts w:ascii="Times New Roman" w:hAnsi="Times New Roman" w:cs="Times New Roman"/>
+        </w:rPr>
+        <w:t>‌</w:t>
+      </w:r>
+      <w:r>
+        <w:rPr>
+          <w:rtl/>
+        </w:rPr>
+        <w:t>ها برای صاحبان کسب</w:t>
+      </w:r>
+      <w:r>
+        <w:rPr>
+          <w:rFonts w:ascii="Times New Roman" w:hAnsi="Times New Roman" w:cs="Times New Roman"/>
+        </w:rPr>
+        <w:t>‌</w:t>
+      </w:r>
+      <w:r>
+        <w:rPr>
+          <w:rtl/>
+        </w:rPr>
+        <w:t>وکار از طریق یک پنل اختصاصی</w:t>
+      </w:r>
+    </w:p>
+    <w:p>
+      <w:pPr>
+        <w:spacing w:before="0" w:line="240" w:lineRule="auto"/>
+        <w:jc w:val="left"/>
+        <w:rPr>
+          <w:b/>
+          <w:bCs/>
+          <w:color w:val="00A2FF"/>
+          <w:lang w:bidi="fa-IR"/>
+        </w:rPr>
+      </w:pPr>
+    </w:p>
+    <w:p>
+      <w:pPr>
+        <w:pStyle w:val="ListParagraph"/>
+        <w:numPr>
+          <w:ilvl w:val="0"/>
+          <w:numId w:val="11"/>
+        </w:numPr>
+        <w:spacing w:before="0" w:line="240" w:lineRule="auto"/>
+        <w:jc w:val="left"/>
+        <w:rPr>
+          <w:b/>
+          <w:bCs/>
+          <w:color w:val="00A2FF"/>
+          <w:lang w:bidi="fa-IR"/>
+        </w:rPr>
+      </w:pPr>
+      <w:r>
+        <w:rPr>
+          <w:rtl/>
+        </w:rPr>
+        <w:t>افزایش سرعت در ارائه خدمات و پاسخ به درخواست</w:t>
+      </w:r>
+      <w:r>
+        <w:rPr>
+          <w:rFonts w:ascii="Times New Roman" w:hAnsi="Times New Roman" w:cs="Times New Roman"/>
+        </w:rPr>
+        <w:t>‌</w:t>
+      </w:r>
+      <w:r>
+        <w:rPr>
+          <w:rtl/>
+        </w:rPr>
+        <w:t>های مشتریان</w:t>
+      </w:r>
+    </w:p>
+    <w:p>
+      <w:pPr>
+        <w:pStyle w:val="ListParagraph"/>
+        <w:numPr>
+          <w:ilvl w:val="0"/>
+          <w:numId w:val="11"/>
+        </w:numPr>
         <w:spacing w:before="0" w:line="240" w:lineRule="auto"/>
         <w:jc w:val="left"/>
         <w:rPr>
@@ -4408,12 +4976,9 @@
     <w:p>
       <w:pPr>
         <w:pStyle w:val="Heading1"/>
-        <w:rPr>
-          <w:rFonts w:hint="cs"/>
-        </w:rPr>
-      </w:pPr>
-      <w:bookmarkStart w:id="3" w:name="_Hlk233397996"/>
-      <w:bookmarkStart w:id="4" w:name="_Toc233399279"/>
+      </w:pPr>
+      <w:bookmarkStart w:id="3" w:name="_Toc233399279"/>
+      <w:bookmarkStart w:id="4" w:name="_Hlk233397996"/>
       <w:r>
         <w:rPr>
           <w:rFonts w:hint="cs"/>
@@ -4425,9 +4990,9 @@
       <w:r>
         <w:t>System Summary</w:t>
       </w:r>
-      <w:bookmarkEnd w:id="4"/>
+      <w:bookmarkEnd w:id="3"/>
     </w:p>
-    <w:bookmarkEnd w:id="3"/>
+    <w:bookmarkEnd w:id="4"/>
     <w:p>
       <w:pPr>
         <w:bidi w:val="0"/>
@@ -5371,7 +5936,7 @@
 </file>
 
 <file path=word/endnotes.xml><?xml version="1.0" encoding="utf-8"?>
-<w:endnotes xmlns:wpc="http://schemas.microsoft.com/office/word/2010/wordprocessingCanvas" xmlns:cx="http://schemas.microsoft.com/office/drawing/2014/chartex" xmlns:cx1="http://schemas.microsoft.com/office/drawing/2015/9/8/chartex" xmlns:cx2="http://schemas.microsoft.com/office/drawing/2015/10/21/chartex" xmlns:cx3="http://schemas.microsoft.com/office/drawing/2016/5/9/chartex" xmlns:cx4="http://schemas.microsoft.com/office/drawing/2016/5/10/chartex" xmlns:cx5="http://schemas.microsoft.com/office/drawing/2016/5/11/chartex" xmlns:cx6="http://schemas.microsoft.com/office/drawing/2016/5/12/chartex" xmlns:cx7="http://schemas.microsoft.com/office/drawing/2016/5/13/chartex" xmlns:cx8="http://schemas.microsoft.com/office/drawing/2016/5/14/chartex" xmlns:mc="http://schemas.openxmlformats.org/markup-compatibility/2006" xmlns:aink="http://schemas.microsoft.com/office/drawing/2016/ink" xmlns:am3d="http://schemas.microsoft.com/office/drawing/2017/model3d" xmlns:o="urn:schemas-microsoft-com:office:office" xmlns:oel="http://schemas.microsoft.com/office/2019/extlst" xmlns:r="http://schemas.openxmlformats.org/officeDocument/2006/relationships" xmlns:m="http://schemas.openxmlformats.org/officeDocument/2006/math" xmlns:v="urn:schemas-microsoft-com:vml" xmlns:wp14="http://schemas.microsoft.com/office/word/2010/wordprocessingDrawing" xmlns:wp="http://schemas.openxmlformats.org/drawingml/2006/wordprocessingDrawing" xmlns:w10="urn:schemas-microsoft-com:office:word" xmlns:w="http://schemas.openxmlformats.org/wordprocessingml/2006/main" xmlns:w14="http://schemas.microsoft.com/office/word/2010/wordml" xmlns:w15="http://schemas.microsoft.com/office/word/2012/wordml" xmlns:w16cex="http://schemas.microsoft.com/office/word/2018/wordml/cex" xmlns:w16cid="http://schemas.microsoft.com/office/word/2016/wordml/cid" xmlns:w16="http://schemas.microsoft.com/office/word/2018/wordml" xmlns:w16sdtdh="http://schemas.microsoft.com/office/word/2020/wordml/sdtdatahash" xmlns:w16se="http://schemas.microsoft.com/office/word/2015/wordml/symex" xmlns:wpg="http://schemas.microsoft.com/office/word/2010/wordprocessingGroup" xmlns:wpi="http://schemas.microsoft.com/office/word/2010/wordprocessingInk" xmlns:wne="http://schemas.microsoft.com/office/word/2006/wordml" xmlns:wps="http://schemas.microsoft.com/office/word/2010/wordprocessingShape" mc:Ignorable="w14 w15 w16se w16cid w16 w16cex w16sdtdh wp14">
+<w:endnotes xmlns:wpc="http://schemas.microsoft.com/office/word/2010/wordprocessingCanvas" xmlns:cx="http://schemas.microsoft.com/office/drawing/2014/chartex" xmlns:cx1="http://schemas.microsoft.com/office/drawing/2015/9/8/chartex" xmlns:cx2="http://schemas.microsoft.com/office/drawing/2015/10/21/chartex" xmlns:cx3="http://schemas.microsoft.com/office/drawing/2016/5/9/chartex" xmlns:cx4="http://schemas.microsoft.com/office/drawing/2016/5/10/chartex" xmlns:cx5="http://schemas.microsoft.com/office/drawing/2016/5/11/chartex" xmlns:cx6="http://schemas.microsoft.com/office/drawing/2016/5/12/chartex" xmlns:cx7="http://schemas.microsoft.com/office/drawing/2016/5/13/chartex" xmlns:cx8="http://schemas.microsoft.com/office/drawing/2016/5/14/chartex" xmlns:mc="http://schemas.openxmlformats.org/markup-compatibility/2006" xmlns:aink="http://schemas.microsoft.com/office/drawing/2016/ink" xmlns:am3d="http://schemas.microsoft.com/office/drawing/2017/model3d" xmlns:o="urn:schemas-microsoft-com:office:office" xmlns:r="http://schemas.openxmlformats.org/officeDocument/2006/relationships" xmlns:m="http://schemas.openxmlformats.org/officeDocument/2006/math" xmlns:v="urn:schemas-microsoft-com:vml" xmlns:wp14="http://schemas.microsoft.com/office/word/2010/wordprocessingDrawing" xmlns:wp="http://schemas.openxmlformats.org/drawingml/2006/wordprocessingDrawing" xmlns:w10="urn:schemas-microsoft-com:office:word" xmlns:w="http://schemas.openxmlformats.org/wordprocessingml/2006/main" xmlns:w14="http://schemas.microsoft.com/office/word/2010/wordml" xmlns:w15="http://schemas.microsoft.com/office/word/2012/wordml" xmlns:w16cex="http://schemas.microsoft.com/office/word/2018/wordml/cex" xmlns:w16cid="http://schemas.microsoft.com/office/word/2016/wordml/cid" xmlns:w16="http://schemas.microsoft.com/office/word/2018/wordml" xmlns:w16sdtdh="http://schemas.microsoft.com/office/word/2020/wordml/sdtdatahash" xmlns:w16se="http://schemas.microsoft.com/office/word/2015/wordml/symex" xmlns:wpg="http://schemas.microsoft.com/office/word/2010/wordprocessingGroup" xmlns:wpi="http://schemas.microsoft.com/office/word/2010/wordprocessingInk" xmlns:wne="http://schemas.microsoft.com/office/word/2006/wordml" xmlns:wps="http://schemas.microsoft.com/office/word/2010/wordprocessingShape" mc:Ignorable="w14 w15 w16se w16cid w16 w16cex w16sdtdh wp14">
   <w:endnote w:type="separator" w:id="-1">
     <w:p>
       <w:r>
@@ -5392,7 +5957,7 @@
 </file>
 
 <file path=word/footer1.xml><?xml version="1.0" encoding="utf-8"?>
-<w:ftr xmlns:wpc="http://schemas.microsoft.com/office/word/2010/wordprocessingCanvas" xmlns:cx="http://schemas.microsoft.com/office/drawing/2014/chartex" xmlns:cx1="http://schemas.microsoft.com/office/drawing/2015/9/8/chartex" xmlns:cx2="http://schemas.microsoft.com/office/drawing/2015/10/21/chartex" xmlns:cx3="http://schemas.microsoft.com/office/drawing/2016/5/9/chartex" xmlns:cx4="http://schemas.microsoft.com/office/drawing/2016/5/10/chartex" xmlns:cx5="http://schemas.microsoft.com/office/drawing/2016/5/11/chartex" xmlns:cx6="http://schemas.microsoft.com/office/drawing/2016/5/12/chartex" xmlns:cx7="http://schemas.microsoft.com/office/drawing/2016/5/13/chartex" xmlns:cx8="http://schemas.microsoft.com/office/drawing/2016/5/14/chartex" xmlns:mc="http://schemas.openxmlformats.org/markup-compatibility/2006" xmlns:aink="http://schemas.microsoft.com/office/drawing/2016/ink" xmlns:am3d="http://schemas.microsoft.com/office/drawing/2017/model3d" xmlns:o="urn:schemas-microsoft-com:office:office" xmlns:oel="http://schemas.microsoft.com/office/2019/extlst" xmlns:r="http://schemas.openxmlformats.org/officeDocument/2006/relationships" xmlns:m="http://schemas.openxmlformats.org/officeDocument/2006/math" xmlns:v="urn:schemas-microsoft-com:vml" xmlns:wp14="http://schemas.microsoft.com/office/word/2010/wordprocessingDrawing" xmlns:wp="http://schemas.openxmlformats.org/drawingml/2006/wordprocessingDrawing" xmlns:w10="urn:schemas-microsoft-com:office:word" xmlns:w="http://schemas.openxmlformats.org/wordprocessingml/2006/main" xmlns:w14="http://schemas.microsoft.com/office/word/2010/wordml" xmlns:w15="http://schemas.microsoft.com/office/word/2012/wordml" xmlns:w16cex="http://schemas.microsoft.com/office/word/2018/wordml/cex" xmlns:w16cid="http://schemas.microsoft.com/office/word/2016/wordml/cid" xmlns:w16="http://schemas.microsoft.com/office/word/2018/wordml" xmlns:w16sdtdh="http://schemas.microsoft.com/office/word/2020/wordml/sdtdatahash" xmlns:w16se="http://schemas.microsoft.com/office/word/2015/wordml/symex" xmlns:wpg="http://schemas.microsoft.com/office/word/2010/wordprocessingGroup" xmlns:wpi="http://schemas.microsoft.com/office/word/2010/wordprocessingInk" xmlns:wne="http://schemas.microsoft.com/office/word/2006/wordml" xmlns:wps="http://schemas.microsoft.com/office/word/2010/wordprocessingShape" mc:Ignorable="w14 w15 w16se w16cid w16 w16cex w16sdtdh wp14">
+<w:ftr xmlns:wpc="http://schemas.microsoft.com/office/word/2010/wordprocessingCanvas" xmlns:cx="http://schemas.microsoft.com/office/drawing/2014/chartex" xmlns:cx1="http://schemas.microsoft.com/office/drawing/2015/9/8/chartex" xmlns:cx2="http://schemas.microsoft.com/office/drawing/2015/10/21/chartex" xmlns:cx3="http://schemas.microsoft.com/office/drawing/2016/5/9/chartex" xmlns:cx4="http://schemas.microsoft.com/office/drawing/2016/5/10/chartex" xmlns:cx5="http://schemas.microsoft.com/office/drawing/2016/5/11/chartex" xmlns:cx6="http://schemas.microsoft.com/office/drawing/2016/5/12/chartex" xmlns:cx7="http://schemas.microsoft.com/office/drawing/2016/5/13/chartex" xmlns:cx8="http://schemas.microsoft.com/office/drawing/2016/5/14/chartex" xmlns:mc="http://schemas.openxmlformats.org/markup-compatibility/2006" xmlns:aink="http://schemas.microsoft.com/office/drawing/2016/ink" xmlns:am3d="http://schemas.microsoft.com/office/drawing/2017/model3d" xmlns:o="urn:schemas-microsoft-com:office:office" xmlns:r="http://schemas.openxmlformats.org/officeDocument/2006/relationships" xmlns:m="http://schemas.openxmlformats.org/officeDocument/2006/math" xmlns:v="urn:schemas-microsoft-com:vml" xmlns:wp14="http://schemas.microsoft.com/office/word/2010/wordprocessingDrawing" xmlns:wp="http://schemas.openxmlformats.org/drawingml/2006/wordprocessingDrawing" xmlns:w10="urn:schemas-microsoft-com:office:word" xmlns:w="http://schemas.openxmlformats.org/wordprocessingml/2006/main" xmlns:w14="http://schemas.microsoft.com/office/word/2010/wordml" xmlns:w15="http://schemas.microsoft.com/office/word/2012/wordml" xmlns:w16cex="http://schemas.microsoft.com/office/word/2018/wordml/cex" xmlns:w16cid="http://schemas.microsoft.com/office/word/2016/wordml/cid" xmlns:w16="http://schemas.microsoft.com/office/word/2018/wordml" xmlns:w16sdtdh="http://schemas.microsoft.com/office/word/2020/wordml/sdtdatahash" xmlns:w16se="http://schemas.microsoft.com/office/word/2015/wordml/symex" xmlns:wpg="http://schemas.microsoft.com/office/word/2010/wordprocessingGroup" xmlns:wpi="http://schemas.microsoft.com/office/word/2010/wordprocessingInk" xmlns:wne="http://schemas.microsoft.com/office/word/2006/wordml" xmlns:wps="http://schemas.microsoft.com/office/word/2010/wordprocessingShape" mc:Ignorable="w14 w15 w16se w16cid w16 w16cex w16sdtdh wp14">
   <w:p>
     <w:pPr>
       <w:pStyle w:val="HeaderFooter"/>
@@ -5429,7 +5994,7 @@
 </file>
 
 <file path=word/footnotes.xml><?xml version="1.0" encoding="utf-8"?>
-<w:footnotes xmlns:wpc="http://schemas.microsoft.com/office/word/2010/wordprocessingCanvas" xmlns:cx="http://schemas.microsoft.com/office/drawing/2014/chartex" xmlns:cx1="http://schemas.microsoft.com/office/drawing/2015/9/8/chartex" xmlns:cx2="http://schemas.microsoft.com/office/drawing/2015/10/21/chartex" xmlns:cx3="http://schemas.microsoft.com/office/drawing/2016/5/9/chartex" xmlns:cx4="http://schemas.microsoft.com/office/drawing/2016/5/10/chartex" xmlns:cx5="http://schemas.microsoft.com/office/drawing/2016/5/11/chartex" xmlns:cx6="http://schemas.microsoft.com/office/drawing/2016/5/12/chartex" xmlns:cx7="http://schemas.microsoft.com/office/drawing/2016/5/13/chartex" xmlns:cx8="http://schemas.microsoft.com/office/drawing/2016/5/14/chartex" xmlns:mc="http://schemas.openxmlformats.org/markup-compatibility/2006" xmlns:aink="http://schemas.microsoft.com/office/drawing/2016/ink" xmlns:am3d="http://schemas.microsoft.com/office/drawing/2017/model3d" xmlns:o="urn:schemas-microsoft-com:office:office" xmlns:oel="http://schemas.microsoft.com/office/2019/extlst" xmlns:r="http://schemas.openxmlformats.org/officeDocument/2006/relationships" xmlns:m="http://schemas.openxmlformats.org/officeDocument/2006/math" xmlns:v="urn:schemas-microsoft-com:vml" xmlns:wp14="http://schemas.microsoft.com/office/word/2010/wordprocessingDrawing" xmlns:wp="http://schemas.openxmlformats.org/drawingml/2006/wordprocessingDrawing" xmlns:w10="urn:schemas-microsoft-com:office:word" xmlns:w="http://schemas.openxmlformats.org/wordprocessingml/2006/main" xmlns:w14="http://schemas.microsoft.com/office/word/2010/wordml" xmlns:w15="http://schemas.microsoft.com/office/word/2012/wordml" xmlns:w16cex="http://schemas.microsoft.com/office/word/2018/wordml/cex" xmlns:w16cid="http://schemas.microsoft.com/office/word/2016/wordml/cid" xmlns:w16="http://schemas.microsoft.com/office/word/2018/wordml" xmlns:w16sdtdh="http://schemas.microsoft.com/office/word/2020/wordml/sdtdatahash" xmlns:w16se="http://schemas.microsoft.com/office/word/2015/wordml/symex" xmlns:wpg="http://schemas.microsoft.com/office/word/2010/wordprocessingGroup" xmlns:wpi="http://schemas.microsoft.com/office/word/2010/wordprocessingInk" xmlns:wne="http://schemas.microsoft.com/office/word/2006/wordml" xmlns:wps="http://schemas.microsoft.com/office/word/2010/wordprocessingShape" mc:Ignorable="w14 w15 w16se w16cid w16 w16cex w16sdtdh wp14">
+<w:footnotes xmlns:wpc="http://schemas.microsoft.com/office/word/2010/wordprocessingCanvas" xmlns:cx="http://schemas.microsoft.com/office/drawing/2014/chartex" xmlns:cx1="http://schemas.microsoft.com/office/drawing/2015/9/8/chartex" xmlns:cx2="http://schemas.microsoft.com/office/drawing/2015/10/21/chartex" xmlns:cx3="http://schemas.microsoft.com/office/drawing/2016/5/9/chartex" xmlns:cx4="http://schemas.microsoft.com/office/drawing/2016/5/10/chartex" xmlns:cx5="http://schemas.microsoft.com/office/drawing/2016/5/11/chartex" xmlns:cx6="http://schemas.microsoft.com/office/drawing/2016/5/12/chartex" xmlns:cx7="http://schemas.microsoft.com/office/drawing/2016/5/13/chartex" xmlns:cx8="http://schemas.microsoft.com/office/drawing/2016/5/14/chartex" xmlns:mc="http://schemas.openxmlformats.org/markup-compatibility/2006" xmlns:aink="http://schemas.microsoft.com/office/drawing/2016/ink" xmlns:am3d="http://schemas.microsoft.com/office/drawing/2017/model3d" xmlns:o="urn:schemas-microsoft-com:office:office" xmlns:r="http://schemas.openxmlformats.org/officeDocument/2006/relationships" xmlns:m="http://schemas.openxmlformats.org/officeDocument/2006/math" xmlns:v="urn:schemas-microsoft-com:vml" xmlns:wp14="http://schemas.microsoft.com/office/word/2010/wordprocessingDrawing" xmlns:wp="http://schemas.openxmlformats.org/drawingml/2006/wordprocessingDrawing" xmlns:w10="urn:schemas-microsoft-com:office:word" xmlns:w="http://schemas.openxmlformats.org/wordprocessingml/2006/main" xmlns:w14="http://schemas.microsoft.com/office/word/2010/wordml" xmlns:w15="http://schemas.microsoft.com/office/word/2012/wordml" xmlns:w16cex="http://schemas.microsoft.com/office/word/2018/wordml/cex" xmlns:w16cid="http://schemas.microsoft.com/office/word/2016/wordml/cid" xmlns:w16="http://schemas.microsoft.com/office/word/2018/wordml" xmlns:w16sdtdh="http://schemas.microsoft.com/office/word/2020/wordml/sdtdatahash" xmlns:w16se="http://schemas.microsoft.com/office/word/2015/wordml/symex" xmlns:wpg="http://schemas.microsoft.com/office/word/2010/wordprocessingGroup" xmlns:wpi="http://schemas.microsoft.com/office/word/2010/wordprocessingInk" xmlns:wne="http://schemas.microsoft.com/office/word/2006/wordml" xmlns:wps="http://schemas.microsoft.com/office/word/2010/wordprocessingShape" mc:Ignorable="w14 w15 w16se w16cid w16 w16cex w16sdtdh wp14">
   <w:footnote w:type="separator" w:id="-1">
     <w:p>
       <w:r>
@@ -5450,7 +6015,7 @@
 </file>
 
 <file path=word/header1.xml><?xml version="1.0" encoding="utf-8"?>
-<w:hdr xmlns:wpc="http://schemas.microsoft.com/office/word/2010/wordprocessingCanvas" xmlns:cx="http://schemas.microsoft.com/office/drawing/2014/chartex" xmlns:cx1="http://schemas.microsoft.com/office/drawing/2015/9/8/chartex" xmlns:cx2="http://schemas.microsoft.com/office/drawing/2015/10/21/chartex" xmlns:cx3="http://schemas.microsoft.com/office/drawing/2016/5/9/chartex" xmlns:cx4="http://schemas.microsoft.com/office/drawing/2016/5/10/chartex" xmlns:cx5="http://schemas.microsoft.com/office/drawing/2016/5/11/chartex" xmlns:cx6="http://schemas.microsoft.com/office/drawing/2016/5/12/chartex" xmlns:cx7="http://schemas.microsoft.com/office/drawing/2016/5/13/chartex" xmlns:cx8="http://schemas.microsoft.com/office/drawing/2016/5/14/chartex" xmlns:mc="http://schemas.openxmlformats.org/markup-compatibility/2006" xmlns:aink="http://schemas.microsoft.com/office/drawing/2016/ink" xmlns:am3d="http://schemas.microsoft.com/office/drawing/2017/model3d" xmlns:o="urn:schemas-microsoft-com:office:office" xmlns:oel="http://schemas.microsoft.com/office/2019/extlst" xmlns:r="http://schemas.openxmlformats.org/officeDocument/2006/relationships" xmlns:m="http://schemas.openxmlformats.org/officeDocument/2006/math" xmlns:v="urn:schemas-microsoft-com:vml" xmlns:wp14="http://schemas.microsoft.com/office/word/2010/wordprocessingDrawing" xmlns:wp="http://schemas.openxmlformats.org/drawingml/2006/wordprocessingDrawing" xmlns:w10="urn:schemas-microsoft-com:office:word" xmlns:w="http://schemas.openxmlformats.org/wordprocessingml/2006/main" xmlns:w14="http://schemas.microsoft.com/office/word/2010/wordml" xmlns:w15="http://schemas.microsoft.com/office/word/2012/wordml" xmlns:w16cex="http://schemas.microsoft.com/office/word/2018/wordml/cex" xmlns:w16cid="http://schemas.microsoft.com/office/word/2016/wordml/cid" xmlns:w16="http://schemas.microsoft.com/office/word/2018/wordml" xmlns:w16sdtdh="http://schemas.microsoft.com/office/word/2020/wordml/sdtdatahash" xmlns:w16se="http://schemas.microsoft.com/office/word/2015/wordml/symex" xmlns:wpg="http://schemas.microsoft.com/office/word/2010/wordprocessingGroup" xmlns:wpi="http://schemas.microsoft.com/office/word/2010/wordprocessingInk" xmlns:wne="http://schemas.microsoft.com/office/word/2006/wordml" xmlns:wps="http://schemas.microsoft.com/office/word/2010/wordprocessingShape" mc:Ignorable="w14 w15 w16se w16cid w16 w16cex w16sdtdh wp14">
+<w:hdr xmlns:wpc="http://schemas.microsoft.com/office/word/2010/wordprocessingCanvas" xmlns:cx="http://schemas.microsoft.com/office/drawing/2014/chartex" xmlns:cx1="http://schemas.microsoft.com/office/drawing/2015/9/8/chartex" xmlns:cx2="http://schemas.microsoft.com/office/drawing/2015/10/21/chartex" xmlns:cx3="http://schemas.microsoft.com/office/drawing/2016/5/9/chartex" xmlns:cx4="http://schemas.microsoft.com/office/drawing/2016/5/10/chartex" xmlns:cx5="http://schemas.microsoft.com/office/drawing/2016/5/11/chartex" xmlns:cx6="http://schemas.microsoft.com/office/drawing/2016/5/12/chartex" xmlns:cx7="http://schemas.microsoft.com/office/drawing/2016/5/13/chartex" xmlns:cx8="http://schemas.microsoft.com/office/drawing/2016/5/14/chartex" xmlns:mc="http://schemas.openxmlformats.org/markup-compatibility/2006" xmlns:aink="http://schemas.microsoft.com/office/drawing/2016/ink" xmlns:am3d="http://schemas.microsoft.com/office/drawing/2017/model3d" xmlns:o="urn:schemas-microsoft-com:office:office" xmlns:r="http://schemas.openxmlformats.org/officeDocument/2006/relationships" xmlns:m="http://schemas.openxmlformats.org/officeDocument/2006/math" xmlns:v="urn:schemas-microsoft-com:vml" xmlns:wp14="http://schemas.microsoft.com/office/word/2010/wordprocessingDrawing" xmlns:wp="http://schemas.openxmlformats.org/drawingml/2006/wordprocessingDrawing" xmlns:w10="urn:schemas-microsoft-com:office:word" xmlns:w="http://schemas.openxmlformats.org/wordprocessingml/2006/main" xmlns:w14="http://schemas.microsoft.com/office/word/2010/wordml" xmlns:w15="http://schemas.microsoft.com/office/word/2012/wordml" xmlns:w16cex="http://schemas.microsoft.com/office/word/2018/wordml/cex" xmlns:w16cid="http://schemas.microsoft.com/office/word/2016/wordml/cid" xmlns:w16="http://schemas.microsoft.com/office/word/2018/wordml" xmlns:w16sdtdh="http://schemas.microsoft.com/office/word/2020/wordml/sdtdatahash" xmlns:w16se="http://schemas.microsoft.com/office/word/2015/wordml/symex" xmlns:wpg="http://schemas.microsoft.com/office/word/2010/wordprocessingGroup" xmlns:wpi="http://schemas.microsoft.com/office/word/2010/wordprocessingInk" xmlns:wne="http://schemas.microsoft.com/office/word/2006/wordml" xmlns:wps="http://schemas.microsoft.com/office/word/2010/wordprocessingShape" mc:Ignorable="w14 w15 w16se w16cid w16 w16cex w16sdtdh wp14">
   <w:p>
     <w:pPr>
       <w:pStyle w:val="HeaderFooter"/>
@@ -5488,8 +6053,285 @@
 </file>
 
 <file path=word/numbering.xml><?xml version="1.0" encoding="utf-8"?>
-<w:numbering xmlns:wpc="http://schemas.microsoft.com/office/word/2010/wordprocessingCanvas" xmlns:cx="http://schemas.microsoft.com/office/drawing/2014/chartex" xmlns:cx1="http://schemas.microsoft.com/office/drawing/2015/9/8/chartex" xmlns:cx2="http://schemas.microsoft.com/office/drawing/2015/10/21/chartex" xmlns:cx3="http://schemas.microsoft.com/office/drawing/2016/5/9/chartex" xmlns:cx4="http://schemas.microsoft.com/office/drawing/2016/5/10/chartex" xmlns:cx5="http://schemas.microsoft.com/office/drawing/2016/5/11/chartex" xmlns:cx6="http://schemas.microsoft.com/office/drawing/2016/5/12/chartex" xmlns:cx7="http://schemas.microsoft.com/office/drawing/2016/5/13/chartex" xmlns:cx8="http://schemas.microsoft.com/office/drawing/2016/5/14/chartex" xmlns:mc="http://schemas.openxmlformats.org/markup-compatibility/2006" xmlns:aink="http://schemas.microsoft.com/office/drawing/2016/ink" xmlns:am3d="http://schemas.microsoft.com/office/drawing/2017/model3d" xmlns:o="urn:schemas-microsoft-com:office:office" xmlns:oel="http://schemas.microsoft.com/office/2019/extlst" xmlns:r="http://schemas.openxmlformats.org/officeDocument/2006/relationships" xmlns:m="http://schemas.openxmlformats.org/officeDocument/2006/math" xmlns:v="urn:schemas-microsoft-com:vml" xmlns:wp14="http://schemas.microsoft.com/office/word/2010/wordprocessingDrawing" xmlns:wp="http://schemas.openxmlformats.org/drawingml/2006/wordprocessingDrawing" xmlns:w10="urn:schemas-microsoft-com:office:word" xmlns:w="http://schemas.openxmlformats.org/wordprocessingml/2006/main" xmlns:w14="http://schemas.microsoft.com/office/word/2010/wordml" xmlns:w15="http://schemas.microsoft.com/office/word/2012/wordml" xmlns:w16cex="http://schemas.microsoft.com/office/word/2018/wordml/cex" xmlns:w16cid="http://schemas.microsoft.com/office/word/2016/wordml/cid" xmlns:w16="http://schemas.microsoft.com/office/word/2018/wordml" xmlns:w16sdtdh="http://schemas.microsoft.com/office/word/2020/wordml/sdtdatahash" xmlns:w16se="http://schemas.microsoft.com/office/word/2015/wordml/symex" xmlns:wpg="http://schemas.microsoft.com/office/word/2010/wordprocessingGroup" xmlns:wpi="http://schemas.microsoft.com/office/word/2010/wordprocessingInk" xmlns:wne="http://schemas.microsoft.com/office/word/2006/wordml" xmlns:wps="http://schemas.microsoft.com/office/word/2010/wordprocessingShape" mc:Ignorable="w14 w15 w16se w16cid w16 w16cex w16sdtdh wp14">
+<w:numbering xmlns:wpc="http://schemas.microsoft.com/office/word/2010/wordprocessingCanvas" xmlns:cx="http://schemas.microsoft.com/office/drawing/2014/chartex" xmlns:cx1="http://schemas.microsoft.com/office/drawing/2015/9/8/chartex" xmlns:cx2="http://schemas.microsoft.com/office/drawing/2015/10/21/chartex" xmlns:cx3="http://schemas.microsoft.com/office/drawing/2016/5/9/chartex" xmlns:cx4="http://schemas.microsoft.com/office/drawing/2016/5/10/chartex" xmlns:cx5="http://schemas.microsoft.com/office/drawing/2016/5/11/chartex" xmlns:cx6="http://schemas.microsoft.com/office/drawing/2016/5/12/chartex" xmlns:cx7="http://schemas.microsoft.com/office/drawing/2016/5/13/chartex" xmlns:cx8="http://schemas.microsoft.com/office/drawing/2016/5/14/chartex" xmlns:mc="http://schemas.openxmlformats.org/markup-compatibility/2006" xmlns:aink="http://schemas.microsoft.com/office/drawing/2016/ink" xmlns:am3d="http://schemas.microsoft.com/office/drawing/2017/model3d" xmlns:o="urn:schemas-microsoft-com:office:office" xmlns:r="http://schemas.openxmlformats.org/officeDocument/2006/relationships" xmlns:m="http://schemas.openxmlformats.org/officeDocument/2006/math" xmlns:v="urn:schemas-microsoft-com:vml" xmlns:wp14="http://schemas.microsoft.com/office/word/2010/wordprocessingDrawing" xmlns:wp="http://schemas.openxmlformats.org/drawingml/2006/wordprocessingDrawing" xmlns:w10="urn:schemas-microsoft-com:office:word" xmlns:w="http://schemas.openxmlformats.org/wordprocessingml/2006/main" xmlns:w14="http://schemas.microsoft.com/office/word/2010/wordml" xmlns:w15="http://schemas.microsoft.com/office/word/2012/wordml" xmlns:w16cex="http://schemas.microsoft.com/office/word/2018/wordml/cex" xmlns:w16cid="http://schemas.microsoft.com/office/word/2016/wordml/cid" xmlns:w16="http://schemas.microsoft.com/office/word/2018/wordml" xmlns:w16sdtdh="http://schemas.microsoft.com/office/word/2020/wordml/sdtdatahash" xmlns:w16se="http://schemas.microsoft.com/office/word/2015/wordml/symex" xmlns:wpg="http://schemas.microsoft.com/office/word/2010/wordprocessingGroup" xmlns:wpi="http://schemas.microsoft.com/office/word/2010/wordprocessingInk" xmlns:wne="http://schemas.microsoft.com/office/word/2006/wordml" xmlns:wps="http://schemas.microsoft.com/office/word/2010/wordprocessingShape" mc:Ignorable="w14 w15 w16se w16cid w16 w16cex w16sdtdh wp14">
   <w:abstractNum w:abstractNumId="0" w15:restartNumberingAfterBreak="0">
+    <w:nsid w:val="060472DB"/>
+    <w:multiLevelType w:val="hybridMultilevel"/>
+    <w:tmpl w:val="898C56CA"/>
+    <w:lvl w:ilvl="0" w:tplc="E230EB6E">
+      <w:start w:val="1"/>
+      <w:numFmt w:val="decimal"/>
+      <w:lvlText w:val="%1."/>
+      <w:lvlJc w:val="left"/>
+      <w:pPr>
+        <w:ind w:left="720" w:hanging="360"/>
+      </w:pPr>
+      <w:rPr>
+        <w:rFonts w:hint="default"/>
+        <w:b w:val="0"/>
+        <w:color w:val="000000"/>
+        <w:sz w:val="22"/>
+      </w:rPr>
+    </w:lvl>
+    <w:lvl w:ilvl="1" w:tplc="04090019" w:tentative="1">
+      <w:start w:val="1"/>
+      <w:numFmt w:val="lowerLetter"/>
+      <w:lvlText w:val="%2."/>
+      <w:lvlJc w:val="left"/>
+      <w:pPr>
+        <w:ind w:left="1440" w:hanging="360"/>
+      </w:pPr>
+    </w:lvl>
+    <w:lvl w:ilvl="2" w:tplc="0409001B" w:tentative="1">
+      <w:start w:val="1"/>
+      <w:numFmt w:val="lowerRoman"/>
+      <w:lvlText w:val="%3."/>
+      <w:lvlJc w:val="right"/>
+      <w:pPr>
+        <w:ind w:left="2160" w:hanging="180"/>
+      </w:pPr>
+    </w:lvl>
+    <w:lvl w:ilvl="3" w:tplc="0409000F" w:tentative="1">
+      <w:start w:val="1"/>
+      <w:numFmt w:val="decimal"/>
+      <w:lvlText w:val="%4."/>
+      <w:lvlJc w:val="left"/>
+      <w:pPr>
+        <w:ind w:left="2880" w:hanging="360"/>
+      </w:pPr>
+    </w:lvl>
+    <w:lvl w:ilvl="4" w:tplc="04090019" w:tentative="1">
+      <w:start w:val="1"/>
+      <w:numFmt w:val="lowerLetter"/>
+      <w:lvlText w:val="%5."/>
+      <w:lvlJc w:val="left"/>
+      <w:pPr>
+        <w:ind w:left="3600" w:hanging="360"/>
+      </w:pPr>
+    </w:lvl>
+    <w:lvl w:ilvl="5" w:tplc="0409001B" w:tentative="1">
+      <w:start w:val="1"/>
+      <w:numFmt w:val="lowerRoman"/>
+      <w:lvlText w:val="%6."/>
+      <w:lvlJc w:val="right"/>
+      <w:pPr>
+        <w:ind w:left="4320" w:hanging="180"/>
+      </w:pPr>
+    </w:lvl>
+    <w:lvl w:ilvl="6" w:tplc="0409000F" w:tentative="1">
+      <w:start w:val="1"/>
+      <w:numFmt w:val="decimal"/>
+      <w:lvlText w:val="%7."/>
+      <w:lvlJc w:val="left"/>
+      <w:pPr>
+        <w:ind w:left="5040" w:hanging="360"/>
+      </w:pPr>
+    </w:lvl>
+    <w:lvl w:ilvl="7" w:tplc="04090019" w:tentative="1">
+      <w:start w:val="1"/>
+      <w:numFmt w:val="lowerLetter"/>
+      <w:lvlText w:val="%8."/>
+      <w:lvlJc w:val="left"/>
+      <w:pPr>
+        <w:ind w:left="5760" w:hanging="360"/>
+      </w:pPr>
+    </w:lvl>
+    <w:lvl w:ilvl="8" w:tplc="0409001B" w:tentative="1">
+      <w:start w:val="1"/>
+      <w:numFmt w:val="lowerRoman"/>
+      <w:lvlText w:val="%9."/>
+      <w:lvlJc w:val="right"/>
+      <w:pPr>
+        <w:ind w:left="6480" w:hanging="180"/>
+      </w:pPr>
+    </w:lvl>
+  </w:abstractNum>
+  <w:abstractNum w:abstractNumId="1" w15:restartNumberingAfterBreak="0">
+    <w:nsid w:val="189E2E28"/>
+    <w:multiLevelType w:val="hybridMultilevel"/>
+    <w:tmpl w:val="438E016C"/>
+    <w:lvl w:ilvl="0" w:tplc="FE3E2D80">
+      <w:start w:val="1"/>
+      <w:numFmt w:val="decimal"/>
+      <w:lvlText w:val="%1-"/>
+      <w:lvlJc w:val="left"/>
+      <w:pPr>
+        <w:ind w:left="1080" w:hanging="720"/>
+      </w:pPr>
+      <w:rPr>
+        <w:rFonts w:hint="default"/>
+        <w:b w:val="0"/>
+        <w:color w:val="000000"/>
+        <w:sz w:val="24"/>
+        <w:szCs w:val="24"/>
+      </w:rPr>
+    </w:lvl>
+    <w:lvl w:ilvl="1" w:tplc="04090019" w:tentative="1">
+      <w:start w:val="1"/>
+      <w:numFmt w:val="lowerLetter"/>
+      <w:lvlText w:val="%2."/>
+      <w:lvlJc w:val="left"/>
+      <w:pPr>
+        <w:ind w:left="1440" w:hanging="360"/>
+      </w:pPr>
+    </w:lvl>
+    <w:lvl w:ilvl="2" w:tplc="0409001B" w:tentative="1">
+      <w:start w:val="1"/>
+      <w:numFmt w:val="lowerRoman"/>
+      <w:lvlText w:val="%3."/>
+      <w:lvlJc w:val="right"/>
+      <w:pPr>
+        <w:ind w:left="2160" w:hanging="180"/>
+      </w:pPr>
+    </w:lvl>
+    <w:lvl w:ilvl="3" w:tplc="0409000F" w:tentative="1">
+      <w:start w:val="1"/>
+      <w:numFmt w:val="decimal"/>
+      <w:lvlText w:val="%4."/>
+      <w:lvlJc w:val="left"/>
+      <w:pPr>
+        <w:ind w:left="2880" w:hanging="360"/>
+      </w:pPr>
+    </w:lvl>
+    <w:lvl w:ilvl="4" w:tplc="04090019" w:tentative="1">
+      <w:start w:val="1"/>
+      <w:numFmt w:val="lowerLetter"/>
+      <w:lvlText w:val="%5."/>
+      <w:lvlJc w:val="left"/>
+      <w:pPr>
+        <w:ind w:left="3600" w:hanging="360"/>
+      </w:pPr>
+    </w:lvl>
+    <w:lvl w:ilvl="5" w:tplc="0409001B" w:tentative="1">
+      <w:start w:val="1"/>
+      <w:numFmt w:val="lowerRoman"/>
+      <w:lvlText w:val="%6."/>
+      <w:lvlJc w:val="right"/>
+      <w:pPr>
+        <w:ind w:left="4320" w:hanging="180"/>
+      </w:pPr>
+    </w:lvl>
+    <w:lvl w:ilvl="6" w:tplc="0409000F" w:tentative="1">
+      <w:start w:val="1"/>
+      <w:numFmt w:val="decimal"/>
+      <w:lvlText w:val="%7."/>
+      <w:lvlJc w:val="left"/>
+      <w:pPr>
+        <w:ind w:left="5040" w:hanging="360"/>
+      </w:pPr>
+    </w:lvl>
+    <w:lvl w:ilvl="7" w:tplc="04090019" w:tentative="1">
+      <w:start w:val="1"/>
+      <w:numFmt w:val="lowerLetter"/>
+      <w:lvlText w:val="%8."/>
+      <w:lvlJc w:val="left"/>
+      <w:pPr>
+        <w:ind w:left="5760" w:hanging="360"/>
+      </w:pPr>
+    </w:lvl>
+    <w:lvl w:ilvl="8" w:tplc="0409001B" w:tentative="1">
+      <w:start w:val="1"/>
+      <w:numFmt w:val="lowerRoman"/>
+      <w:lvlText w:val="%9."/>
+      <w:lvlJc w:val="right"/>
+      <w:pPr>
+        <w:ind w:left="6480" w:hanging="180"/>
+      </w:pPr>
+    </w:lvl>
+  </w:abstractNum>
+  <w:abstractNum w:abstractNumId="2" w15:restartNumberingAfterBreak="0">
+    <w:nsid w:val="447042C5"/>
+    <w:multiLevelType w:val="hybridMultilevel"/>
+    <w:tmpl w:val="A36CDA0C"/>
+    <w:lvl w:ilvl="0" w:tplc="AA9CAFA4">
+      <w:start w:val="1"/>
+      <w:numFmt w:val="decimal"/>
+      <w:lvlText w:val="%1."/>
+      <w:lvlJc w:val="left"/>
+      <w:pPr>
+        <w:ind w:left="720" w:hanging="360"/>
+      </w:pPr>
+      <w:rPr>
+        <w:rFonts w:hint="default"/>
+        <w:b w:val="0"/>
+        <w:color w:val="000000"/>
+        <w:sz w:val="22"/>
+      </w:rPr>
+    </w:lvl>
+    <w:lvl w:ilvl="1" w:tplc="04090019" w:tentative="1">
+      <w:start w:val="1"/>
+      <w:numFmt w:val="lowerLetter"/>
+      <w:lvlText w:val="%2."/>
+      <w:lvlJc w:val="left"/>
+      <w:pPr>
+        <w:ind w:left="1440" w:hanging="360"/>
+      </w:pPr>
+    </w:lvl>
+    <w:lvl w:ilvl="2" w:tplc="0409001B" w:tentative="1">
+      <w:start w:val="1"/>
+      <w:numFmt w:val="lowerRoman"/>
+      <w:lvlText w:val="%3."/>
+      <w:lvlJc w:val="right"/>
+      <w:pPr>
+        <w:ind w:left="2160" w:hanging="180"/>
+      </w:pPr>
+    </w:lvl>
+    <w:lvl w:ilvl="3" w:tplc="0409000F" w:tentative="1">
+      <w:start w:val="1"/>
+      <w:numFmt w:val="decimal"/>
+      <w:lvlText w:val="%4."/>
+      <w:lvlJc w:val="left"/>
+      <w:pPr>
+        <w:ind w:left="2880" w:hanging="360"/>
+      </w:pPr>
+    </w:lvl>
+    <w:lvl w:ilvl="4" w:tplc="04090019" w:tentative="1">
+      <w:start w:val="1"/>
+      <w:numFmt w:val="lowerLetter"/>
+      <w:lvlText w:val="%5."/>
+      <w:lvlJc w:val="left"/>
+      <w:pPr>
+        <w:ind w:left="3600" w:hanging="360"/>
+      </w:pPr>
+    </w:lvl>
+    <w:lvl w:ilvl="5" w:tplc="0409001B" w:tentative="1">
+      <w:start w:val="1"/>
+      <w:numFmt w:val="lowerRoman"/>
+      <w:lvlText w:val="%6."/>
+      <w:lvlJc w:val="right"/>
+      <w:pPr>
+        <w:ind w:left="4320" w:hanging="180"/>
+      </w:pPr>
+    </w:lvl>
+    <w:lvl w:ilvl="6" w:tplc="0409000F" w:tentative="1">
+      <w:start w:val="1"/>
+      <w:numFmt w:val="decimal"/>
+      <w:lvlText w:val="%7."/>
+      <w:lvlJc w:val="left"/>
+      <w:pPr>
+        <w:ind w:left="5040" w:hanging="360"/>
+      </w:pPr>
+    </w:lvl>
+    <w:lvl w:ilvl="7" w:tplc="04090019" w:tentative="1">
+      <w:start w:val="1"/>
+      <w:numFmt w:val="lowerLetter"/>
+      <w:lvlText w:val="%8."/>
+      <w:lvlJc w:val="left"/>
+      <w:pPr>
+        <w:ind w:left="5760" w:hanging="360"/>
+      </w:pPr>
+    </w:lvl>
+    <w:lvl w:ilvl="8" w:tplc="0409001B" w:tentative="1">
+      <w:start w:val="1"/>
+      <w:numFmt w:val="lowerRoman"/>
+      <w:lvlText w:val="%9."/>
+      <w:lvlJc w:val="right"/>
+      <w:pPr>
+        <w:ind w:left="6480" w:hanging="180"/>
+      </w:pPr>
+    </w:lvl>
+  </w:abstractNum>
+  <w:abstractNum w:abstractNumId="3" w15:restartNumberingAfterBreak="0">
     <w:nsid w:val="5061530E"/>
     <w:multiLevelType w:val="hybridMultilevel"/>
     <w:tmpl w:val="A886C950"/>
@@ -5578,7 +6420,7 @@
       </w:pPr>
     </w:lvl>
   </w:abstractNum>
-  <w:abstractNum w:abstractNumId="1" w15:restartNumberingAfterBreak="0">
+  <w:abstractNum w:abstractNumId="4" w15:restartNumberingAfterBreak="0">
     <w:nsid w:val="58A4521E"/>
     <w:multiLevelType w:val="hybridMultilevel"/>
     <w:tmpl w:val="4190B3C0"/>
@@ -5691,7 +6533,7 @@
       </w:rPr>
     </w:lvl>
   </w:abstractNum>
-  <w:abstractNum w:abstractNumId="2" w15:restartNumberingAfterBreak="0">
+  <w:abstractNum w:abstractNumId="5" w15:restartNumberingAfterBreak="0">
     <w:nsid w:val="5A291053"/>
     <w:multiLevelType w:val="hybridMultilevel"/>
     <w:tmpl w:val="EBBE9508"/>
@@ -5777,7 +6619,100 @@
       </w:pPr>
     </w:lvl>
   </w:abstractNum>
-  <w:abstractNum w:abstractNumId="3" w15:restartNumberingAfterBreak="0">
+  <w:abstractNum w:abstractNumId="6" w15:restartNumberingAfterBreak="0">
+    <w:nsid w:val="5CA440D5"/>
+    <w:multiLevelType w:val="hybridMultilevel"/>
+    <w:tmpl w:val="C5F4CE26"/>
+    <w:lvl w:ilvl="0" w:tplc="3462DDD8">
+      <w:start w:val="1"/>
+      <w:numFmt w:val="decimal"/>
+      <w:lvlText w:val="%1."/>
+      <w:lvlJc w:val="left"/>
+      <w:pPr>
+        <w:ind w:left="720" w:hanging="360"/>
+      </w:pPr>
+      <w:rPr>
+        <w:rFonts w:hint="default"/>
+        <w:b w:val="0"/>
+        <w:color w:val="000000"/>
+        <w:sz w:val="24"/>
+        <w:szCs w:val="24"/>
+      </w:rPr>
+    </w:lvl>
+    <w:lvl w:ilvl="1" w:tplc="04090019" w:tentative="1">
+      <w:start w:val="1"/>
+      <w:numFmt w:val="lowerLetter"/>
+      <w:lvlText w:val="%2."/>
+      <w:lvlJc w:val="left"/>
+      <w:pPr>
+        <w:ind w:left="1440" w:hanging="360"/>
+      </w:pPr>
+    </w:lvl>
+    <w:lvl w:ilvl="2" w:tplc="0409001B" w:tentative="1">
+      <w:start w:val="1"/>
+      <w:numFmt w:val="lowerRoman"/>
+      <w:lvlText w:val="%3."/>
+      <w:lvlJc w:val="right"/>
+      <w:pPr>
+        <w:ind w:left="2160" w:hanging="180"/>
+      </w:pPr>
+    </w:lvl>
+    <w:lvl w:ilvl="3" w:tplc="0409000F" w:tentative="1">
+      <w:start w:val="1"/>
+      <w:numFmt w:val="decimal"/>
+      <w:lvlText w:val="%4."/>
+      <w:lvlJc w:val="left"/>
+      <w:pPr>
+        <w:ind w:left="2880" w:hanging="360"/>
+      </w:pPr>
+    </w:lvl>
+    <w:lvl w:ilvl="4" w:tplc="04090019" w:tentative="1">
+      <w:start w:val="1"/>
+      <w:numFmt w:val="lowerLetter"/>
+      <w:lvlText w:val="%5."/>
+      <w:lvlJc w:val="left"/>
+      <w:pPr>
+        <w:ind w:left="3600" w:hanging="360"/>
+      </w:pPr>
+    </w:lvl>
+    <w:lvl w:ilvl="5" w:tplc="0409001B" w:tentative="1">
+      <w:start w:val="1"/>
+      <w:numFmt w:val="lowerRoman"/>
+      <w:lvlText w:val="%6."/>
+      <w:lvlJc w:val="right"/>
+      <w:pPr>
+        <w:ind w:left="4320" w:hanging="180"/>
+      </w:pPr>
+    </w:lvl>
+    <w:lvl w:ilvl="6" w:tplc="0409000F" w:tentative="1">
+      <w:start w:val="1"/>
+      <w:numFmt w:val="decimal"/>
+      <w:lvlText w:val="%7."/>
+      <w:lvlJc w:val="left"/>
+      <w:pPr>
+        <w:ind w:left="5040" w:hanging="360"/>
+      </w:pPr>
+    </w:lvl>
+    <w:lvl w:ilvl="7" w:tplc="04090019" w:tentative="1">
+      <w:start w:val="1"/>
+      <w:numFmt w:val="lowerLetter"/>
+      <w:lvlText w:val="%8."/>
+      <w:lvlJc w:val="left"/>
+      <w:pPr>
+        <w:ind w:left="5760" w:hanging="360"/>
+      </w:pPr>
+    </w:lvl>
+    <w:lvl w:ilvl="8" w:tplc="0409001B" w:tentative="1">
+      <w:start w:val="1"/>
+      <w:numFmt w:val="lowerRoman"/>
+      <w:lvlText w:val="%9."/>
+      <w:lvlJc w:val="right"/>
+      <w:pPr>
+        <w:ind w:left="6480" w:hanging="180"/>
+      </w:pPr>
+    </w:lvl>
+  </w:abstractNum>
+  <w:abstractNum w:abstractNumId="7" w15:restartNumberingAfterBreak="0">
     <w:nsid w:val="67556A68"/>
     <w:multiLevelType w:val="hybridMultilevel"/>
     <w:tmpl w:val="EFD8CECE"/>
@@ -5890,7 +6825,191 @@
       </w:rPr>
     </w:lvl>
   </w:abstractNum>
-  <w:abstractNum w:abstractNumId="4" w15:restartNumberingAfterBreak="0">
+  <w:abstractNum w:abstractNumId="8" w15:restartNumberingAfterBreak="0">
+    <w:nsid w:val="6B404A2C"/>
+    <w:multiLevelType w:val="hybridMultilevel"/>
+    <w:tmpl w:val="012EB97C"/>
+    <w:lvl w:ilvl="0" w:tplc="A32A1F96">
+      <w:start w:val="1"/>
+      <w:numFmt w:val="decimal"/>
+      <w:lvlText w:val="%1."/>
+      <w:lvlJc w:val="left"/>
+      <w:pPr>
+        <w:ind w:left="720" w:hanging="360"/>
+      </w:pPr>
+      <w:rPr>
+        <w:rFonts w:hint="default"/>
+        <w:b w:val="0"/>
+        <w:color w:val="000000"/>
+        <w:sz w:val="22"/>
+      </w:rPr>
+    </w:lvl>
+    <w:lvl w:ilvl="1" w:tplc="04090019" w:tentative="1">
+      <w:start w:val="1"/>
+      <w:numFmt w:val="lowerLetter"/>
+      <w:lvlText w:val="%2."/>
+      <w:lvlJc w:val="left"/>
+      <w:pPr>
+        <w:ind w:left="1440" w:hanging="360"/>
+      </w:pPr>
+    </w:lvl>
+    <w:lvl w:ilvl="2" w:tplc="0409001B" w:tentative="1">
+      <w:start w:val="1"/>
+      <w:numFmt w:val="lowerRoman"/>
+      <w:lvlText w:val="%3."/>
+      <w:lvlJc w:val="right"/>
+      <w:pPr>
+        <w:ind w:left="2160" w:hanging="180"/>
+      </w:pPr>
+    </w:lvl>
+    <w:lvl w:ilvl="3" w:tplc="0409000F" w:tentative="1">
+      <w:start w:val="1"/>
+      <w:numFmt w:val="decimal"/>
+      <w:lvlText w:val="%4."/>
+      <w:lvlJc w:val="left"/>
+      <w:pPr>
+        <w:ind w:left="2880" w:hanging="360"/>
+      </w:pPr>
+    </w:lvl>
+    <w:lvl w:ilvl="4" w:tplc="04090019" w:tentative="1">
+      <w:start w:val="1"/>
+      <w:numFmt w:val="lowerLetter"/>
+      <w:lvlText w:val="%5."/>
+      <w:lvlJc w:val="left"/>
+      <w:pPr>
+        <w:ind w:left="3600" w:hanging="360"/>
+      </w:pPr>
+    </w:lvl>
+    <w:lvl w:ilvl="5" w:tplc="0409001B" w:tentative="1">
+      <w:start w:val="1"/>
+      <w:numFmt w:val="lowerRoman"/>
+      <w:lvlText w:val="%6."/>
+      <w:lvlJc w:val="right"/>
+      <w:pPr>
+        <w:ind w:left="4320" w:hanging="180"/>
+      </w:pPr>
+    </w:lvl>
+    <w:lvl w:ilvl="6" w:tplc="0409000F" w:tentative="1">
+      <w:start w:val="1"/>
+      <w:numFmt w:val="decimal"/>
+      <w:lvlText w:val="%7."/>
+      <w:lvlJc w:val="left"/>
+      <w:pPr>
+        <w:ind w:left="5040" w:hanging="360"/>
+      </w:pPr>
+    </w:lvl>
+    <w:lvl w:ilvl="7" w:tplc="04090019" w:tentative="1">
+      <w:start w:val="1"/>
+      <w:numFmt w:val="lowerLetter"/>
+      <w:lvlText w:val="%8."/>
+      <w:lvlJc w:val="left"/>
+      <w:pPr>
+        <w:ind w:left="5760" w:hanging="360"/>
+      </w:pPr>
+    </w:lvl>
+    <w:lvl w:ilvl="8" w:tplc="0409001B" w:tentative="1">
+      <w:start w:val="1"/>
+      <w:numFmt w:val="lowerRoman"/>
+      <w:lvlText w:val="%9."/>
+      <w:lvlJc w:val="right"/>
+      <w:pPr>
+        <w:ind w:left="6480" w:hanging="180"/>
+      </w:pPr>
+    </w:lvl>
+  </w:abstractNum>
+  <w:abstractNum w:abstractNumId="9" w15:restartNumberingAfterBreak="0">
+    <w:nsid w:val="747B745E"/>
+    <w:multiLevelType w:val="hybridMultilevel"/>
+    <w:tmpl w:val="15360DCA"/>
+    <w:lvl w:ilvl="0" w:tplc="235AA978">
+      <w:start w:val="1"/>
+      <w:numFmt w:val="decimal"/>
+      <w:lvlText w:val="%1."/>
+      <w:lvlJc w:val="left"/>
+      <w:pPr>
+        <w:ind w:left="720" w:hanging="360"/>
+      </w:pPr>
+      <w:rPr>
+        <w:rFonts w:hint="default"/>
+        <w:b w:val="0"/>
+        <w:color w:val="000000"/>
+        <w:sz w:val="22"/>
+      </w:rPr>
+    </w:lvl>
+    <w:lvl w:ilvl="1" w:tplc="04090019" w:tentative="1">
+      <w:start w:val="1"/>
+      <w:numFmt w:val="lowerLetter"/>
+      <w:lvlText w:val="%2."/>
+      <w:lvlJc w:val="left"/>
+      <w:pPr>
+        <w:ind w:left="1440" w:hanging="360"/>
+      </w:pPr>
+    </w:lvl>
+    <w:lvl w:ilvl="2" w:tplc="0409001B" w:tentative="1">
+      <w:start w:val="1"/>
+      <w:numFmt w:val="lowerRoman"/>
+      <w:lvlText w:val="%3."/>
+      <w:lvlJc w:val="right"/>
+      <w:pPr>
+        <w:ind w:left="2160" w:hanging="180"/>
+      </w:pPr>
+    </w:lvl>
+    <w:lvl w:ilvl="3" w:tplc="0409000F" w:tentative="1">
+      <w:start w:val="1"/>
+      <w:numFmt w:val="decimal"/>
+      <w:lvlText w:val="%4."/>
+      <w:lvlJc w:val="left"/>
+      <w:pPr>
+        <w:ind w:left="2880" w:hanging="360"/>
+      </w:pPr>
+    </w:lvl>
+    <w:lvl w:ilvl="4" w:tplc="04090019" w:tentative="1">
+      <w:start w:val="1"/>
+      <w:numFmt w:val="lowerLetter"/>
+      <w:lvlText w:val="%5."/>
+      <w:lvlJc w:val="left"/>
+      <w:pPr>
+        <w:ind w:left="3600" w:hanging="360"/>
+      </w:pPr>
+    </w:lvl>
+    <w:lvl w:ilvl="5" w:tplc="0409001B" w:tentative="1">
+      <w:start w:val="1"/>
+      <w:numFmt w:val="lowerRoman"/>
+      <w:lvlText w:val="%6."/>
+      <w:lvlJc w:val="right"/>
+      <w:pPr>
+        <w:ind w:left="4320" w:hanging="180"/>
+      </w:pPr>
+    </w:lvl>
+    <w:lvl w:ilvl="6" w:tplc="0409000F" w:tentative="1">
+      <w:start w:val="1"/>
+      <w:numFmt w:val="decimal"/>
+      <w:lvlText w:val="%7."/>
+      <w:lvlJc w:val="left"/>
+      <w:pPr>
+        <w:ind w:left="5040" w:hanging="360"/>
+      </w:pPr>
+    </w:lvl>
+    <w:lvl w:ilvl="7" w:tplc="04090019" w:tentative="1">
+      <w:start w:val="1"/>
+      <w:numFmt w:val="lowerLetter"/>
+      <w:lvlText w:val="%8."/>
+      <w:lvlJc w:val="left"/>
+      <w:pPr>
+        <w:ind w:left="5760" w:hanging="360"/>
+      </w:pPr>
+    </w:lvl>
+    <w:lvl w:ilvl="8" w:tplc="0409001B" w:tentative="1">
+      <w:start w:val="1"/>
+      <w:numFmt w:val="lowerRoman"/>
+      <w:lvlText w:val="%9."/>
+      <w:lvlJc w:val="right"/>
+      <w:pPr>
+        <w:ind w:left="6480" w:hanging="180"/>
+      </w:pPr>
+    </w:lvl>
+  </w:abstractNum>
+  <w:abstractNum w:abstractNumId="10" w15:restartNumberingAfterBreak="0">
     <w:nsid w:val="79ED38D8"/>
     <w:multiLevelType w:val="hybridMultilevel"/>
     <w:tmpl w:val="06ECFAAC"/>
@@ -5976,20 +7095,38 @@
       </w:pPr>
     </w:lvl>
   </w:abstractNum>
-  <w:num w:numId="1" w16cid:durableId="580529723">
+  <w:num w:numId="1">
+    <w:abstractNumId w:val="4"/>
+  </w:num>
+  <w:num w:numId="2">
+    <w:abstractNumId w:val="5"/>
+  </w:num>
+  <w:num w:numId="3">
+    <w:abstractNumId w:val="10"/>
+  </w:num>
+  <w:num w:numId="4">
+    <w:abstractNumId w:val="7"/>
+  </w:num>
+  <w:num w:numId="5">
+    <w:abstractNumId w:val="3"/>
+  </w:num>
+  <w:num w:numId="6">
+    <w:abstractNumId w:val="0"/>
+  </w:num>
+  <w:num w:numId="7">
+    <w:abstractNumId w:val="2"/>
+  </w:num>
+  <w:num w:numId="8">
+    <w:abstractNumId w:val="8"/>
+  </w:num>
+  <w:num w:numId="9">
     <w:abstractNumId w:val="1"/>
   </w:num>
-  <w:num w:numId="2" w16cid:durableId="1103454760">
-    <w:abstractNumId w:val="2"/>
+  <w:num w:numId="10">
+    <w:abstractNumId w:val="9"/>
   </w:num>
-  <w:num w:numId="3" w16cid:durableId="988897025">
-    <w:abstractNumId w:val="4"/>
-  </w:num>
-  <w:num w:numId="4" w16cid:durableId="241794348">
-    <w:abstractNumId w:val="3"/>
-  </w:num>
-  <w:num w:numId="5" w16cid:durableId="761492297">
-    <w:abstractNumId w:val="0"/>
+  <w:num w:numId="11">
+    <w:abstractNumId w:val="6"/>
   </w:num>
 </w:numbering>
 </file>
@@ -6492,6 +7629,7 @@
   <w:style w:type="character" w:default="1" w:styleId="DefaultParagraphFont">
     <w:name w:val="Default Paragraph Font"/>
     <w:uiPriority w:val="1"/>
+    <w:semiHidden/>
     <w:unhideWhenUsed/>
   </w:style>
   <w:style w:type="table" w:default="1" w:styleId="TableNormal">
@@ -7053,6 +8191,11 @@
         <w14:bevel/>
       </w14:textOutline>
     </w:rPr>
+  </w:style>
+  <w:style w:type="character" w:customStyle="1" w:styleId="p">
+    <w:name w:val="p"/>
+    <w:basedOn w:val="DefaultParagraphFont"/>
+    <w:rsid w:val="00B1078A"/>
   </w:style>
 </w:styles>
 </file>

</xml_diff>

<commit_message>
add project goals to the new proposal
</commit_message>
<xml_diff>
--- a/Documentation/Analysis/System Proposal/System proposal.docx
+++ b/Documentation/Analysis/System Proposal/System proposal.docx
@@ -6787,7 +6787,6 @@
     <w:p>
       <w:pPr>
         <w:rPr>
-          <w:rFonts w:hint="cs"/>
           <w:rtl/>
         </w:rPr>
       </w:pPr>
@@ -7586,7 +7585,6 @@
       <w:pPr>
         <w:pStyle w:val="Heading2"/>
         <w:rPr>
-          <w:rFonts w:hint="cs"/>
           <w:sz w:val="36"/>
           <w:szCs w:val="36"/>
           <w:rtl/>
@@ -7635,6 +7633,9 @@
     <w:p>
       <w:pPr>
         <w:pStyle w:val="Body"/>
+        <w:rPr>
+          <w:rFonts w:hint="default"/>
+        </w:rPr>
       </w:pPr>
     </w:p>
     <w:p>
@@ -7675,6 +7676,659 @@
     </w:p>
     <w:p>
       <w:pPr>
+        <w:pStyle w:val="ListParagraph"/>
+        <w:numPr>
+          <w:ilvl w:val="0"/>
+          <w:numId w:val="22"/>
+        </w:numPr>
+        <w:rPr>
+          <w:b/>
+          <w:bCs/>
+          <w:lang w:bidi="fa-IR"/>
+        </w:rPr>
+      </w:pPr>
+      <w:r>
+        <w:rPr>
+          <w:rFonts w:hint="cs"/>
+          <w:rtl/>
+        </w:rPr>
+        <w:t>تسهیل رزرو نوبت بدون محدودیت زمان و مکان و بدون نیاز به تماس تلف</w:t>
+      </w:r>
+      <w:r>
+        <w:rPr>
+          <w:rFonts w:hint="cs"/>
+          <w:rtl/>
+        </w:rPr>
+        <w:t>نی</w:t>
+      </w:r>
+    </w:p>
+    <w:p>
+      <w:pPr>
+        <w:spacing w:before="0" w:line="240" w:lineRule="auto"/>
+        <w:jc w:val="left"/>
+        <w:rPr>
+          <w:rFonts w:hint="cs"/>
+          <w:b/>
+          <w:bCs/>
+          <w:lang w:bidi="fa-IR"/>
+        </w:rPr>
+      </w:pPr>
+    </w:p>
+    <w:p>
+      <w:pPr>
+        <w:pStyle w:val="ListParagraph"/>
+        <w:numPr>
+          <w:ilvl w:val="0"/>
+          <w:numId w:val="22"/>
+        </w:numPr>
+        <w:spacing w:before="0" w:line="240" w:lineRule="auto"/>
+        <w:jc w:val="left"/>
+        <w:rPr>
+          <w:rFonts w:hint="cs"/>
+          <w:b/>
+          <w:bCs/>
+          <w:lang w:bidi="fa-IR"/>
+        </w:rPr>
+      </w:pPr>
+      <w:r>
+        <w:rPr>
+          <w:rFonts w:hint="cs"/>
+          <w:rtl/>
+        </w:rPr>
+        <w:t>معرفی و دیده</w:t>
+      </w:r>
+      <w:r>
+        <w:rPr>
+          <w:rFonts w:ascii="Times New Roman" w:hAnsi="Times New Roman" w:cs="Times New Roman"/>
+          <w:lang w:bidi="fa-IR"/>
+        </w:rPr>
+        <w:t>‌</w:t>
+      </w:r>
+      <w:r>
+        <w:rPr>
+          <w:rFonts w:hint="cs"/>
+          <w:rtl/>
+        </w:rPr>
+        <w:t>شدن کسب</w:t>
+      </w:r>
+      <w:r>
+        <w:rPr>
+          <w:rFonts w:ascii="Times New Roman" w:hAnsi="Times New Roman" w:cs="Times New Roman"/>
+          <w:lang w:bidi="fa-IR"/>
+        </w:rPr>
+        <w:t>‌</w:t>
+      </w:r>
+      <w:r>
+        <w:rPr>
+          <w:rFonts w:hint="cs"/>
+          <w:rtl/>
+        </w:rPr>
+        <w:t>وکارهای مختلف در یک پلتفرم واحد</w:t>
+      </w:r>
+    </w:p>
+    <w:p>
+      <w:pPr>
+        <w:spacing w:before="0" w:line="240" w:lineRule="auto"/>
+        <w:jc w:val="left"/>
+        <w:rPr>
+          <w:rFonts w:hint="cs"/>
+          <w:b/>
+          <w:bCs/>
+          <w:lang w:bidi="fa-IR"/>
+        </w:rPr>
+      </w:pPr>
+    </w:p>
+    <w:p>
+      <w:pPr>
+        <w:pStyle w:val="ListParagraph"/>
+        <w:numPr>
+          <w:ilvl w:val="0"/>
+          <w:numId w:val="22"/>
+        </w:numPr>
+        <w:spacing w:before="0" w:line="240" w:lineRule="auto"/>
+        <w:jc w:val="left"/>
+        <w:rPr>
+          <w:rFonts w:hint="cs"/>
+          <w:b/>
+          <w:bCs/>
+          <w:lang w:bidi="fa-IR"/>
+        </w:rPr>
+      </w:pPr>
+      <w:r>
+        <w:rPr>
+          <w:rFonts w:hint="cs"/>
+          <w:rtl/>
+        </w:rPr>
+        <w:t>گسترش بازار و جذب مشتری حتی از شهرهای دیگر برای کسب</w:t>
+      </w:r>
+      <w:r>
+        <w:rPr>
+          <w:rFonts w:ascii="Times New Roman" w:hAnsi="Times New Roman" w:cs="Times New Roman"/>
+          <w:lang w:bidi="fa-IR"/>
+        </w:rPr>
+        <w:t>‌</w:t>
+      </w:r>
+      <w:r>
+        <w:rPr>
+          <w:rFonts w:hint="cs"/>
+          <w:rtl/>
+        </w:rPr>
+        <w:t>وکارها</w:t>
+      </w:r>
+    </w:p>
+    <w:p>
+      <w:pPr>
+        <w:spacing w:before="0" w:line="240" w:lineRule="auto"/>
+        <w:jc w:val="left"/>
+        <w:rPr>
+          <w:rFonts w:hint="cs"/>
+          <w:b/>
+          <w:bCs/>
+          <w:lang w:bidi="fa-IR"/>
+        </w:rPr>
+      </w:pPr>
+    </w:p>
+    <w:p>
+      <w:pPr>
+        <w:pStyle w:val="ListParagraph"/>
+        <w:numPr>
+          <w:ilvl w:val="0"/>
+          <w:numId w:val="22"/>
+        </w:numPr>
+        <w:spacing w:before="0" w:line="240" w:lineRule="auto"/>
+        <w:jc w:val="left"/>
+        <w:rPr>
+          <w:rFonts w:hint="cs"/>
+          <w:b/>
+          <w:bCs/>
+          <w:lang w:bidi="fa-IR"/>
+        </w:rPr>
+      </w:pPr>
+      <w:r>
+        <w:rPr>
+          <w:rFonts w:hint="cs"/>
+          <w:rtl/>
+        </w:rPr>
+        <w:t>ایجاد تجربه</w:t>
+      </w:r>
+      <w:r>
+        <w:rPr>
+          <w:rFonts w:ascii="Times New Roman" w:hAnsi="Times New Roman" w:cs="Times New Roman"/>
+          <w:lang w:bidi="fa-IR"/>
+        </w:rPr>
+        <w:t>‌</w:t>
+      </w:r>
+      <w:r>
+        <w:rPr>
+          <w:rFonts w:hint="cs"/>
+          <w:rtl/>
+        </w:rPr>
+        <w:t>ی بهتر از رزرو نوبت برای کاربران</w:t>
+      </w:r>
+    </w:p>
+    <w:p>
+      <w:pPr>
+        <w:spacing w:before="0" w:line="240" w:lineRule="auto"/>
+        <w:jc w:val="left"/>
+        <w:rPr>
+          <w:rFonts w:hint="cs"/>
+          <w:b/>
+          <w:bCs/>
+          <w:lang w:bidi="fa-IR"/>
+        </w:rPr>
+      </w:pPr>
+    </w:p>
+    <w:p>
+      <w:pPr>
+        <w:pStyle w:val="ListParagraph"/>
+        <w:numPr>
+          <w:ilvl w:val="0"/>
+          <w:numId w:val="22"/>
+        </w:numPr>
+        <w:spacing w:before="0" w:line="240" w:lineRule="auto"/>
+        <w:jc w:val="left"/>
+        <w:rPr>
+          <w:rFonts w:hint="cs"/>
+          <w:b/>
+          <w:bCs/>
+          <w:lang w:bidi="fa-IR"/>
+        </w:rPr>
+      </w:pPr>
+      <w:r>
+        <w:rPr>
+          <w:rFonts w:hint="cs"/>
+          <w:rtl/>
+        </w:rPr>
+        <w:t>کاهش ازدحام و زمان انتظار مراجعه</w:t>
+      </w:r>
+      <w:r>
+        <w:rPr>
+          <w:rFonts w:ascii="Times New Roman" w:hAnsi="Times New Roman" w:cs="Times New Roman"/>
+          <w:lang w:bidi="fa-IR"/>
+        </w:rPr>
+        <w:t>‌</w:t>
+      </w:r>
+      <w:r>
+        <w:rPr>
+          <w:rFonts w:hint="cs"/>
+          <w:rtl/>
+        </w:rPr>
+        <w:t>کنندگان با مدیریت دقیق</w:t>
+      </w:r>
+      <w:r>
+        <w:rPr>
+          <w:rFonts w:ascii="Times New Roman" w:hAnsi="Times New Roman" w:cs="Times New Roman"/>
+          <w:lang w:bidi="fa-IR"/>
+        </w:rPr>
+        <w:t>‌</w:t>
+      </w:r>
+      <w:r>
+        <w:rPr>
+          <w:rFonts w:hint="cs"/>
+          <w:rtl/>
+        </w:rPr>
+        <w:t>تر نوبت</w:t>
+      </w:r>
+      <w:r>
+        <w:rPr>
+          <w:rFonts w:ascii="Times New Roman" w:hAnsi="Times New Roman" w:cs="Times New Roman"/>
+          <w:lang w:bidi="fa-IR"/>
+        </w:rPr>
+        <w:t>‌</w:t>
+      </w:r>
+      <w:r>
+        <w:rPr>
+          <w:rFonts w:hint="cs"/>
+          <w:rtl/>
+        </w:rPr>
+        <w:t>ها</w:t>
+      </w:r>
+    </w:p>
+    <w:p>
+      <w:pPr>
+        <w:spacing w:before="0" w:line="240" w:lineRule="auto"/>
+        <w:jc w:val="left"/>
+        <w:rPr>
+          <w:rFonts w:hint="cs"/>
+          <w:b/>
+          <w:bCs/>
+          <w:lang w:bidi="fa-IR"/>
+        </w:rPr>
+      </w:pPr>
+    </w:p>
+    <w:p>
+      <w:pPr>
+        <w:pStyle w:val="ListParagraph"/>
+        <w:numPr>
+          <w:ilvl w:val="0"/>
+          <w:numId w:val="22"/>
+        </w:numPr>
+        <w:spacing w:before="0" w:line="240" w:lineRule="auto"/>
+        <w:jc w:val="left"/>
+        <w:rPr>
+          <w:rFonts w:hint="cs"/>
+          <w:b/>
+          <w:bCs/>
+          <w:lang w:bidi="fa-IR"/>
+        </w:rPr>
+      </w:pPr>
+      <w:r>
+        <w:rPr>
+          <w:rFonts w:hint="cs"/>
+          <w:rtl/>
+        </w:rPr>
+        <w:t>کاهش خطاهای انسانی در ثبت و مدیریت نوبت</w:t>
+      </w:r>
+      <w:r>
+        <w:rPr>
+          <w:rFonts w:ascii="Times New Roman" w:hAnsi="Times New Roman" w:cs="Times New Roman"/>
+          <w:lang w:bidi="fa-IR"/>
+        </w:rPr>
+        <w:t>‌</w:t>
+      </w:r>
+      <w:r>
+        <w:rPr>
+          <w:rFonts w:hint="cs"/>
+          <w:rtl/>
+        </w:rPr>
+        <w:t>ها نسبت به روش</w:t>
+      </w:r>
+      <w:r>
+        <w:rPr>
+          <w:rFonts w:ascii="Times New Roman" w:hAnsi="Times New Roman" w:cs="Times New Roman"/>
+          <w:lang w:bidi="fa-IR"/>
+        </w:rPr>
+        <w:t>‌</w:t>
+      </w:r>
+      <w:r>
+        <w:rPr>
+          <w:rFonts w:hint="cs"/>
+          <w:rtl/>
+        </w:rPr>
+        <w:t>های سنتی</w:t>
+      </w:r>
+    </w:p>
+    <w:p>
+      <w:pPr>
+        <w:spacing w:before="0" w:line="240" w:lineRule="auto"/>
+        <w:jc w:val="left"/>
+        <w:rPr>
+          <w:rFonts w:hint="cs"/>
+          <w:b/>
+          <w:bCs/>
+          <w:lang w:bidi="fa-IR"/>
+        </w:rPr>
+      </w:pPr>
+    </w:p>
+    <w:p>
+      <w:pPr>
+        <w:pStyle w:val="ListParagraph"/>
+        <w:numPr>
+          <w:ilvl w:val="0"/>
+          <w:numId w:val="22"/>
+        </w:numPr>
+        <w:spacing w:before="0" w:line="240" w:lineRule="auto"/>
+        <w:jc w:val="left"/>
+        <w:rPr>
+          <w:rFonts w:hint="cs"/>
+          <w:b/>
+          <w:bCs/>
+          <w:lang w:bidi="fa-IR"/>
+        </w:rPr>
+      </w:pPr>
+      <w:r>
+        <w:rPr>
+          <w:rFonts w:hint="cs"/>
+          <w:rtl/>
+        </w:rPr>
+        <w:t>کاهش هزینه</w:t>
+      </w:r>
+      <w:r>
+        <w:rPr>
+          <w:rFonts w:ascii="Times New Roman" w:hAnsi="Times New Roman" w:cs="Times New Roman"/>
+          <w:lang w:bidi="fa-IR"/>
+        </w:rPr>
+        <w:t>‌</w:t>
+      </w:r>
+      <w:r>
+        <w:rPr>
+          <w:rFonts w:hint="cs"/>
+          <w:rtl/>
+        </w:rPr>
+        <w:t>های نیروی انسانی و زمانی مربوط به هماهنگی نوبت</w:t>
+      </w:r>
+      <w:r>
+        <w:rPr>
+          <w:rFonts w:ascii="Times New Roman" w:hAnsi="Times New Roman" w:cs="Times New Roman"/>
+          <w:lang w:bidi="fa-IR"/>
+        </w:rPr>
+        <w:t>‌</w:t>
+      </w:r>
+      <w:r>
+        <w:rPr>
+          <w:rFonts w:hint="cs"/>
+          <w:rtl/>
+        </w:rPr>
+        <w:t>ها</w:t>
+      </w:r>
+    </w:p>
+    <w:p>
+      <w:pPr>
+        <w:spacing w:before="0" w:line="240" w:lineRule="auto"/>
+        <w:jc w:val="left"/>
+        <w:rPr>
+          <w:rFonts w:hint="cs"/>
+          <w:b/>
+          <w:bCs/>
+          <w:lang w:bidi="fa-IR"/>
+        </w:rPr>
+      </w:pPr>
+    </w:p>
+    <w:p>
+      <w:pPr>
+        <w:pStyle w:val="ListParagraph"/>
+        <w:numPr>
+          <w:ilvl w:val="0"/>
+          <w:numId w:val="22"/>
+        </w:numPr>
+        <w:spacing w:before="0" w:line="240" w:lineRule="auto"/>
+        <w:jc w:val="left"/>
+        <w:rPr>
+          <w:rFonts w:hint="cs"/>
+          <w:b/>
+          <w:bCs/>
+          <w:lang w:bidi="fa-IR"/>
+        </w:rPr>
+      </w:pPr>
+      <w:r>
+        <w:rPr>
+          <w:rFonts w:hint="cs"/>
+          <w:rtl/>
+        </w:rPr>
+        <w:t>امکان مشاهده</w:t>
+      </w:r>
+      <w:r>
+        <w:rPr>
+          <w:rFonts w:ascii="Times New Roman" w:hAnsi="Times New Roman" w:cs="Times New Roman"/>
+          <w:lang w:bidi="fa-IR"/>
+        </w:rPr>
+        <w:t>‌</w:t>
+      </w:r>
+      <w:r>
+        <w:rPr>
+          <w:rFonts w:hint="cs"/>
+          <w:rtl/>
+        </w:rPr>
+        <w:t>ی امتیاز و اعتبار کسب</w:t>
+      </w:r>
+      <w:r>
+        <w:rPr>
+          <w:rFonts w:ascii="Times New Roman" w:hAnsi="Times New Roman" w:cs="Times New Roman"/>
+          <w:lang w:bidi="fa-IR"/>
+        </w:rPr>
+        <w:t>‌</w:t>
+      </w:r>
+      <w:r>
+        <w:rPr>
+          <w:rFonts w:hint="cs"/>
+          <w:rtl/>
+        </w:rPr>
+        <w:t>وکارها توسط کاربران</w:t>
+      </w:r>
+    </w:p>
+    <w:p>
+      <w:pPr>
+        <w:spacing w:before="0" w:line="240" w:lineRule="auto"/>
+        <w:jc w:val="left"/>
+        <w:rPr>
+          <w:rFonts w:hint="cs"/>
+          <w:b/>
+          <w:bCs/>
+          <w:lang w:bidi="fa-IR"/>
+        </w:rPr>
+      </w:pPr>
+    </w:p>
+    <w:p>
+      <w:pPr>
+        <w:pStyle w:val="ListParagraph"/>
+        <w:numPr>
+          <w:ilvl w:val="0"/>
+          <w:numId w:val="22"/>
+        </w:numPr>
+        <w:spacing w:before="0" w:line="240" w:lineRule="auto"/>
+        <w:jc w:val="left"/>
+        <w:rPr>
+          <w:rFonts w:hint="cs"/>
+          <w:b/>
+          <w:bCs/>
+          <w:lang w:bidi="fa-IR"/>
+        </w:rPr>
+      </w:pPr>
+      <w:r>
+        <w:rPr>
+          <w:rFonts w:hint="cs"/>
+          <w:rtl/>
+        </w:rPr>
+        <w:t>مدیریت متمرکز و آسان نوبت</w:t>
+      </w:r>
+      <w:r>
+        <w:rPr>
+          <w:rFonts w:ascii="Times New Roman" w:hAnsi="Times New Roman" w:cs="Times New Roman"/>
+          <w:lang w:bidi="fa-IR"/>
+        </w:rPr>
+        <w:t>‌</w:t>
+      </w:r>
+      <w:r>
+        <w:rPr>
+          <w:rFonts w:hint="cs"/>
+          <w:rtl/>
+        </w:rPr>
+        <w:t>ها برای صاحبان کسب</w:t>
+      </w:r>
+      <w:r>
+        <w:rPr>
+          <w:rFonts w:ascii="Times New Roman" w:hAnsi="Times New Roman" w:cs="Times New Roman"/>
+          <w:lang w:bidi="fa-IR"/>
+        </w:rPr>
+        <w:t>‌</w:t>
+      </w:r>
+      <w:r>
+        <w:rPr>
+          <w:rFonts w:hint="cs"/>
+          <w:rtl/>
+        </w:rPr>
+        <w:t>وکار از طریق یک پنل اختصاصی</w:t>
+      </w:r>
+    </w:p>
+    <w:p>
+      <w:pPr>
+        <w:spacing w:before="0" w:line="240" w:lineRule="auto"/>
+        <w:jc w:val="left"/>
+        <w:rPr>
+          <w:rFonts w:hint="cs"/>
+          <w:b/>
+          <w:bCs/>
+          <w:lang w:bidi="fa-IR"/>
+        </w:rPr>
+      </w:pPr>
+    </w:p>
+    <w:p>
+      <w:pPr>
+        <w:pStyle w:val="ListParagraph"/>
+        <w:numPr>
+          <w:ilvl w:val="0"/>
+          <w:numId w:val="22"/>
+        </w:numPr>
+        <w:spacing w:before="0" w:line="240" w:lineRule="auto"/>
+        <w:jc w:val="left"/>
+        <w:rPr>
+          <w:rtl/>
+        </w:rPr>
+      </w:pPr>
+      <w:r>
+        <w:rPr>
+          <w:rFonts w:hint="cs"/>
+          <w:rtl/>
+        </w:rPr>
+        <w:t>افزایش سرعت در ارائه خدمات و پاسخ به درخواست</w:t>
+      </w:r>
+      <w:r>
+        <w:rPr>
+          <w:rFonts w:ascii="Times New Roman" w:hAnsi="Times New Roman" w:cs="Times New Roman"/>
+          <w:lang w:bidi="fa-IR"/>
+        </w:rPr>
+        <w:t>‌</w:t>
+      </w:r>
+      <w:r>
+        <w:rPr>
+          <w:rFonts w:hint="cs"/>
+          <w:rtl/>
+        </w:rPr>
+        <w:t>های مشتریان</w:t>
+      </w:r>
+    </w:p>
+    <w:p>
+      <w:pPr>
+        <w:bidi w:val="0"/>
+        <w:spacing w:before="0" w:line="240" w:lineRule="auto"/>
+        <w:jc w:val="left"/>
+        <w:rPr>
+          <w:rtl/>
+        </w:rPr>
+      </w:pPr>
+      <w:r>
+        <w:rPr>
+          <w:rtl/>
+        </w:rPr>
+        <w:br w:type="page"/>
+      </w:r>
+    </w:p>
+    <w:p>
+      <w:pPr>
+        <w:pStyle w:val="Heading2"/>
+        <w:rPr>
+          <w:rtl/>
+          <w:lang w:bidi="fa-IR"/>
+        </w:rPr>
+      </w:pPr>
+      <w:bookmarkStart w:id="7" w:name="_Toc234084114"/>
+      <w:bookmarkStart w:id="8" w:name="_Hlk233397996"/>
+      <w:r>
+        <w:rPr>
+          <w:rtl/>
+        </w:rPr>
+        <w:lastRenderedPageBreak/>
+        <w:t>دامنه پرو</w:t>
+      </w:r>
+      <w:r>
+        <w:rPr>
+          <w:rFonts w:hint="cs"/>
+          <w:rtl/>
+          <w:lang w:bidi="fa-IR"/>
+        </w:rPr>
+        <w:t>ژه</w:t>
+      </w:r>
+      <w:bookmarkEnd w:id="7"/>
+    </w:p>
+    <w:p>
+      <w:pPr>
+        <w:pStyle w:val="Heading2"/>
+        <w:rPr>
+          <w:rtl/>
+          <w:lang w:bidi="fa-IR"/>
+        </w:rPr>
+      </w:pPr>
+      <w:bookmarkStart w:id="9" w:name="_Toc234084115"/>
+      <w:r>
+        <w:rPr>
+          <w:rtl/>
+        </w:rPr>
+        <w:t>محدودیت‌ها</w:t>
+      </w:r>
+      <w:bookmarkEnd w:id="9"/>
+    </w:p>
+    <w:p>
+      <w:pPr>
+        <w:pStyle w:val="Heading2"/>
+        <w:rPr>
+          <w:sz w:val="36"/>
+          <w:szCs w:val="36"/>
+          <w:rtl/>
+          <w:lang w:bidi="fa-IR"/>
+        </w:rPr>
+      </w:pPr>
+      <w:bookmarkStart w:id="10" w:name="_Toc234084116"/>
+      <w:r>
+        <w:rPr>
+          <w:rtl/>
+        </w:rPr>
+        <w:t>فرضیات</w:t>
+      </w:r>
+      <w:bookmarkEnd w:id="8"/>
+      <w:bookmarkEnd w:id="10"/>
+    </w:p>
+    <w:p>
+      <w:pPr>
         <w:bidi w:val="0"/>
         <w:spacing w:before="0" w:line="240" w:lineRule="auto"/>
         <w:jc w:val="left"/>
@@ -7690,6 +8344,8 @@
       </w:pPr>
       <w:r>
         <w:rPr>
+          <w:sz w:val="36"/>
+          <w:szCs w:val="36"/>
           <w:rtl/>
           <w:lang w:bidi="fa-IR"/>
         </w:rPr>
@@ -7698,101 +8354,7 @@
     </w:p>
     <w:p>
       <w:pPr>
-        <w:pStyle w:val="Heading2"/>
-        <w:rPr>
-          <w:rFonts w:hint="cs"/>
-          <w:rtl/>
-          <w:lang w:bidi="fa-IR"/>
-        </w:rPr>
-      </w:pPr>
-      <w:bookmarkStart w:id="7" w:name="_Hlk233397996"/>
-      <w:bookmarkStart w:id="8" w:name="_Toc234084114"/>
-      <w:r>
-        <w:rPr>
-          <w:rtl/>
-        </w:rPr>
-        <w:lastRenderedPageBreak/>
-        <w:t>دامنه پرو</w:t>
-      </w:r>
-      <w:r>
-        <w:rPr>
-          <w:rFonts w:hint="cs"/>
-          <w:rtl/>
-          <w:lang w:bidi="fa-IR"/>
-        </w:rPr>
-        <w:t>ژه</w:t>
-      </w:r>
-      <w:bookmarkEnd w:id="8"/>
-    </w:p>
-    <w:p>
-      <w:pPr>
-        <w:pStyle w:val="Heading2"/>
-        <w:rPr>
-          <w:rFonts w:hint="cs"/>
-          <w:rtl/>
-          <w:lang w:bidi="fa-IR"/>
-        </w:rPr>
-      </w:pPr>
-      <w:bookmarkStart w:id="9" w:name="_Toc234084115"/>
-      <w:r>
-        <w:rPr>
-          <w:rtl/>
-        </w:rPr>
-        <w:t>محدودیت‌ها</w:t>
-      </w:r>
-      <w:bookmarkEnd w:id="9"/>
-    </w:p>
-    <w:p>
-      <w:pPr>
-        <w:pStyle w:val="Heading2"/>
-        <w:rPr>
-          <w:sz w:val="36"/>
-          <w:szCs w:val="36"/>
-          <w:rtl/>
-          <w:lang w:bidi="fa-IR"/>
-        </w:rPr>
-      </w:pPr>
-      <w:bookmarkStart w:id="10" w:name="_Toc234084116"/>
-      <w:r>
-        <w:rPr>
-          <w:rtl/>
-        </w:rPr>
-        <w:t>فرضیات</w:t>
-      </w:r>
-      <w:bookmarkEnd w:id="7"/>
-      <w:bookmarkEnd w:id="10"/>
-    </w:p>
-    <w:p>
-      <w:pPr>
-        <w:bidi w:val="0"/>
-        <w:spacing w:before="0" w:line="240" w:lineRule="auto"/>
-        <w:jc w:val="left"/>
-        <w:rPr>
-          <w:b/>
-          <w:bCs/>
-          <w:color w:val="00A2FF"/>
-          <w:sz w:val="36"/>
-          <w:szCs w:val="36"/>
-          <w:rtl/>
-          <w:lang w:bidi="fa-IR"/>
-        </w:rPr>
-      </w:pPr>
-      <w:r>
-        <w:rPr>
-          <w:sz w:val="36"/>
-          <w:szCs w:val="36"/>
-          <w:rtl/>
-          <w:lang w:bidi="fa-IR"/>
-        </w:rPr>
-        <w:br w:type="page"/>
-      </w:r>
-    </w:p>
-    <w:p>
-      <w:pPr>
         <w:pStyle w:val="Heading1"/>
-        <w:rPr>
-          <w:rFonts w:hint="cs"/>
-        </w:rPr>
       </w:pPr>
       <w:bookmarkStart w:id="11" w:name="_Toc234084117"/>
       <w:r>
@@ -8782,6 +9344,119 @@
     </w:lvl>
   </w:abstractNum>
   <w:abstractNum w:abstractNumId="1" w15:restartNumberingAfterBreak="0">
+    <w:nsid w:val="03643746"/>
+    <w:multiLevelType w:val="hybridMultilevel"/>
+    <w:tmpl w:val="57BEADC8"/>
+    <w:lvl w:ilvl="0" w:tplc="04090001">
+      <w:start w:val="1"/>
+      <w:numFmt w:val="bullet"/>
+      <w:lvlText w:val=""/>
+      <w:lvlJc w:val="left"/>
+      <w:pPr>
+        <w:ind w:left="720" w:hanging="360"/>
+      </w:pPr>
+      <w:rPr>
+        <w:rFonts w:ascii="Symbol" w:hAnsi="Symbol" w:hint="default"/>
+      </w:rPr>
+    </w:lvl>
+    <w:lvl w:ilvl="1" w:tplc="04090003" w:tentative="1">
+      <w:start w:val="1"/>
+      <w:numFmt w:val="bullet"/>
+      <w:lvlText w:val="o"/>
+      <w:lvlJc w:val="left"/>
+      <w:pPr>
+        <w:ind w:left="1440" w:hanging="360"/>
+      </w:pPr>
+      <w:rPr>
+        <w:rFonts w:ascii="Courier New" w:hAnsi="Courier New" w:cs="Courier New" w:hint="default"/>
+      </w:rPr>
+    </w:lvl>
+    <w:lvl w:ilvl="2" w:tplc="04090005" w:tentative="1">
+      <w:start w:val="1"/>
+      <w:numFmt w:val="bullet"/>
+      <w:lvlText w:val=""/>
+      <w:lvlJc w:val="left"/>
+      <w:pPr>
+        <w:ind w:left="2160" w:hanging="360"/>
+      </w:pPr>
+      <w:rPr>
+        <w:rFonts w:ascii="Wingdings" w:hAnsi="Wingdings" w:hint="default"/>
+      </w:rPr>
+    </w:lvl>
+    <w:lvl w:ilvl="3" w:tplc="04090001" w:tentative="1">
+      <w:start w:val="1"/>
+      <w:numFmt w:val="bullet"/>
+      <w:lvlText w:val=""/>
+      <w:lvlJc w:val="left"/>
+      <w:pPr>
+        <w:ind w:left="2880" w:hanging="360"/>
+      </w:pPr>
+      <w:rPr>
+        <w:rFonts w:ascii="Symbol" w:hAnsi="Symbol" w:hint="default"/>
+      </w:rPr>
+    </w:lvl>
+    <w:lvl w:ilvl="4" w:tplc="04090003" w:tentative="1">
+      <w:start w:val="1"/>
+      <w:numFmt w:val="bullet"/>
+      <w:lvlText w:val="o"/>
+      <w:lvlJc w:val="left"/>
+      <w:pPr>
+        <w:ind w:left="3600" w:hanging="360"/>
+      </w:pPr>
+      <w:rPr>
+        <w:rFonts w:ascii="Courier New" w:hAnsi="Courier New" w:cs="Courier New" w:hint="default"/>
+      </w:rPr>
+    </w:lvl>
+    <w:lvl w:ilvl="5" w:tplc="04090005" w:tentative="1">
+      <w:start w:val="1"/>
+      <w:numFmt w:val="bullet"/>
+      <w:lvlText w:val=""/>
+      <w:lvlJc w:val="left"/>
+      <w:pPr>
+        <w:ind w:left="4320" w:hanging="360"/>
+      </w:pPr>
+      <w:rPr>
+        <w:rFonts w:ascii="Wingdings" w:hAnsi="Wingdings" w:hint="default"/>
+      </w:rPr>
+    </w:lvl>
+    <w:lvl w:ilvl="6" w:tplc="04090001" w:tentative="1">
+      <w:start w:val="1"/>
+      <w:numFmt w:val="bullet"/>
+      <w:lvlText w:val=""/>
+      <w:lvlJc w:val="left"/>
+      <w:pPr>
+        <w:ind w:left="5040" w:hanging="360"/>
+      </w:pPr>
+      <w:rPr>
+        <w:rFonts w:ascii="Symbol" w:hAnsi="Symbol" w:hint="default"/>
+      </w:rPr>
+    </w:lvl>
+    <w:lvl w:ilvl="7" w:tplc="04090003" w:tentative="1">
+      <w:start w:val="1"/>
+      <w:numFmt w:val="bullet"/>
+      <w:lvlText w:val="o"/>
+      <w:lvlJc w:val="left"/>
+      <w:pPr>
+        <w:ind w:left="5760" w:hanging="360"/>
+      </w:pPr>
+      <w:rPr>
+        <w:rFonts w:ascii="Courier New" w:hAnsi="Courier New" w:cs="Courier New" w:hint="default"/>
+      </w:rPr>
+    </w:lvl>
+    <w:lvl w:ilvl="8" w:tplc="04090005" w:tentative="1">
+      <w:start w:val="1"/>
+      <w:numFmt w:val="bullet"/>
+      <w:lvlText w:val=""/>
+      <w:lvlJc w:val="left"/>
+      <w:pPr>
+        <w:ind w:left="6480" w:hanging="360"/>
+      </w:pPr>
+      <w:rPr>
+        <w:rFonts w:ascii="Wingdings" w:hAnsi="Wingdings" w:hint="default"/>
+      </w:rPr>
+    </w:lvl>
+  </w:abstractNum>
+  <w:abstractNum w:abstractNumId="2" w15:restartNumberingAfterBreak="0">
     <w:nsid w:val="04457C31"/>
     <w:multiLevelType w:val="multilevel"/>
     <w:tmpl w:val="838ADB52"/>
@@ -8930,7 +9605,97 @@
       </w:rPr>
     </w:lvl>
   </w:abstractNum>
-  <w:abstractNum w:abstractNumId="2" w15:restartNumberingAfterBreak="0">
+  <w:abstractNum w:abstractNumId="3" w15:restartNumberingAfterBreak="0">
+    <w:nsid w:val="04C352E0"/>
+    <w:multiLevelType w:val="hybridMultilevel"/>
+    <w:tmpl w:val="4642BFE8"/>
+    <w:lvl w:ilvl="0" w:tplc="41F6FBBC">
+      <w:start w:val="1"/>
+      <w:numFmt w:val="decimalFullWidth"/>
+      <w:lvlText w:val="%1."/>
+      <w:lvlJc w:val="left"/>
+      <w:pPr>
+        <w:ind w:left="6323" w:hanging="6323"/>
+      </w:pPr>
+      <w:rPr>
+        <w:rFonts w:hint="default"/>
+        <w:b w:val="0"/>
+      </w:rPr>
+    </w:lvl>
+    <w:lvl w:ilvl="1" w:tplc="04090019" w:tentative="1">
+      <w:start w:val="1"/>
+      <w:numFmt w:val="lowerLetter"/>
+      <w:lvlText w:val="%2."/>
+      <w:lvlJc w:val="left"/>
+      <w:pPr>
+        <w:ind w:left="1440" w:hanging="360"/>
+      </w:pPr>
+    </w:lvl>
+    <w:lvl w:ilvl="2" w:tplc="0409001B" w:tentative="1">
+      <w:start w:val="1"/>
+      <w:numFmt w:val="lowerRoman"/>
+      <w:lvlText w:val="%3."/>
+      <w:lvlJc w:val="right"/>
+      <w:pPr>
+        <w:ind w:left="2160" w:hanging="180"/>
+      </w:pPr>
+    </w:lvl>
+    <w:lvl w:ilvl="3" w:tplc="0409000F" w:tentative="1">
+      <w:start w:val="1"/>
+      <w:numFmt w:val="decimal"/>
+      <w:lvlText w:val="%4."/>
+      <w:lvlJc w:val="left"/>
+      <w:pPr>
+        <w:ind w:left="2880" w:hanging="360"/>
+      </w:pPr>
+    </w:lvl>
+    <w:lvl w:ilvl="4" w:tplc="04090019" w:tentative="1">
+      <w:start w:val="1"/>
+      <w:numFmt w:val="lowerLetter"/>
+      <w:lvlText w:val="%5."/>
+      <w:lvlJc w:val="left"/>
+      <w:pPr>
+        <w:ind w:left="3600" w:hanging="360"/>
+      </w:pPr>
+    </w:lvl>
+    <w:lvl w:ilvl="5" w:tplc="0409001B" w:tentative="1">
+      <w:start w:val="1"/>
+      <w:numFmt w:val="lowerRoman"/>
+      <w:lvlText w:val="%6."/>
+      <w:lvlJc w:val="right"/>
+      <w:pPr>
+        <w:ind w:left="4320" w:hanging="180"/>
+      </w:pPr>
+    </w:lvl>
+    <w:lvl w:ilvl="6" w:tplc="0409000F" w:tentative="1">
+      <w:start w:val="1"/>
+      <w:numFmt w:val="decimal"/>
+      <w:lvlText w:val="%7."/>
+      <w:lvlJc w:val="left"/>
+      <w:pPr>
+        <w:ind w:left="5040" w:hanging="360"/>
+      </w:pPr>
+    </w:lvl>
+    <w:lvl w:ilvl="7" w:tplc="04090019" w:tentative="1">
+      <w:start w:val="1"/>
+      <w:numFmt w:val="lowerLetter"/>
+      <w:lvlText w:val="%8."/>
+      <w:lvlJc w:val="left"/>
+      <w:pPr>
+        <w:ind w:left="5760" w:hanging="360"/>
+      </w:pPr>
+    </w:lvl>
+    <w:lvl w:ilvl="8" w:tplc="0409001B" w:tentative="1">
+      <w:start w:val="1"/>
+      <w:numFmt w:val="lowerRoman"/>
+      <w:lvlText w:val="%9."/>
+      <w:lvlJc w:val="right"/>
+      <w:pPr>
+        <w:ind w:left="6480" w:hanging="180"/>
+      </w:pPr>
+    </w:lvl>
+  </w:abstractNum>
+  <w:abstractNum w:abstractNumId="4" w15:restartNumberingAfterBreak="0">
     <w:nsid w:val="141A6D34"/>
     <w:multiLevelType w:val="multilevel"/>
     <w:tmpl w:val="4456F7F8"/>
@@ -9079,7 +9844,7 @@
       </w:rPr>
     </w:lvl>
   </w:abstractNum>
-  <w:abstractNum w:abstractNumId="3" w15:restartNumberingAfterBreak="0">
+  <w:abstractNum w:abstractNumId="5" w15:restartNumberingAfterBreak="0">
     <w:nsid w:val="19D82638"/>
     <w:multiLevelType w:val="multilevel"/>
     <w:tmpl w:val="F976E962"/>
@@ -9228,7 +9993,7 @@
       </w:rPr>
     </w:lvl>
   </w:abstractNum>
-  <w:abstractNum w:abstractNumId="4" w15:restartNumberingAfterBreak="0">
+  <w:abstractNum w:abstractNumId="6" w15:restartNumberingAfterBreak="0">
     <w:nsid w:val="2A5E205D"/>
     <w:multiLevelType w:val="multilevel"/>
     <w:tmpl w:val="A0AEBD20"/>
@@ -9377,7 +10142,7 @@
       </w:rPr>
     </w:lvl>
   </w:abstractNum>
-  <w:abstractNum w:abstractNumId="5" w15:restartNumberingAfterBreak="0">
+  <w:abstractNum w:abstractNumId="7" w15:restartNumberingAfterBreak="0">
     <w:nsid w:val="3E0741F7"/>
     <w:multiLevelType w:val="multilevel"/>
     <w:tmpl w:val="CA0E1FC6"/>
@@ -9526,7 +10291,7 @@
       </w:rPr>
     </w:lvl>
   </w:abstractNum>
-  <w:abstractNum w:abstractNumId="6" w15:restartNumberingAfterBreak="0">
+  <w:abstractNum w:abstractNumId="8" w15:restartNumberingAfterBreak="0">
     <w:nsid w:val="46114CC5"/>
     <w:multiLevelType w:val="multilevel"/>
     <w:tmpl w:val="E1A2AA1A"/>
@@ -9675,7 +10440,7 @@
       </w:rPr>
     </w:lvl>
   </w:abstractNum>
-  <w:abstractNum w:abstractNumId="7" w15:restartNumberingAfterBreak="0">
+  <w:abstractNum w:abstractNumId="9" w15:restartNumberingAfterBreak="0">
     <w:nsid w:val="4A770660"/>
     <w:multiLevelType w:val="multilevel"/>
     <w:tmpl w:val="5C42B72E"/>
@@ -9824,7 +10589,7 @@
       </w:rPr>
     </w:lvl>
   </w:abstractNum>
-  <w:abstractNum w:abstractNumId="8" w15:restartNumberingAfterBreak="0">
+  <w:abstractNum w:abstractNumId="10" w15:restartNumberingAfterBreak="0">
     <w:nsid w:val="4D684A34"/>
     <w:multiLevelType w:val="multilevel"/>
     <w:tmpl w:val="F946A88C"/>
@@ -9973,7 +10738,7 @@
       </w:rPr>
     </w:lvl>
   </w:abstractNum>
-  <w:abstractNum w:abstractNumId="9" w15:restartNumberingAfterBreak="0">
+  <w:abstractNum w:abstractNumId="11" w15:restartNumberingAfterBreak="0">
     <w:nsid w:val="4DE63528"/>
     <w:multiLevelType w:val="multilevel"/>
     <w:tmpl w:val="1C86A6C4"/>
@@ -10122,7 +10887,97 @@
       </w:rPr>
     </w:lvl>
   </w:abstractNum>
-  <w:abstractNum w:abstractNumId="10" w15:restartNumberingAfterBreak="0">
+  <w:abstractNum w:abstractNumId="12" w15:restartNumberingAfterBreak="0">
+    <w:nsid w:val="4E4042AD"/>
+    <w:multiLevelType w:val="hybridMultilevel"/>
+    <w:tmpl w:val="124661F6"/>
+    <w:lvl w:ilvl="0" w:tplc="41F6FBBC">
+      <w:start w:val="1"/>
+      <w:numFmt w:val="decimalFullWidth"/>
+      <w:lvlText w:val="%1."/>
+      <w:lvlJc w:val="left"/>
+      <w:pPr>
+        <w:ind w:left="6323" w:hanging="6323"/>
+      </w:pPr>
+      <w:rPr>
+        <w:rFonts w:hint="default"/>
+        <w:b w:val="0"/>
+      </w:rPr>
+    </w:lvl>
+    <w:lvl w:ilvl="1" w:tplc="04090019" w:tentative="1">
+      <w:start w:val="1"/>
+      <w:numFmt w:val="lowerLetter"/>
+      <w:lvlText w:val="%2."/>
+      <w:lvlJc w:val="left"/>
+      <w:pPr>
+        <w:ind w:left="1080" w:hanging="360"/>
+      </w:pPr>
+    </w:lvl>
+    <w:lvl w:ilvl="2" w:tplc="0409001B" w:tentative="1">
+      <w:start w:val="1"/>
+      <w:numFmt w:val="lowerRoman"/>
+      <w:lvlText w:val="%3."/>
+      <w:lvlJc w:val="right"/>
+      <w:pPr>
+        <w:ind w:left="1800" w:hanging="180"/>
+      </w:pPr>
+    </w:lvl>
+    <w:lvl w:ilvl="3" w:tplc="0409000F" w:tentative="1">
+      <w:start w:val="1"/>
+      <w:numFmt w:val="decimal"/>
+      <w:lvlText w:val="%4."/>
+      <w:lvlJc w:val="left"/>
+      <w:pPr>
+        <w:ind w:left="2520" w:hanging="360"/>
+      </w:pPr>
+    </w:lvl>
+    <w:lvl w:ilvl="4" w:tplc="04090019" w:tentative="1">
+      <w:start w:val="1"/>
+      <w:numFmt w:val="lowerLetter"/>
+      <w:lvlText w:val="%5."/>
+      <w:lvlJc w:val="left"/>
+      <w:pPr>
+        <w:ind w:left="3240" w:hanging="360"/>
+      </w:pPr>
+    </w:lvl>
+    <w:lvl w:ilvl="5" w:tplc="0409001B" w:tentative="1">
+      <w:start w:val="1"/>
+      <w:numFmt w:val="lowerRoman"/>
+      <w:lvlText w:val="%6."/>
+      <w:lvlJc w:val="right"/>
+      <w:pPr>
+        <w:ind w:left="3960" w:hanging="180"/>
+      </w:pPr>
+    </w:lvl>
+    <w:lvl w:ilvl="6" w:tplc="0409000F" w:tentative="1">
+      <w:start w:val="1"/>
+      <w:numFmt w:val="decimal"/>
+      <w:lvlText w:val="%7."/>
+      <w:lvlJc w:val="left"/>
+      <w:pPr>
+        <w:ind w:left="4680" w:hanging="360"/>
+      </w:pPr>
+    </w:lvl>
+    <w:lvl w:ilvl="7" w:tplc="04090019" w:tentative="1">
+      <w:start w:val="1"/>
+      <w:numFmt w:val="lowerLetter"/>
+      <w:lvlText w:val="%8."/>
+      <w:lvlJc w:val="left"/>
+      <w:pPr>
+        <w:ind w:left="5400" w:hanging="360"/>
+      </w:pPr>
+    </w:lvl>
+    <w:lvl w:ilvl="8" w:tplc="0409001B" w:tentative="1">
+      <w:start w:val="1"/>
+      <w:numFmt w:val="lowerRoman"/>
+      <w:lvlText w:val="%9."/>
+      <w:lvlJc w:val="right"/>
+      <w:pPr>
+        <w:ind w:left="6120" w:hanging="180"/>
+      </w:pPr>
+    </w:lvl>
+  </w:abstractNum>
+  <w:abstractNum w:abstractNumId="13" w15:restartNumberingAfterBreak="0">
     <w:nsid w:val="5061530E"/>
     <w:multiLevelType w:val="hybridMultilevel"/>
     <w:tmpl w:val="A886C950"/>
@@ -10211,7 +11066,7 @@
       </w:pPr>
     </w:lvl>
   </w:abstractNum>
-  <w:abstractNum w:abstractNumId="11" w15:restartNumberingAfterBreak="0">
+  <w:abstractNum w:abstractNumId="14" w15:restartNumberingAfterBreak="0">
     <w:nsid w:val="58A4521E"/>
     <w:multiLevelType w:val="hybridMultilevel"/>
     <w:tmpl w:val="4190B3C0"/>
@@ -10324,7 +11179,7 @@
       </w:rPr>
     </w:lvl>
   </w:abstractNum>
-  <w:abstractNum w:abstractNumId="12" w15:restartNumberingAfterBreak="0">
+  <w:abstractNum w:abstractNumId="15" w15:restartNumberingAfterBreak="0">
     <w:nsid w:val="5A291053"/>
     <w:multiLevelType w:val="hybridMultilevel"/>
     <w:tmpl w:val="EBBE9508"/>
@@ -10410,7 +11265,7 @@
       </w:pPr>
     </w:lvl>
   </w:abstractNum>
-  <w:abstractNum w:abstractNumId="13" w15:restartNumberingAfterBreak="0">
+  <w:abstractNum w:abstractNumId="16" w15:restartNumberingAfterBreak="0">
     <w:nsid w:val="5C73715F"/>
     <w:multiLevelType w:val="multilevel"/>
     <w:tmpl w:val="1AB28810"/>
@@ -10559,7 +11414,99 @@
       </w:rPr>
     </w:lvl>
   </w:abstractNum>
-  <w:abstractNum w:abstractNumId="14" w15:restartNumberingAfterBreak="0">
+  <w:abstractNum w:abstractNumId="17" w15:restartNumberingAfterBreak="0">
+    <w:nsid w:val="5CA440D5"/>
+    <w:multiLevelType w:val="hybridMultilevel"/>
+    <w:tmpl w:val="C5F4CE26"/>
+    <w:lvl w:ilvl="0" w:tplc="3462DDD8">
+      <w:start w:val="1"/>
+      <w:numFmt w:val="decimal"/>
+      <w:lvlText w:val="%1."/>
+      <w:lvlJc w:val="left"/>
+      <w:pPr>
+        <w:ind w:left="720" w:hanging="360"/>
+      </w:pPr>
+      <w:rPr>
+        <w:b w:val="0"/>
+        <w:color w:val="000000"/>
+        <w:sz w:val="24"/>
+        <w:szCs w:val="24"/>
+      </w:rPr>
+    </w:lvl>
+    <w:lvl w:ilvl="1" w:tplc="04090019">
+      <w:start w:val="1"/>
+      <w:numFmt w:val="lowerLetter"/>
+      <w:lvlText w:val="%2."/>
+      <w:lvlJc w:val="left"/>
+      <w:pPr>
+        <w:ind w:left="1440" w:hanging="360"/>
+      </w:pPr>
+    </w:lvl>
+    <w:lvl w:ilvl="2" w:tplc="0409001B">
+      <w:start w:val="1"/>
+      <w:numFmt w:val="lowerRoman"/>
+      <w:lvlText w:val="%3."/>
+      <w:lvlJc w:val="right"/>
+      <w:pPr>
+        <w:ind w:left="2160" w:hanging="180"/>
+      </w:pPr>
+    </w:lvl>
+    <w:lvl w:ilvl="3" w:tplc="0409000F">
+      <w:start w:val="1"/>
+      <w:numFmt w:val="decimal"/>
+      <w:lvlText w:val="%4."/>
+      <w:lvlJc w:val="left"/>
+      <w:pPr>
+        <w:ind w:left="2880" w:hanging="360"/>
+      </w:pPr>
+    </w:lvl>
+    <w:lvl w:ilvl="4" w:tplc="04090019">
+      <w:start w:val="1"/>
+      <w:numFmt w:val="lowerLetter"/>
+      <w:lvlText w:val="%5."/>
+      <w:lvlJc w:val="left"/>
+      <w:pPr>
+        <w:ind w:left="3600" w:hanging="360"/>
+      </w:pPr>
+    </w:lvl>
+    <w:lvl w:ilvl="5" w:tplc="0409001B">
+      <w:start w:val="1"/>
+      <w:numFmt w:val="lowerRoman"/>
+      <w:lvlText w:val="%6."/>
+      <w:lvlJc w:val="right"/>
+      <w:pPr>
+        <w:ind w:left="4320" w:hanging="180"/>
+      </w:pPr>
+    </w:lvl>
+    <w:lvl w:ilvl="6" w:tplc="0409000F">
+      <w:start w:val="1"/>
+      <w:numFmt w:val="decimal"/>
+      <w:lvlText w:val="%7."/>
+      <w:lvlJc w:val="left"/>
+      <w:pPr>
+        <w:ind w:left="5040" w:hanging="360"/>
+      </w:pPr>
+    </w:lvl>
+    <w:lvl w:ilvl="7" w:tplc="04090019">
+      <w:start w:val="1"/>
+      <w:numFmt w:val="lowerLetter"/>
+      <w:lvlText w:val="%8."/>
+      <w:lvlJc w:val="left"/>
+      <w:pPr>
+        <w:ind w:left="5760" w:hanging="360"/>
+      </w:pPr>
+    </w:lvl>
+    <w:lvl w:ilvl="8" w:tplc="0409001B">
+      <w:start w:val="1"/>
+      <w:numFmt w:val="lowerRoman"/>
+      <w:lvlText w:val="%9."/>
+      <w:lvlJc w:val="right"/>
+      <w:pPr>
+        <w:ind w:left="6480" w:hanging="180"/>
+      </w:pPr>
+    </w:lvl>
+  </w:abstractNum>
+  <w:abstractNum w:abstractNumId="18" w15:restartNumberingAfterBreak="0">
     <w:nsid w:val="67556A68"/>
     <w:multiLevelType w:val="hybridMultilevel"/>
     <w:tmpl w:val="EFD8CECE"/>
@@ -10672,7 +11619,97 @@
       </w:rPr>
     </w:lvl>
   </w:abstractNum>
-  <w:abstractNum w:abstractNumId="15" w15:restartNumberingAfterBreak="0">
+  <w:abstractNum w:abstractNumId="19" w15:restartNumberingAfterBreak="0">
+    <w:nsid w:val="6B142C73"/>
+    <w:multiLevelType w:val="hybridMultilevel"/>
+    <w:tmpl w:val="060A16D8"/>
+    <w:lvl w:ilvl="0" w:tplc="41F6FBBC">
+      <w:start w:val="1"/>
+      <w:numFmt w:val="decimalFullWidth"/>
+      <w:lvlText w:val="%1."/>
+      <w:lvlJc w:val="left"/>
+      <w:pPr>
+        <w:ind w:left="6323" w:hanging="6323"/>
+      </w:pPr>
+      <w:rPr>
+        <w:rFonts w:hint="default"/>
+        <w:b w:val="0"/>
+      </w:rPr>
+    </w:lvl>
+    <w:lvl w:ilvl="1" w:tplc="04090019" w:tentative="1">
+      <w:start w:val="1"/>
+      <w:numFmt w:val="lowerLetter"/>
+      <w:lvlText w:val="%2."/>
+      <w:lvlJc w:val="left"/>
+      <w:pPr>
+        <w:ind w:left="1440" w:hanging="360"/>
+      </w:pPr>
+    </w:lvl>
+    <w:lvl w:ilvl="2" w:tplc="0409001B" w:tentative="1">
+      <w:start w:val="1"/>
+      <w:numFmt w:val="lowerRoman"/>
+      <w:lvlText w:val="%3."/>
+      <w:lvlJc w:val="right"/>
+      <w:pPr>
+        <w:ind w:left="2160" w:hanging="180"/>
+      </w:pPr>
+    </w:lvl>
+    <w:lvl w:ilvl="3" w:tplc="0409000F" w:tentative="1">
+      <w:start w:val="1"/>
+      <w:numFmt w:val="decimal"/>
+      <w:lvlText w:val="%4."/>
+      <w:lvlJc w:val="left"/>
+      <w:pPr>
+        <w:ind w:left="2880" w:hanging="360"/>
+      </w:pPr>
+    </w:lvl>
+    <w:lvl w:ilvl="4" w:tplc="04090019" w:tentative="1">
+      <w:start w:val="1"/>
+      <w:numFmt w:val="lowerLetter"/>
+      <w:lvlText w:val="%5."/>
+      <w:lvlJc w:val="left"/>
+      <w:pPr>
+        <w:ind w:left="3600" w:hanging="360"/>
+      </w:pPr>
+    </w:lvl>
+    <w:lvl w:ilvl="5" w:tplc="0409001B" w:tentative="1">
+      <w:start w:val="1"/>
+      <w:numFmt w:val="lowerRoman"/>
+      <w:lvlText w:val="%6."/>
+      <w:lvlJc w:val="right"/>
+      <w:pPr>
+        <w:ind w:left="4320" w:hanging="180"/>
+      </w:pPr>
+    </w:lvl>
+    <w:lvl w:ilvl="6" w:tplc="0409000F" w:tentative="1">
+      <w:start w:val="1"/>
+      <w:numFmt w:val="decimal"/>
+      <w:lvlText w:val="%7."/>
+      <w:lvlJc w:val="left"/>
+      <w:pPr>
+        <w:ind w:left="5040" w:hanging="360"/>
+      </w:pPr>
+    </w:lvl>
+    <w:lvl w:ilvl="7" w:tplc="04090019" w:tentative="1">
+      <w:start w:val="1"/>
+      <w:numFmt w:val="lowerLetter"/>
+      <w:lvlText w:val="%8."/>
+      <w:lvlJc w:val="left"/>
+      <w:pPr>
+        <w:ind w:left="5760" w:hanging="360"/>
+      </w:pPr>
+    </w:lvl>
+    <w:lvl w:ilvl="8" w:tplc="0409001B" w:tentative="1">
+      <w:start w:val="1"/>
+      <w:numFmt w:val="lowerRoman"/>
+      <w:lvlText w:val="%9."/>
+      <w:lvlJc w:val="right"/>
+      <w:pPr>
+        <w:ind w:left="6480" w:hanging="180"/>
+      </w:pPr>
+    </w:lvl>
+  </w:abstractNum>
+  <w:abstractNum w:abstractNumId="20" w15:restartNumberingAfterBreak="0">
     <w:nsid w:val="79ED38D8"/>
     <w:multiLevelType w:val="hybridMultilevel"/>
     <w:tmpl w:val="06ECFAAC"/>
@@ -10758,7 +11795,7 @@
       </w:pPr>
     </w:lvl>
   </w:abstractNum>
-  <w:abstractNum w:abstractNumId="16" w15:restartNumberingAfterBreak="0">
+  <w:abstractNum w:abstractNumId="21" w15:restartNumberingAfterBreak="0">
     <w:nsid w:val="7ADD48EB"/>
     <w:multiLevelType w:val="multilevel"/>
     <w:tmpl w:val="54DE42C8"/>
@@ -10908,55 +11945,97 @@
     </w:lvl>
   </w:abstractNum>
   <w:num w:numId="1" w16cid:durableId="580529723">
+    <w:abstractNumId w:val="14"/>
+  </w:num>
+  <w:num w:numId="2" w16cid:durableId="1103454760">
+    <w:abstractNumId w:val="15"/>
+  </w:num>
+  <w:num w:numId="3" w16cid:durableId="988897025">
+    <w:abstractNumId w:val="20"/>
+  </w:num>
+  <w:num w:numId="4" w16cid:durableId="241794348">
+    <w:abstractNumId w:val="18"/>
+  </w:num>
+  <w:num w:numId="5" w16cid:durableId="761492297">
+    <w:abstractNumId w:val="13"/>
+  </w:num>
+  <w:num w:numId="6" w16cid:durableId="961813102">
+    <w:abstractNumId w:val="2"/>
+  </w:num>
+  <w:num w:numId="7" w16cid:durableId="396629680">
     <w:abstractNumId w:val="11"/>
   </w:num>
-  <w:num w:numId="2" w16cid:durableId="1103454760">
-    <w:abstractNumId w:val="12"/>
+  <w:num w:numId="8" w16cid:durableId="185141817">
+    <w:abstractNumId w:val="9"/>
   </w:num>
-  <w:num w:numId="3" w16cid:durableId="988897025">
-    <w:abstractNumId w:val="15"/>
-  </w:num>
-  <w:num w:numId="4" w16cid:durableId="241794348">
-    <w:abstractNumId w:val="14"/>
-  </w:num>
-  <w:num w:numId="5" w16cid:durableId="761492297">
+  <w:num w:numId="9" w16cid:durableId="1398824409">
     <w:abstractNumId w:val="10"/>
   </w:num>
-  <w:num w:numId="6" w16cid:durableId="961813102">
-    <w:abstractNumId w:val="1"/>
+  <w:num w:numId="10" w16cid:durableId="267391491">
+    <w:abstractNumId w:val="8"/>
   </w:num>
-  <w:num w:numId="7" w16cid:durableId="396629680">
-    <w:abstractNumId w:val="9"/>
+  <w:num w:numId="11" w16cid:durableId="413861032">
+    <w:abstractNumId w:val="16"/>
   </w:num>
-  <w:num w:numId="8" w16cid:durableId="185141817">
+  <w:num w:numId="12" w16cid:durableId="771164075">
     <w:abstractNumId w:val="7"/>
   </w:num>
-  <w:num w:numId="9" w16cid:durableId="1398824409">
-    <w:abstractNumId w:val="8"/>
+  <w:num w:numId="13" w16cid:durableId="2064676568">
+    <w:abstractNumId w:val="5"/>
   </w:num>
-  <w:num w:numId="10" w16cid:durableId="267391491">
+  <w:num w:numId="14" w16cid:durableId="376323722">
     <w:abstractNumId w:val="6"/>
   </w:num>
-  <w:num w:numId="11" w16cid:durableId="413861032">
-    <w:abstractNumId w:val="13"/>
-  </w:num>
-  <w:num w:numId="12" w16cid:durableId="771164075">
-    <w:abstractNumId w:val="5"/>
-  </w:num>
-  <w:num w:numId="13" w16cid:durableId="2064676568">
-    <w:abstractNumId w:val="3"/>
-  </w:num>
-  <w:num w:numId="14" w16cid:durableId="376323722">
-    <w:abstractNumId w:val="4"/>
-  </w:num>
   <w:num w:numId="15" w16cid:durableId="1065252378">
-    <w:abstractNumId w:val="16"/>
+    <w:abstractNumId w:val="21"/>
   </w:num>
   <w:num w:numId="16" w16cid:durableId="1041245015">
     <w:abstractNumId w:val="0"/>
   </w:num>
   <w:num w:numId="17" w16cid:durableId="1436943922">
-    <w:abstractNumId w:val="2"/>
+    <w:abstractNumId w:val="4"/>
+  </w:num>
+  <w:num w:numId="18" w16cid:durableId="1019889030">
+    <w:abstractNumId w:val="17"/>
+    <w:lvlOverride w:ilvl="0">
+      <w:startOverride w:val="1"/>
+    </w:lvlOverride>
+    <w:lvlOverride w:ilvl="1">
+      <w:startOverride w:val="1"/>
+    </w:lvlOverride>
+    <w:lvlOverride w:ilvl="2">
+      <w:startOverride w:val="1"/>
+    </w:lvlOverride>
+    <w:lvlOverride w:ilvl="3">
+      <w:startOverride w:val="1"/>
+    </w:lvlOverride>
+    <w:lvlOverride w:ilvl="4">
+      <w:startOverride w:val="1"/>
+    </w:lvlOverride>
+    <w:lvlOverride w:ilvl="5">
+      <w:startOverride w:val="1"/>
+    </w:lvlOverride>
+    <w:lvlOverride w:ilvl="6">
+      <w:startOverride w:val="1"/>
+    </w:lvlOverride>
+    <w:lvlOverride w:ilvl="7">
+      <w:startOverride w:val="1"/>
+    </w:lvlOverride>
+    <w:lvlOverride w:ilvl="8">
+      <w:startOverride w:val="1"/>
+    </w:lvlOverride>
+  </w:num>
+  <w:num w:numId="19" w16cid:durableId="801119751">
+    <w:abstractNumId w:val="12"/>
+  </w:num>
+  <w:num w:numId="20" w16cid:durableId="1832600420">
+    <w:abstractNumId w:val="3"/>
+  </w:num>
+  <w:num w:numId="21" w16cid:durableId="214969792">
+    <w:abstractNumId w:val="19"/>
+  </w:num>
+  <w:num w:numId="22" w16cid:durableId="617025433">
+    <w:abstractNumId w:val="1"/>
   </w:num>
 </w:numbering>
 </file>

</xml_diff>

<commit_message>
add problems to system proposal
</commit_message>
<xml_diff>
--- a/Documentation/Analysis/System Proposal/System proposal.docx
+++ b/Documentation/Analysis/System Proposal/System proposal.docx
@@ -1,6 +1,6 @@
 
 <file path=word/document.xml><?xml version="1.0" encoding="utf-8"?>
-<w:document xmlns:wpc="http://schemas.microsoft.com/office/word/2010/wordprocessingCanvas" xmlns:cx="http://schemas.microsoft.com/office/drawing/2014/chartex" xmlns:cx1="http://schemas.microsoft.com/office/drawing/2015/9/8/chartex" xmlns:cx2="http://schemas.microsoft.com/office/drawing/2015/10/21/chartex" xmlns:cx3="http://schemas.microsoft.com/office/drawing/2016/5/9/chartex" xmlns:cx4="http://schemas.microsoft.com/office/drawing/2016/5/10/chartex" xmlns:cx5="http://schemas.microsoft.com/office/drawing/2016/5/11/chartex" xmlns:cx6="http://schemas.microsoft.com/office/drawing/2016/5/12/chartex" xmlns:cx7="http://schemas.microsoft.com/office/drawing/2016/5/13/chartex" xmlns:cx8="http://schemas.microsoft.com/office/drawing/2016/5/14/chartex" xmlns:mc="http://schemas.openxmlformats.org/markup-compatibility/2006" xmlns:m="http://schemas.openxmlformats.org/officeDocument/2006/math" xmlns:aink="http://schemas.microsoft.com/office/drawing/2016/ink" xmlns:am3d="http://schemas.microsoft.com/office/drawing/2017/model3d" xmlns:oel="http://schemas.microsoft.com/office/2019/extlst" xmlns:r="http://schemas.openxmlformats.org/officeDocument/2006/relationships" xmlns:wp14="http://schemas.microsoft.com/office/word/2010/wordprocessingDrawing" xmlns:wp="http://schemas.openxmlformats.org/drawingml/2006/wordprocessingDrawing" xmlns:wpg="http://schemas.microsoft.com/office/word/2010/wordprocessingGroup" xmlns:wpi="http://schemas.microsoft.com/office/word/2010/wordprocessingInk" xmlns:wps="http://schemas.microsoft.com/office/word/2010/wordprocessingShape" xmlns:o="urn:schemas-microsoft-com:office:office" xmlns:v="urn:schemas-microsoft-com:vml" xmlns:w10="urn:schemas-microsoft-com:office:word" xmlns:w="http://schemas.openxmlformats.org/wordprocessingml/2006/main" xmlns:w14="http://schemas.microsoft.com/office/word/2010/wordml" xmlns:w15="http://schemas.microsoft.com/office/word/2012/wordml" xmlns:w16cex="http://schemas.microsoft.com/office/word/2018/wordml/cex" xmlns:w16cid="http://schemas.microsoft.com/office/word/2016/wordml/cid" xmlns:w16="http://schemas.microsoft.com/office/word/2018/wordml" xmlns:w16sdtdh="http://schemas.microsoft.com/office/word/2020/wordml/sdtdatahash" xmlns:w16sdtfl="http://schemas.microsoft.com/office/word/2024/wordml/sdtformatlock" xmlns:w16se="http://schemas.microsoft.com/office/word/2015/wordml/symex" xmlns:w16du="http://schemas.microsoft.com/office/word/2023/wordml/word16du" xmlns:wne="http://schemas.microsoft.com/office/word/2006/wordml" mc:Ignorable="w14 w15 w16se w16cid w16 w16cex w16sdtdh w16sdtfl w16du wp14">
+<w:document xmlns:wpc="http://schemas.microsoft.com/office/word/2010/wordprocessingCanvas" xmlns:cx="http://schemas.microsoft.com/office/drawing/2014/chartex" xmlns:cx1="http://schemas.microsoft.com/office/drawing/2015/9/8/chartex" xmlns:cx2="http://schemas.microsoft.com/office/drawing/2015/10/21/chartex" xmlns:cx3="http://schemas.microsoft.com/office/drawing/2016/5/9/chartex" xmlns:cx4="http://schemas.microsoft.com/office/drawing/2016/5/10/chartex" xmlns:cx5="http://schemas.microsoft.com/office/drawing/2016/5/11/chartex" xmlns:cx6="http://schemas.microsoft.com/office/drawing/2016/5/12/chartex" xmlns:cx7="http://schemas.microsoft.com/office/drawing/2016/5/13/chartex" xmlns:cx8="http://schemas.microsoft.com/office/drawing/2016/5/14/chartex" xmlns:mc="http://schemas.openxmlformats.org/markup-compatibility/2006" xmlns:aink="http://schemas.microsoft.com/office/drawing/2016/ink" xmlns:am3d="http://schemas.microsoft.com/office/drawing/2017/model3d" xmlns:o="urn:schemas-microsoft-com:office:office" xmlns:oel="http://schemas.microsoft.com/office/2019/extlst" xmlns:r="http://schemas.openxmlformats.org/officeDocument/2006/relationships" xmlns:m="http://schemas.openxmlformats.org/officeDocument/2006/math" xmlns:v="urn:schemas-microsoft-com:vml" xmlns:wp14="http://schemas.microsoft.com/office/word/2010/wordprocessingDrawing" xmlns:wp="http://schemas.openxmlformats.org/drawingml/2006/wordprocessingDrawing" xmlns:w10="urn:schemas-microsoft-com:office:word" xmlns:w="http://schemas.openxmlformats.org/wordprocessingml/2006/main" xmlns:w14="http://schemas.microsoft.com/office/word/2010/wordml" xmlns:w15="http://schemas.microsoft.com/office/word/2012/wordml" xmlns:w16cex="http://schemas.microsoft.com/office/word/2018/wordml/cex" xmlns:w16cid="http://schemas.microsoft.com/office/word/2016/wordml/cid" xmlns:w16="http://schemas.microsoft.com/office/word/2018/wordml" xmlns:w16sdtdh="http://schemas.microsoft.com/office/word/2020/wordml/sdtdatahash" xmlns:w16se="http://schemas.microsoft.com/office/word/2015/wordml/symex" xmlns:wpg="http://schemas.microsoft.com/office/word/2010/wordprocessingGroup" xmlns:wpi="http://schemas.microsoft.com/office/word/2010/wordprocessingInk" xmlns:wne="http://schemas.microsoft.com/office/word/2006/wordml" xmlns:wps="http://schemas.microsoft.com/office/word/2010/wordprocessingShape" mc:Ignorable="w14 w15 w16se w16cid w16 w16cex w16sdtdh wp14">
   <w:body>
     <w:p>
       <w:pPr>
@@ -13,11 +13,41 @@
       </w:pPr>
       <w:r>
         <w:rPr>
+          <w:lang w:bidi="fa-IR"/>
+        </w:rPr>
+        <w:t xml:space="preserve">This is a </w:t>
+      </w:r>
+      <w:proofErr w:type="gramStart"/>
+      <w:r>
+        <w:rPr>
+          <w:lang w:bidi="fa-IR"/>
+        </w:rPr>
+        <w:t>test</w:t>
+      </w:r>
+      <w:r>
+        <w:rPr>
           <w:rFonts w:hint="cs"/>
           <w:rtl/>
           <w:lang w:bidi="fa-IR"/>
         </w:rPr>
-        <w:t>{صفحه به نام خدا}</w:t>
+        <w:t>{</w:t>
+      </w:r>
+      <w:proofErr w:type="gramEnd"/>
+      <w:r>
+        <w:rPr>
+          <w:rFonts w:hint="cs"/>
+          <w:rtl/>
+          <w:lang w:bidi="fa-IR"/>
+        </w:rPr>
+        <w:t>صفحه به نام خدا}</w:t>
+      </w:r>
+      <w:r>
+        <w:rPr>
+          <w:rFonts w:hint="cs"/>
+          <w:rtl/>
+          <w:lang w:bidi="fa-IR"/>
+        </w:rPr>
+        <w:t xml:space="preserve"> </w:t>
       </w:r>
       <w:r>
         <w:rPr>
@@ -6756,9 +6786,6 @@
     <w:p>
       <w:pPr>
         <w:pStyle w:val="Heading2"/>
-        <w:rPr>
-          <w:rtl/>
-        </w:rPr>
       </w:pPr>
       <w:bookmarkStart w:id="2" w:name="_Toc234084109"/>
       <w:r>
@@ -6775,6 +6802,22 @@
         <w:t>ر</w:t>
       </w:r>
       <w:bookmarkEnd w:id="2"/>
+    </w:p>
+    <w:p>
+      <w:pPr>
+        <w:rPr>
+          <w:rFonts w:hint="cs"/>
+          <w:lang w:bidi="fa-IR"/>
+        </w:rPr>
+      </w:pPr>
+      <w:r>
+        <w:rPr>
+          <w:rFonts w:hint="cs"/>
+          <w:rtl/>
+          <w:lang w:bidi="fa-IR"/>
+        </w:rPr>
+        <w:t xml:space="preserve">سامانه رزروسنتر یک سیستم مبتنی بر وب است که هدف آن کاهش فاصله بین </w:t>
+      </w:r>
     </w:p>
     <w:p>
       <w:pPr>
@@ -8893,33 +8936,191 @@
     </w:p>
     <w:p>
       <w:pPr>
+        <w:bidi w:val="0"/>
+        <w:spacing w:before="0" w:line="240" w:lineRule="auto"/>
+        <w:jc w:val="left"/>
+        <w:rPr>
+          <w:b/>
+          <w:bCs/>
+          <w:color w:val="00A2FF"/>
+          <w:sz w:val="32"/>
+          <w:szCs w:val="32"/>
+          <w:rtl/>
+        </w:rPr>
+      </w:pPr>
+      <w:bookmarkStart w:id="41" w:name="_Toc234084147"/>
+      <w:r>
+        <w:rPr>
+          <w:rtl/>
+        </w:rPr>
+        <w:br w:type="page"/>
+      </w:r>
+    </w:p>
+    <w:p>
+      <w:pPr>
         <w:pStyle w:val="Heading2"/>
         <w:rPr>
-          <w:lang w:bidi="fa-IR"/>
-        </w:rPr>
-      </w:pPr>
-      <w:bookmarkStart w:id="41" w:name="_Toc234084147"/>
-      <w:r>
-        <w:rPr>
-          <w:rtl/>
-        </w:rPr>
+          <w:rtl/>
+        </w:rPr>
+      </w:pPr>
+      <w:r>
+        <w:rPr>
+          <w:rtl/>
+        </w:rPr>
+        <w:lastRenderedPageBreak/>
         <w:t>مشکلات پروژه</w:t>
       </w:r>
       <w:bookmarkEnd w:id="41"/>
     </w:p>
     <w:p>
       <w:pPr>
+        <w:pStyle w:val="ListParagraph"/>
+        <w:numPr>
+          <w:ilvl w:val="0"/>
+          <w:numId w:val="22"/>
+        </w:numPr>
+        <w:rPr>
+          <w:lang w:bidi="fa-IR"/>
+        </w:rPr>
+      </w:pPr>
+      <w:r>
+        <w:rPr>
+          <w:rFonts w:hint="cs"/>
+          <w:rtl/>
+          <w:lang w:bidi="fa-IR"/>
+        </w:rPr>
+        <w:t>مدیر و پشتیبان یک کسب‌وکار میتوانند در قسمت «ثبت کارمند» در صفحه «لیست کارمندان»، با وارد کردن هر شماره ثبت شده در سیستم، بدون تایید صاحب شماره، او را به لیست کارمندان خود اضافه کرده و نام و نام خانوادگی صاحب حساب کاربری را مشاهده کنند. این مشکل با فرستاد</w:t>
+      </w:r>
+      <w:r>
+        <w:rPr>
+          <w:rFonts w:hint="cs"/>
+          <w:rtl/>
+          <w:lang w:bidi="fa-IR"/>
+        </w:rPr>
+        <w:t>ن</w:t>
+      </w:r>
+      <w:r>
+        <w:rPr>
+          <w:rFonts w:hint="cs"/>
+          <w:rtl/>
+          <w:lang w:bidi="fa-IR"/>
+        </w:rPr>
+        <w:t xml:space="preserve"> </w:t>
+      </w:r>
+      <w:r>
+        <w:rPr>
+          <w:rFonts w:hint="cs"/>
+          <w:rtl/>
+          <w:lang w:bidi="fa-IR"/>
+        </w:rPr>
+        <w:t>پیامک حاوی لینک تایید</w:t>
+      </w:r>
+      <w:r>
+        <w:rPr>
+          <w:rFonts w:hint="cs"/>
+          <w:rtl/>
+          <w:lang w:bidi="fa-IR"/>
+        </w:rPr>
+        <w:t xml:space="preserve"> به شماره موبایل </w:t>
+      </w:r>
+      <w:r>
+        <w:rPr>
+          <w:rFonts w:hint="cs"/>
+          <w:rtl/>
+          <w:lang w:bidi="fa-IR"/>
+        </w:rPr>
+        <w:t>مذکور، قابل حل است. اما درحال حاضر، در توانایی افراد تیم پروژه نیست.</w:t>
+      </w:r>
+    </w:p>
+    <w:p>
+      <w:pPr>
+        <w:pStyle w:val="ListParagraph"/>
+        <w:numPr>
+          <w:ilvl w:val="0"/>
+          <w:numId w:val="22"/>
+        </w:numPr>
+        <w:rPr>
+          <w:lang w:bidi="fa-IR"/>
+        </w:rPr>
+      </w:pPr>
+      <w:r>
+        <w:rPr>
+          <w:rFonts w:hint="cs"/>
+          <w:rtl/>
+          <w:lang w:bidi="fa-IR"/>
+        </w:rPr>
+        <w:t xml:space="preserve">پسورد حساب‌ها به صورت </w:t>
+      </w:r>
+      <w:r>
+        <w:rPr>
+          <w:lang w:bidi="fa-IR"/>
+        </w:rPr>
+        <w:t>string</w:t>
+      </w:r>
+      <w:r>
+        <w:rPr>
+          <w:rFonts w:hint="cs"/>
+          <w:rtl/>
+          <w:lang w:bidi="fa-IR"/>
+        </w:rPr>
+        <w:t xml:space="preserve"> در فیلد کلاس‌های بک اند ذخیره میشوند. بهتر بود به صورت </w:t>
+      </w:r>
+      <w:r>
+        <w:rPr>
+          <w:lang w:bidi="fa-IR"/>
+        </w:rPr>
+        <w:t>hash</w:t>
+      </w:r>
+      <w:r>
+        <w:rPr>
+          <w:rFonts w:hint="cs"/>
+          <w:rtl/>
+          <w:lang w:bidi="fa-IR"/>
+        </w:rPr>
+        <w:t xml:space="preserve"> ذخیره می‌شدند. حل این مشکل از توانایی‌های افراد تیم فراتر است.</w:t>
+      </w:r>
+    </w:p>
+    <w:p>
+      <w:pPr>
+        <w:pStyle w:val="ListParagraph"/>
+        <w:numPr>
+          <w:ilvl w:val="0"/>
+          <w:numId w:val="22"/>
+        </w:numPr>
+        <w:rPr>
+          <w:rtl/>
+          <w:lang w:bidi="fa-IR"/>
+        </w:rPr>
+      </w:pPr>
+      <w:r>
+        <w:rPr>
+          <w:rFonts w:hint="cs"/>
+          <w:rtl/>
+          <w:lang w:bidi="fa-IR"/>
+        </w:rPr>
+        <w:t>افزودن نوع جدیدی از کسب‌وکار، نیازمند تغییر مستقیم و تخصصی دیتابیس است و باید فقط توسط اعضای تیم انجام شود.</w:t>
+      </w:r>
+      <w:bookmarkStart w:id="42" w:name="_Toc234084148"/>
+      <w:r>
+        <w:rPr>
+          <w:rtl/>
+        </w:rPr>
+        <w:br w:type="page"/>
+      </w:r>
+    </w:p>
+    <w:p>
+      <w:pPr>
         <w:pStyle w:val="Heading2"/>
         <w:rPr>
           <w:rtl/>
           <w:lang w:bidi="fa-IR"/>
         </w:rPr>
       </w:pPr>
-      <w:bookmarkStart w:id="42" w:name="_Toc234084148"/>
-      <w:r>
-        <w:rPr>
-          <w:rtl/>
-        </w:rPr>
+      <w:r>
+        <w:rPr>
+          <w:rtl/>
+        </w:rPr>
+        <w:lastRenderedPageBreak/>
         <w:t>پیشنهادهای توسعه آینده</w:t>
       </w:r>
       <w:bookmarkEnd w:id="42"/>
@@ -9051,7 +9252,7 @@
 </file>
 
 <file path=word/endnotes.xml><?xml version="1.0" encoding="utf-8"?>
-<w:endnotes xmlns:wpc="http://schemas.microsoft.com/office/word/2010/wordprocessingCanvas" xmlns:cx="http://schemas.microsoft.com/office/drawing/2014/chartex" xmlns:cx1="http://schemas.microsoft.com/office/drawing/2015/9/8/chartex" xmlns:cx2="http://schemas.microsoft.com/office/drawing/2015/10/21/chartex" xmlns:cx3="http://schemas.microsoft.com/office/drawing/2016/5/9/chartex" xmlns:cx4="http://schemas.microsoft.com/office/drawing/2016/5/10/chartex" xmlns:cx5="http://schemas.microsoft.com/office/drawing/2016/5/11/chartex" xmlns:cx6="http://schemas.microsoft.com/office/drawing/2016/5/12/chartex" xmlns:cx7="http://schemas.microsoft.com/office/drawing/2016/5/13/chartex" xmlns:cx8="http://schemas.microsoft.com/office/drawing/2016/5/14/chartex" xmlns:mc="http://schemas.openxmlformats.org/markup-compatibility/2006" xmlns:m="http://schemas.openxmlformats.org/officeDocument/2006/math" xmlns:aink="http://schemas.microsoft.com/office/drawing/2016/ink" xmlns:am3d="http://schemas.microsoft.com/office/drawing/2017/model3d" xmlns:oel="http://schemas.microsoft.com/office/2019/extlst" xmlns:r="http://schemas.openxmlformats.org/officeDocument/2006/relationships" xmlns:wp14="http://schemas.microsoft.com/office/word/2010/wordprocessingDrawing" xmlns:wp="http://schemas.openxmlformats.org/drawingml/2006/wordprocessingDrawing" xmlns:wpg="http://schemas.microsoft.com/office/word/2010/wordprocessingGroup" xmlns:wpi="http://schemas.microsoft.com/office/word/2010/wordprocessingInk" xmlns:wps="http://schemas.microsoft.com/office/word/2010/wordprocessingShape" xmlns:o="urn:schemas-microsoft-com:office:office" xmlns:v="urn:schemas-microsoft-com:vml" xmlns:w10="urn:schemas-microsoft-com:office:word" xmlns:w="http://schemas.openxmlformats.org/wordprocessingml/2006/main" xmlns:w14="http://schemas.microsoft.com/office/word/2010/wordml" xmlns:w15="http://schemas.microsoft.com/office/word/2012/wordml" xmlns:w16cex="http://schemas.microsoft.com/office/word/2018/wordml/cex" xmlns:w16cid="http://schemas.microsoft.com/office/word/2016/wordml/cid" xmlns:w16="http://schemas.microsoft.com/office/word/2018/wordml" xmlns:w16sdtdh="http://schemas.microsoft.com/office/word/2020/wordml/sdtdatahash" xmlns:w16sdtfl="http://schemas.microsoft.com/office/word/2024/wordml/sdtformatlock" xmlns:w16se="http://schemas.microsoft.com/office/word/2015/wordml/symex" xmlns:w16du="http://schemas.microsoft.com/office/word/2023/wordml/word16du" xmlns:wne="http://schemas.microsoft.com/office/word/2006/wordml" mc:Ignorable="w14 w15 w16se w16cid w16 w16cex w16sdtdh w16sdtfl w16du wp14">
+<w:endnotes xmlns:wpc="http://schemas.microsoft.com/office/word/2010/wordprocessingCanvas" xmlns:cx="http://schemas.microsoft.com/office/drawing/2014/chartex" xmlns:cx1="http://schemas.microsoft.com/office/drawing/2015/9/8/chartex" xmlns:cx2="http://schemas.microsoft.com/office/drawing/2015/10/21/chartex" xmlns:cx3="http://schemas.microsoft.com/office/drawing/2016/5/9/chartex" xmlns:cx4="http://schemas.microsoft.com/office/drawing/2016/5/10/chartex" xmlns:cx5="http://schemas.microsoft.com/office/drawing/2016/5/11/chartex" xmlns:cx6="http://schemas.microsoft.com/office/drawing/2016/5/12/chartex" xmlns:cx7="http://schemas.microsoft.com/office/drawing/2016/5/13/chartex" xmlns:cx8="http://schemas.microsoft.com/office/drawing/2016/5/14/chartex" xmlns:mc="http://schemas.openxmlformats.org/markup-compatibility/2006" xmlns:aink="http://schemas.microsoft.com/office/drawing/2016/ink" xmlns:am3d="http://schemas.microsoft.com/office/drawing/2017/model3d" xmlns:o="urn:schemas-microsoft-com:office:office" xmlns:oel="http://schemas.microsoft.com/office/2019/extlst" xmlns:r="http://schemas.openxmlformats.org/officeDocument/2006/relationships" xmlns:m="http://schemas.openxmlformats.org/officeDocument/2006/math" xmlns:v="urn:schemas-microsoft-com:vml" xmlns:wp14="http://schemas.microsoft.com/office/word/2010/wordprocessingDrawing" xmlns:wp="http://schemas.openxmlformats.org/drawingml/2006/wordprocessingDrawing" xmlns:w10="urn:schemas-microsoft-com:office:word" xmlns:w="http://schemas.openxmlformats.org/wordprocessingml/2006/main" xmlns:w14="http://schemas.microsoft.com/office/word/2010/wordml" xmlns:w15="http://schemas.microsoft.com/office/word/2012/wordml" xmlns:w16cex="http://schemas.microsoft.com/office/word/2018/wordml/cex" xmlns:w16cid="http://schemas.microsoft.com/office/word/2016/wordml/cid" xmlns:w16="http://schemas.microsoft.com/office/word/2018/wordml" xmlns:w16sdtdh="http://schemas.microsoft.com/office/word/2020/wordml/sdtdatahash" xmlns:w16se="http://schemas.microsoft.com/office/word/2015/wordml/symex" xmlns:wpg="http://schemas.microsoft.com/office/word/2010/wordprocessingGroup" xmlns:wpi="http://schemas.microsoft.com/office/word/2010/wordprocessingInk" xmlns:wne="http://schemas.microsoft.com/office/word/2006/wordml" xmlns:wps="http://schemas.microsoft.com/office/word/2010/wordprocessingShape" mc:Ignorable="w14 w15 w16se w16cid w16 w16cex w16sdtdh wp14">
   <w:endnote w:type="separator" w:id="-1">
     <w:p>
       <w:r>
@@ -9072,7 +9273,7 @@
 </file>
 
 <file path=word/footer1.xml><?xml version="1.0" encoding="utf-8"?>
-<w:ftr xmlns:wpc="http://schemas.microsoft.com/office/word/2010/wordprocessingCanvas" xmlns:cx="http://schemas.microsoft.com/office/drawing/2014/chartex" xmlns:cx1="http://schemas.microsoft.com/office/drawing/2015/9/8/chartex" xmlns:cx2="http://schemas.microsoft.com/office/drawing/2015/10/21/chartex" xmlns:cx3="http://schemas.microsoft.com/office/drawing/2016/5/9/chartex" xmlns:cx4="http://schemas.microsoft.com/office/drawing/2016/5/10/chartex" xmlns:cx5="http://schemas.microsoft.com/office/drawing/2016/5/11/chartex" xmlns:cx6="http://schemas.microsoft.com/office/drawing/2016/5/12/chartex" xmlns:cx7="http://schemas.microsoft.com/office/drawing/2016/5/13/chartex" xmlns:cx8="http://schemas.microsoft.com/office/drawing/2016/5/14/chartex" xmlns:mc="http://schemas.openxmlformats.org/markup-compatibility/2006" xmlns:m="http://schemas.openxmlformats.org/officeDocument/2006/math" xmlns:aink="http://schemas.microsoft.com/office/drawing/2016/ink" xmlns:am3d="http://schemas.microsoft.com/office/drawing/2017/model3d" xmlns:oel="http://schemas.microsoft.com/office/2019/extlst" xmlns:r="http://schemas.openxmlformats.org/officeDocument/2006/relationships" xmlns:wp14="http://schemas.microsoft.com/office/word/2010/wordprocessingDrawing" xmlns:wp="http://schemas.openxmlformats.org/drawingml/2006/wordprocessingDrawing" xmlns:wpg="http://schemas.microsoft.com/office/word/2010/wordprocessingGroup" xmlns:wpi="http://schemas.microsoft.com/office/word/2010/wordprocessingInk" xmlns:wps="http://schemas.microsoft.com/office/word/2010/wordprocessingShape" xmlns:o="urn:schemas-microsoft-com:office:office" xmlns:v="urn:schemas-microsoft-com:vml" xmlns:w10="urn:schemas-microsoft-com:office:word" xmlns:w="http://schemas.openxmlformats.org/wordprocessingml/2006/main" xmlns:w14="http://schemas.microsoft.com/office/word/2010/wordml" xmlns:w15="http://schemas.microsoft.com/office/word/2012/wordml" xmlns:w16cex="http://schemas.microsoft.com/office/word/2018/wordml/cex" xmlns:w16cid="http://schemas.microsoft.com/office/word/2016/wordml/cid" xmlns:w16="http://schemas.microsoft.com/office/word/2018/wordml" xmlns:w16sdtdh="http://schemas.microsoft.com/office/word/2020/wordml/sdtdatahash" xmlns:w16sdtfl="http://schemas.microsoft.com/office/word/2024/wordml/sdtformatlock" xmlns:w16se="http://schemas.microsoft.com/office/word/2015/wordml/symex" xmlns:w16du="http://schemas.microsoft.com/office/word/2023/wordml/word16du" xmlns:wne="http://schemas.microsoft.com/office/word/2006/wordml" mc:Ignorable="w14 w15 w16se w16cid w16 w16cex w16sdtdh w16sdtfl w16du wp14">
+<w:ftr xmlns:wpc="http://schemas.microsoft.com/office/word/2010/wordprocessingCanvas" xmlns:cx="http://schemas.microsoft.com/office/drawing/2014/chartex" xmlns:cx1="http://schemas.microsoft.com/office/drawing/2015/9/8/chartex" xmlns:cx2="http://schemas.microsoft.com/office/drawing/2015/10/21/chartex" xmlns:cx3="http://schemas.microsoft.com/office/drawing/2016/5/9/chartex" xmlns:cx4="http://schemas.microsoft.com/office/drawing/2016/5/10/chartex" xmlns:cx5="http://schemas.microsoft.com/office/drawing/2016/5/11/chartex" xmlns:cx6="http://schemas.microsoft.com/office/drawing/2016/5/12/chartex" xmlns:cx7="http://schemas.microsoft.com/office/drawing/2016/5/13/chartex" xmlns:cx8="http://schemas.microsoft.com/office/drawing/2016/5/14/chartex" xmlns:mc="http://schemas.openxmlformats.org/markup-compatibility/2006" xmlns:aink="http://schemas.microsoft.com/office/drawing/2016/ink" xmlns:am3d="http://schemas.microsoft.com/office/drawing/2017/model3d" xmlns:o="urn:schemas-microsoft-com:office:office" xmlns:oel="http://schemas.microsoft.com/office/2019/extlst" xmlns:r="http://schemas.openxmlformats.org/officeDocument/2006/relationships" xmlns:m="http://schemas.openxmlformats.org/officeDocument/2006/math" xmlns:v="urn:schemas-microsoft-com:vml" xmlns:wp14="http://schemas.microsoft.com/office/word/2010/wordprocessingDrawing" xmlns:wp="http://schemas.openxmlformats.org/drawingml/2006/wordprocessingDrawing" xmlns:w10="urn:schemas-microsoft-com:office:word" xmlns:w="http://schemas.openxmlformats.org/wordprocessingml/2006/main" xmlns:w14="http://schemas.microsoft.com/office/word/2010/wordml" xmlns:w15="http://schemas.microsoft.com/office/word/2012/wordml" xmlns:w16cex="http://schemas.microsoft.com/office/word/2018/wordml/cex" xmlns:w16cid="http://schemas.microsoft.com/office/word/2016/wordml/cid" xmlns:w16="http://schemas.microsoft.com/office/word/2018/wordml" xmlns:w16sdtdh="http://schemas.microsoft.com/office/word/2020/wordml/sdtdatahash" xmlns:w16se="http://schemas.microsoft.com/office/word/2015/wordml/symex" xmlns:wpg="http://schemas.microsoft.com/office/word/2010/wordprocessingGroup" xmlns:wpi="http://schemas.microsoft.com/office/word/2010/wordprocessingInk" xmlns:wne="http://schemas.microsoft.com/office/word/2006/wordml" xmlns:wps="http://schemas.microsoft.com/office/word/2010/wordprocessingShape" mc:Ignorable="w14 w15 w16se w16cid w16 w16cex w16sdtdh wp14">
   <w:p>
     <w:pPr>
       <w:pStyle w:val="HeaderFooter"/>
@@ -9109,7 +9310,7 @@
 </file>
 
 <file path=word/footnotes.xml><?xml version="1.0" encoding="utf-8"?>
-<w:footnotes xmlns:wpc="http://schemas.microsoft.com/office/word/2010/wordprocessingCanvas" xmlns:cx="http://schemas.microsoft.com/office/drawing/2014/chartex" xmlns:cx1="http://schemas.microsoft.com/office/drawing/2015/9/8/chartex" xmlns:cx2="http://schemas.microsoft.com/office/drawing/2015/10/21/chartex" xmlns:cx3="http://schemas.microsoft.com/office/drawing/2016/5/9/chartex" xmlns:cx4="http://schemas.microsoft.com/office/drawing/2016/5/10/chartex" xmlns:cx5="http://schemas.microsoft.com/office/drawing/2016/5/11/chartex" xmlns:cx6="http://schemas.microsoft.com/office/drawing/2016/5/12/chartex" xmlns:cx7="http://schemas.microsoft.com/office/drawing/2016/5/13/chartex" xmlns:cx8="http://schemas.microsoft.com/office/drawing/2016/5/14/chartex" xmlns:mc="http://schemas.openxmlformats.org/markup-compatibility/2006" xmlns:m="http://schemas.openxmlformats.org/officeDocument/2006/math" xmlns:aink="http://schemas.microsoft.com/office/drawing/2016/ink" xmlns:am3d="http://schemas.microsoft.com/office/drawing/2017/model3d" xmlns:oel="http://schemas.microsoft.com/office/2019/extlst" xmlns:r="http://schemas.openxmlformats.org/officeDocument/2006/relationships" xmlns:wp14="http://schemas.microsoft.com/office/word/2010/wordprocessingDrawing" xmlns:wp="http://schemas.openxmlformats.org/drawingml/2006/wordprocessingDrawing" xmlns:wpg="http://schemas.microsoft.com/office/word/2010/wordprocessingGroup" xmlns:wpi="http://schemas.microsoft.com/office/word/2010/wordprocessingInk" xmlns:wps="http://schemas.microsoft.com/office/word/2010/wordprocessingShape" xmlns:o="urn:schemas-microsoft-com:office:office" xmlns:v="urn:schemas-microsoft-com:vml" xmlns:w10="urn:schemas-microsoft-com:office:word" xmlns:w="http://schemas.openxmlformats.org/wordprocessingml/2006/main" xmlns:w14="http://schemas.microsoft.com/office/word/2010/wordml" xmlns:w15="http://schemas.microsoft.com/office/word/2012/wordml" xmlns:w16cex="http://schemas.microsoft.com/office/word/2018/wordml/cex" xmlns:w16cid="http://schemas.microsoft.com/office/word/2016/wordml/cid" xmlns:w16="http://schemas.microsoft.com/office/word/2018/wordml" xmlns:w16sdtdh="http://schemas.microsoft.com/office/word/2020/wordml/sdtdatahash" xmlns:w16sdtfl="http://schemas.microsoft.com/office/word/2024/wordml/sdtformatlock" xmlns:w16se="http://schemas.microsoft.com/office/word/2015/wordml/symex" xmlns:w16du="http://schemas.microsoft.com/office/word/2023/wordml/word16du" xmlns:wne="http://schemas.microsoft.com/office/word/2006/wordml" mc:Ignorable="w14 w15 w16se w16cid w16 w16cex w16sdtdh w16sdtfl w16du wp14">
+<w:footnotes xmlns:wpc="http://schemas.microsoft.com/office/word/2010/wordprocessingCanvas" xmlns:cx="http://schemas.microsoft.com/office/drawing/2014/chartex" xmlns:cx1="http://schemas.microsoft.com/office/drawing/2015/9/8/chartex" xmlns:cx2="http://schemas.microsoft.com/office/drawing/2015/10/21/chartex" xmlns:cx3="http://schemas.microsoft.com/office/drawing/2016/5/9/chartex" xmlns:cx4="http://schemas.microsoft.com/office/drawing/2016/5/10/chartex" xmlns:cx5="http://schemas.microsoft.com/office/drawing/2016/5/11/chartex" xmlns:cx6="http://schemas.microsoft.com/office/drawing/2016/5/12/chartex" xmlns:cx7="http://schemas.microsoft.com/office/drawing/2016/5/13/chartex" xmlns:cx8="http://schemas.microsoft.com/office/drawing/2016/5/14/chartex" xmlns:mc="http://schemas.openxmlformats.org/markup-compatibility/2006" xmlns:aink="http://schemas.microsoft.com/office/drawing/2016/ink" xmlns:am3d="http://schemas.microsoft.com/office/drawing/2017/model3d" xmlns:o="urn:schemas-microsoft-com:office:office" xmlns:oel="http://schemas.microsoft.com/office/2019/extlst" xmlns:r="http://schemas.openxmlformats.org/officeDocument/2006/relationships" xmlns:m="http://schemas.openxmlformats.org/officeDocument/2006/math" xmlns:v="urn:schemas-microsoft-com:vml" xmlns:wp14="http://schemas.microsoft.com/office/word/2010/wordprocessingDrawing" xmlns:wp="http://schemas.openxmlformats.org/drawingml/2006/wordprocessingDrawing" xmlns:w10="urn:schemas-microsoft-com:office:word" xmlns:w="http://schemas.openxmlformats.org/wordprocessingml/2006/main" xmlns:w14="http://schemas.microsoft.com/office/word/2010/wordml" xmlns:w15="http://schemas.microsoft.com/office/word/2012/wordml" xmlns:w16cex="http://schemas.microsoft.com/office/word/2018/wordml/cex" xmlns:w16cid="http://schemas.microsoft.com/office/word/2016/wordml/cid" xmlns:w16="http://schemas.microsoft.com/office/word/2018/wordml" xmlns:w16sdtdh="http://schemas.microsoft.com/office/word/2020/wordml/sdtdatahash" xmlns:w16se="http://schemas.microsoft.com/office/word/2015/wordml/symex" xmlns:wpg="http://schemas.microsoft.com/office/word/2010/wordprocessingGroup" xmlns:wpi="http://schemas.microsoft.com/office/word/2010/wordprocessingInk" xmlns:wne="http://schemas.microsoft.com/office/word/2006/wordml" xmlns:wps="http://schemas.microsoft.com/office/word/2010/wordprocessingShape" mc:Ignorable="w14 w15 w16se w16cid w16 w16cex w16sdtdh wp14">
   <w:footnote w:type="separator" w:id="-1">
     <w:p>
       <w:r>
@@ -9130,7 +9331,7 @@
 </file>
 
 <file path=word/header1.xml><?xml version="1.0" encoding="utf-8"?>
-<w:hdr xmlns:wpc="http://schemas.microsoft.com/office/word/2010/wordprocessingCanvas" xmlns:cx="http://schemas.microsoft.com/office/drawing/2014/chartex" xmlns:cx1="http://schemas.microsoft.com/office/drawing/2015/9/8/chartex" xmlns:cx2="http://schemas.microsoft.com/office/drawing/2015/10/21/chartex" xmlns:cx3="http://schemas.microsoft.com/office/drawing/2016/5/9/chartex" xmlns:cx4="http://schemas.microsoft.com/office/drawing/2016/5/10/chartex" xmlns:cx5="http://schemas.microsoft.com/office/drawing/2016/5/11/chartex" xmlns:cx6="http://schemas.microsoft.com/office/drawing/2016/5/12/chartex" xmlns:cx7="http://schemas.microsoft.com/office/drawing/2016/5/13/chartex" xmlns:cx8="http://schemas.microsoft.com/office/drawing/2016/5/14/chartex" xmlns:mc="http://schemas.openxmlformats.org/markup-compatibility/2006" xmlns:m="http://schemas.openxmlformats.org/officeDocument/2006/math" xmlns:aink="http://schemas.microsoft.com/office/drawing/2016/ink" xmlns:am3d="http://schemas.microsoft.com/office/drawing/2017/model3d" xmlns:oel="http://schemas.microsoft.com/office/2019/extlst" xmlns:r="http://schemas.openxmlformats.org/officeDocument/2006/relationships" xmlns:wp14="http://schemas.microsoft.com/office/word/2010/wordprocessingDrawing" xmlns:wp="http://schemas.openxmlformats.org/drawingml/2006/wordprocessingDrawing" xmlns:wpg="http://schemas.microsoft.com/office/word/2010/wordprocessingGroup" xmlns:wpi="http://schemas.microsoft.com/office/word/2010/wordprocessingInk" xmlns:wps="http://schemas.microsoft.com/office/word/2010/wordprocessingShape" xmlns:o="urn:schemas-microsoft-com:office:office" xmlns:v="urn:schemas-microsoft-com:vml" xmlns:w10="urn:schemas-microsoft-com:office:word" xmlns:w="http://schemas.openxmlformats.org/wordprocessingml/2006/main" xmlns:w14="http://schemas.microsoft.com/office/word/2010/wordml" xmlns:w15="http://schemas.microsoft.com/office/word/2012/wordml" xmlns:w16cex="http://schemas.microsoft.com/office/word/2018/wordml/cex" xmlns:w16cid="http://schemas.microsoft.com/office/word/2016/wordml/cid" xmlns:w16="http://schemas.microsoft.com/office/word/2018/wordml" xmlns:w16sdtdh="http://schemas.microsoft.com/office/word/2020/wordml/sdtdatahash" xmlns:w16sdtfl="http://schemas.microsoft.com/office/word/2024/wordml/sdtformatlock" xmlns:w16se="http://schemas.microsoft.com/office/word/2015/wordml/symex" xmlns:w16du="http://schemas.microsoft.com/office/word/2023/wordml/word16du" xmlns:wne="http://schemas.microsoft.com/office/word/2006/wordml" mc:Ignorable="w14 w15 w16se w16cid w16 w16cex w16sdtdh w16sdtfl w16du wp14">
+<w:hdr xmlns:wpc="http://schemas.microsoft.com/office/word/2010/wordprocessingCanvas" xmlns:cx="http://schemas.microsoft.com/office/drawing/2014/chartex" xmlns:cx1="http://schemas.microsoft.com/office/drawing/2015/9/8/chartex" xmlns:cx2="http://schemas.microsoft.com/office/drawing/2015/10/21/chartex" xmlns:cx3="http://schemas.microsoft.com/office/drawing/2016/5/9/chartex" xmlns:cx4="http://schemas.microsoft.com/office/drawing/2016/5/10/chartex" xmlns:cx5="http://schemas.microsoft.com/office/drawing/2016/5/11/chartex" xmlns:cx6="http://schemas.microsoft.com/office/drawing/2016/5/12/chartex" xmlns:cx7="http://schemas.microsoft.com/office/drawing/2016/5/13/chartex" xmlns:cx8="http://schemas.microsoft.com/office/drawing/2016/5/14/chartex" xmlns:mc="http://schemas.openxmlformats.org/markup-compatibility/2006" xmlns:aink="http://schemas.microsoft.com/office/drawing/2016/ink" xmlns:am3d="http://schemas.microsoft.com/office/drawing/2017/model3d" xmlns:o="urn:schemas-microsoft-com:office:office" xmlns:oel="http://schemas.microsoft.com/office/2019/extlst" xmlns:r="http://schemas.openxmlformats.org/officeDocument/2006/relationships" xmlns:m="http://schemas.openxmlformats.org/officeDocument/2006/math" xmlns:v="urn:schemas-microsoft-com:vml" xmlns:wp14="http://schemas.microsoft.com/office/word/2010/wordprocessingDrawing" xmlns:wp="http://schemas.openxmlformats.org/drawingml/2006/wordprocessingDrawing" xmlns:w10="urn:schemas-microsoft-com:office:word" xmlns:w="http://schemas.openxmlformats.org/wordprocessingml/2006/main" xmlns:w14="http://schemas.microsoft.com/office/word/2010/wordml" xmlns:w15="http://schemas.microsoft.com/office/word/2012/wordml" xmlns:w16cex="http://schemas.microsoft.com/office/word/2018/wordml/cex" xmlns:w16cid="http://schemas.microsoft.com/office/word/2016/wordml/cid" xmlns:w16="http://schemas.microsoft.com/office/word/2018/wordml" xmlns:w16sdtdh="http://schemas.microsoft.com/office/word/2020/wordml/sdtdatahash" xmlns:w16se="http://schemas.microsoft.com/office/word/2015/wordml/symex" xmlns:wpg="http://schemas.microsoft.com/office/word/2010/wordprocessingGroup" xmlns:wpi="http://schemas.microsoft.com/office/word/2010/wordprocessingInk" xmlns:wne="http://schemas.microsoft.com/office/word/2006/wordml" xmlns:wps="http://schemas.microsoft.com/office/word/2010/wordprocessingShape" mc:Ignorable="w14 w15 w16se w16cid w16 w16cex w16sdtdh wp14">
   <w:p>
     <w:pPr>
       <w:pStyle w:val="HeaderFooter"/>
@@ -9168,7 +9369,7 @@
 </file>
 
 <file path=word/numbering.xml><?xml version="1.0" encoding="utf-8"?>
-<w:numbering xmlns:wpc="http://schemas.microsoft.com/office/word/2010/wordprocessingCanvas" xmlns:cx="http://schemas.microsoft.com/office/drawing/2014/chartex" xmlns:cx1="http://schemas.microsoft.com/office/drawing/2015/9/8/chartex" xmlns:cx2="http://schemas.microsoft.com/office/drawing/2015/10/21/chartex" xmlns:cx3="http://schemas.microsoft.com/office/drawing/2016/5/9/chartex" xmlns:cx4="http://schemas.microsoft.com/office/drawing/2016/5/10/chartex" xmlns:cx5="http://schemas.microsoft.com/office/drawing/2016/5/11/chartex" xmlns:cx6="http://schemas.microsoft.com/office/drawing/2016/5/12/chartex" xmlns:cx7="http://schemas.microsoft.com/office/drawing/2016/5/13/chartex" xmlns:cx8="http://schemas.microsoft.com/office/drawing/2016/5/14/chartex" xmlns:mc="http://schemas.openxmlformats.org/markup-compatibility/2006" xmlns:m="http://schemas.openxmlformats.org/officeDocument/2006/math" xmlns:aink="http://schemas.microsoft.com/office/drawing/2016/ink" xmlns:am3d="http://schemas.microsoft.com/office/drawing/2017/model3d" xmlns:oel="http://schemas.microsoft.com/office/2019/extlst" xmlns:r="http://schemas.openxmlformats.org/officeDocument/2006/relationships" xmlns:wp14="http://schemas.microsoft.com/office/word/2010/wordprocessingDrawing" xmlns:wp="http://schemas.openxmlformats.org/drawingml/2006/wordprocessingDrawing" xmlns:wpg="http://schemas.microsoft.com/office/word/2010/wordprocessingGroup" xmlns:wpi="http://schemas.microsoft.com/office/word/2010/wordprocessingInk" xmlns:wps="http://schemas.microsoft.com/office/word/2010/wordprocessingShape" xmlns:o="urn:schemas-microsoft-com:office:office" xmlns:v="urn:schemas-microsoft-com:vml" xmlns:w10="urn:schemas-microsoft-com:office:word" xmlns:w="http://schemas.openxmlformats.org/wordprocessingml/2006/main" xmlns:w14="http://schemas.microsoft.com/office/word/2010/wordml" xmlns:w15="http://schemas.microsoft.com/office/word/2012/wordml" xmlns:w16cex="http://schemas.microsoft.com/office/word/2018/wordml/cex" xmlns:w16cid="http://schemas.microsoft.com/office/word/2016/wordml/cid" xmlns:w16="http://schemas.microsoft.com/office/word/2018/wordml" xmlns:w16sdtdh="http://schemas.microsoft.com/office/word/2020/wordml/sdtdatahash" xmlns:w16sdtfl="http://schemas.microsoft.com/office/word/2024/wordml/sdtformatlock" xmlns:w16se="http://schemas.microsoft.com/office/word/2015/wordml/symex" xmlns:w16du="http://schemas.microsoft.com/office/word/2023/wordml/word16du" xmlns:wne="http://schemas.microsoft.com/office/word/2006/wordml" mc:Ignorable="w14 w15 w16se w16cid w16 w16cex w16sdtdh w16sdtfl w16du wp14">
+<w:numbering xmlns:wpc="http://schemas.microsoft.com/office/word/2010/wordprocessingCanvas" xmlns:cx="http://schemas.microsoft.com/office/drawing/2014/chartex" xmlns:cx1="http://schemas.microsoft.com/office/drawing/2015/9/8/chartex" xmlns:cx2="http://schemas.microsoft.com/office/drawing/2015/10/21/chartex" xmlns:cx3="http://schemas.microsoft.com/office/drawing/2016/5/9/chartex" xmlns:cx4="http://schemas.microsoft.com/office/drawing/2016/5/10/chartex" xmlns:cx5="http://schemas.microsoft.com/office/drawing/2016/5/11/chartex" xmlns:cx6="http://schemas.microsoft.com/office/drawing/2016/5/12/chartex" xmlns:cx7="http://schemas.microsoft.com/office/drawing/2016/5/13/chartex" xmlns:cx8="http://schemas.microsoft.com/office/drawing/2016/5/14/chartex" xmlns:mc="http://schemas.openxmlformats.org/markup-compatibility/2006" xmlns:aink="http://schemas.microsoft.com/office/drawing/2016/ink" xmlns:am3d="http://schemas.microsoft.com/office/drawing/2017/model3d" xmlns:o="urn:schemas-microsoft-com:office:office" xmlns:oel="http://schemas.microsoft.com/office/2019/extlst" xmlns:r="http://schemas.openxmlformats.org/officeDocument/2006/relationships" xmlns:m="http://schemas.openxmlformats.org/officeDocument/2006/math" xmlns:v="urn:schemas-microsoft-com:vml" xmlns:wp14="http://schemas.microsoft.com/office/word/2010/wordprocessingDrawing" xmlns:wp="http://schemas.openxmlformats.org/drawingml/2006/wordprocessingDrawing" xmlns:w10="urn:schemas-microsoft-com:office:word" xmlns:w="http://schemas.openxmlformats.org/wordprocessingml/2006/main" xmlns:w14="http://schemas.microsoft.com/office/word/2010/wordml" xmlns:w15="http://schemas.microsoft.com/office/word/2012/wordml" xmlns:w16cex="http://schemas.microsoft.com/office/word/2018/wordml/cex" xmlns:w16cid="http://schemas.microsoft.com/office/word/2016/wordml/cid" xmlns:w16="http://schemas.microsoft.com/office/word/2018/wordml" xmlns:w16sdtdh="http://schemas.microsoft.com/office/word/2020/wordml/sdtdatahash" xmlns:w16se="http://schemas.microsoft.com/office/word/2015/wordml/symex" xmlns:wpg="http://schemas.microsoft.com/office/word/2010/wordprocessingGroup" xmlns:wpi="http://schemas.microsoft.com/office/word/2010/wordprocessingInk" xmlns:wne="http://schemas.microsoft.com/office/word/2006/wordml" xmlns:wps="http://schemas.microsoft.com/office/word/2010/wordprocessingShape" mc:Ignorable="w14 w15 w16se w16cid w16 w16cex w16sdtdh wp14">
   <w:abstractNum w:abstractNumId="0" w15:restartNumberingAfterBreak="0">
     <w:nsid w:val="008934C6"/>
     <w:multiLevelType w:val="multilevel"/>
@@ -10565,6 +10766,118 @@
     </w:lvl>
   </w:abstractNum>
   <w:abstractNum w:abstractNumId="10" w15:restartNumberingAfterBreak="0">
+    <w:nsid w:val="4B942F8D"/>
+    <w:multiLevelType w:val="hybridMultilevel"/>
+    <w:tmpl w:val="E62CAD30"/>
+    <w:lvl w:ilvl="0" w:tplc="18FA9BD6">
+      <w:numFmt w:val="bullet"/>
+      <w:lvlText w:val="-"/>
+      <w:lvlJc w:val="left"/>
+      <w:pPr>
+        <w:ind w:left="720" w:hanging="360"/>
+      </w:pPr>
+      <w:rPr>
+        <w:rFonts w:ascii="Vazirmatn" w:eastAsia="Arial Unicode MS" w:hAnsi="Vazirmatn" w:cs="Vazirmatn" w:hint="default"/>
+      </w:rPr>
+    </w:lvl>
+    <w:lvl w:ilvl="1" w:tplc="04090003" w:tentative="1">
+      <w:start w:val="1"/>
+      <w:numFmt w:val="bullet"/>
+      <w:lvlText w:val="o"/>
+      <w:lvlJc w:val="left"/>
+      <w:pPr>
+        <w:ind w:left="1440" w:hanging="360"/>
+      </w:pPr>
+      <w:rPr>
+        <w:rFonts w:ascii="Courier New" w:hAnsi="Courier New" w:cs="Courier New" w:hint="default"/>
+      </w:rPr>
+    </w:lvl>
+    <w:lvl w:ilvl="2" w:tplc="04090005" w:tentative="1">
+      <w:start w:val="1"/>
+      <w:numFmt w:val="bullet"/>
+      <w:lvlText w:val=""/>
+      <w:lvlJc w:val="left"/>
+      <w:pPr>
+        <w:ind w:left="2160" w:hanging="360"/>
+      </w:pPr>
+      <w:rPr>
+        <w:rFonts w:ascii="Wingdings" w:hAnsi="Wingdings" w:hint="default"/>
+      </w:rPr>
+    </w:lvl>
+    <w:lvl w:ilvl="3" w:tplc="04090001" w:tentative="1">
+      <w:start w:val="1"/>
+      <w:numFmt w:val="bullet"/>
+      <w:lvlText w:val=""/>
+      <w:lvlJc w:val="left"/>
+      <w:pPr>
+        <w:ind w:left="2880" w:hanging="360"/>
+      </w:pPr>
+      <w:rPr>
+        <w:rFonts w:ascii="Symbol" w:hAnsi="Symbol" w:hint="default"/>
+      </w:rPr>
+    </w:lvl>
+    <w:lvl w:ilvl="4" w:tplc="04090003" w:tentative="1">
+      <w:start w:val="1"/>
+      <w:numFmt w:val="bullet"/>
+      <w:lvlText w:val="o"/>
+      <w:lvlJc w:val="left"/>
+      <w:pPr>
+        <w:ind w:left="3600" w:hanging="360"/>
+      </w:pPr>
+      <w:rPr>
+        <w:rFonts w:ascii="Courier New" w:hAnsi="Courier New" w:cs="Courier New" w:hint="default"/>
+      </w:rPr>
+    </w:lvl>
+    <w:lvl w:ilvl="5" w:tplc="04090005" w:tentative="1">
+      <w:start w:val="1"/>
+      <w:numFmt w:val="bullet"/>
+      <w:lvlText w:val=""/>
+      <w:lvlJc w:val="left"/>
+      <w:pPr>
+        <w:ind w:left="4320" w:hanging="360"/>
+      </w:pPr>
+      <w:rPr>
+        <w:rFonts w:ascii="Wingdings" w:hAnsi="Wingdings" w:hint="default"/>
+      </w:rPr>
+    </w:lvl>
+    <w:lvl w:ilvl="6" w:tplc="04090001" w:tentative="1">
+      <w:start w:val="1"/>
+      <w:numFmt w:val="bullet"/>
+      <w:lvlText w:val=""/>
+      <w:lvlJc w:val="left"/>
+      <w:pPr>
+        <w:ind w:left="5040" w:hanging="360"/>
+      </w:pPr>
+      <w:rPr>
+        <w:rFonts w:ascii="Symbol" w:hAnsi="Symbol" w:hint="default"/>
+      </w:rPr>
+    </w:lvl>
+    <w:lvl w:ilvl="7" w:tplc="04090003" w:tentative="1">
+      <w:start w:val="1"/>
+      <w:numFmt w:val="bullet"/>
+      <w:lvlText w:val="o"/>
+      <w:lvlJc w:val="left"/>
+      <w:pPr>
+        <w:ind w:left="5760" w:hanging="360"/>
+      </w:pPr>
+      <w:rPr>
+        <w:rFonts w:ascii="Courier New" w:hAnsi="Courier New" w:cs="Courier New" w:hint="default"/>
+      </w:rPr>
+    </w:lvl>
+    <w:lvl w:ilvl="8" w:tplc="04090005" w:tentative="1">
+      <w:start w:val="1"/>
+      <w:numFmt w:val="bullet"/>
+      <w:lvlText w:val=""/>
+      <w:lvlJc w:val="left"/>
+      <w:pPr>
+        <w:ind w:left="6480" w:hanging="360"/>
+      </w:pPr>
+      <w:rPr>
+        <w:rFonts w:ascii="Wingdings" w:hAnsi="Wingdings" w:hint="default"/>
+      </w:rPr>
+    </w:lvl>
+  </w:abstractNum>
+  <w:abstractNum w:abstractNumId="11" w15:restartNumberingAfterBreak="0">
     <w:nsid w:val="4D684A34"/>
     <w:multiLevelType w:val="multilevel"/>
     <w:tmpl w:val="F946A88C"/>
@@ -10713,7 +11026,7 @@
       </w:rPr>
     </w:lvl>
   </w:abstractNum>
-  <w:abstractNum w:abstractNumId="11" w15:restartNumberingAfterBreak="0">
+  <w:abstractNum w:abstractNumId="12" w15:restartNumberingAfterBreak="0">
     <w:nsid w:val="4DE63528"/>
     <w:multiLevelType w:val="multilevel"/>
     <w:tmpl w:val="1C86A6C4"/>
@@ -10862,7 +11175,7 @@
       </w:rPr>
     </w:lvl>
   </w:abstractNum>
-  <w:abstractNum w:abstractNumId="12" w15:restartNumberingAfterBreak="0">
+  <w:abstractNum w:abstractNumId="13" w15:restartNumberingAfterBreak="0">
     <w:nsid w:val="4E4042AD"/>
     <w:multiLevelType w:val="hybridMultilevel"/>
     <w:tmpl w:val="124661F6"/>
@@ -10952,7 +11265,7 @@
       </w:pPr>
     </w:lvl>
   </w:abstractNum>
-  <w:abstractNum w:abstractNumId="13" w15:restartNumberingAfterBreak="0">
+  <w:abstractNum w:abstractNumId="14" w15:restartNumberingAfterBreak="0">
     <w:nsid w:val="5061530E"/>
     <w:multiLevelType w:val="hybridMultilevel"/>
     <w:tmpl w:val="A886C950"/>
@@ -11041,7 +11354,7 @@
       </w:pPr>
     </w:lvl>
   </w:abstractNum>
-  <w:abstractNum w:abstractNumId="14" w15:restartNumberingAfterBreak="0">
+  <w:abstractNum w:abstractNumId="15" w15:restartNumberingAfterBreak="0">
     <w:nsid w:val="58A4521E"/>
     <w:multiLevelType w:val="hybridMultilevel"/>
     <w:tmpl w:val="4190B3C0"/>
@@ -11154,7 +11467,7 @@
       </w:rPr>
     </w:lvl>
   </w:abstractNum>
-  <w:abstractNum w:abstractNumId="15" w15:restartNumberingAfterBreak="0">
+  <w:abstractNum w:abstractNumId="16" w15:restartNumberingAfterBreak="0">
     <w:nsid w:val="5A291053"/>
     <w:multiLevelType w:val="hybridMultilevel"/>
     <w:tmpl w:val="EBBE9508"/>
@@ -11240,7 +11553,7 @@
       </w:pPr>
     </w:lvl>
   </w:abstractNum>
-  <w:abstractNum w:abstractNumId="16" w15:restartNumberingAfterBreak="0">
+  <w:abstractNum w:abstractNumId="17" w15:restartNumberingAfterBreak="0">
     <w:nsid w:val="5C73715F"/>
     <w:multiLevelType w:val="multilevel"/>
     <w:tmpl w:val="1AB28810"/>
@@ -11389,7 +11702,7 @@
       </w:rPr>
     </w:lvl>
   </w:abstractNum>
-  <w:abstractNum w:abstractNumId="17" w15:restartNumberingAfterBreak="0">
+  <w:abstractNum w:abstractNumId="18" w15:restartNumberingAfterBreak="0">
     <w:nsid w:val="5CA440D5"/>
     <w:multiLevelType w:val="hybridMultilevel"/>
     <w:tmpl w:val="C5F4CE26"/>
@@ -11481,7 +11794,7 @@
       </w:pPr>
     </w:lvl>
   </w:abstractNum>
-  <w:abstractNum w:abstractNumId="18" w15:restartNumberingAfterBreak="0">
+  <w:abstractNum w:abstractNumId="19" w15:restartNumberingAfterBreak="0">
     <w:nsid w:val="67556A68"/>
     <w:multiLevelType w:val="hybridMultilevel"/>
     <w:tmpl w:val="EFD8CECE"/>
@@ -11594,7 +11907,7 @@
       </w:rPr>
     </w:lvl>
   </w:abstractNum>
-  <w:abstractNum w:abstractNumId="19" w15:restartNumberingAfterBreak="0">
+  <w:abstractNum w:abstractNumId="20" w15:restartNumberingAfterBreak="0">
     <w:nsid w:val="6B142C73"/>
     <w:multiLevelType w:val="hybridMultilevel"/>
     <w:tmpl w:val="060A16D8"/>
@@ -11684,7 +11997,7 @@
       </w:pPr>
     </w:lvl>
   </w:abstractNum>
-  <w:abstractNum w:abstractNumId="20" w15:restartNumberingAfterBreak="0">
+  <w:abstractNum w:abstractNumId="21" w15:restartNumberingAfterBreak="0">
     <w:nsid w:val="79ED38D8"/>
     <w:multiLevelType w:val="hybridMultilevel"/>
     <w:tmpl w:val="06ECFAAC"/>
@@ -11770,7 +12083,7 @@
       </w:pPr>
     </w:lvl>
   </w:abstractNum>
-  <w:abstractNum w:abstractNumId="21" w15:restartNumberingAfterBreak="0">
+  <w:abstractNum w:abstractNumId="22" w15:restartNumberingAfterBreak="0">
     <w:nsid w:val="7ADD48EB"/>
     <w:multiLevelType w:val="multilevel"/>
     <w:tmpl w:val="54DE42C8"/>
@@ -11920,37 +12233,37 @@
     </w:lvl>
   </w:abstractNum>
   <w:num w:numId="1" w16cid:durableId="580529723">
-    <w:abstractNumId w:val="14"/>
+    <w:abstractNumId w:val="15"/>
   </w:num>
   <w:num w:numId="2" w16cid:durableId="1103454760">
-    <w:abstractNumId w:val="15"/>
+    <w:abstractNumId w:val="16"/>
   </w:num>
   <w:num w:numId="3" w16cid:durableId="988897025">
-    <w:abstractNumId w:val="20"/>
+    <w:abstractNumId w:val="21"/>
   </w:num>
   <w:num w:numId="4" w16cid:durableId="241794348">
-    <w:abstractNumId w:val="18"/>
+    <w:abstractNumId w:val="19"/>
   </w:num>
   <w:num w:numId="5" w16cid:durableId="761492297">
-    <w:abstractNumId w:val="13"/>
+    <w:abstractNumId w:val="14"/>
   </w:num>
   <w:num w:numId="6" w16cid:durableId="961813102">
     <w:abstractNumId w:val="2"/>
   </w:num>
   <w:num w:numId="7" w16cid:durableId="396629680">
-    <w:abstractNumId w:val="11"/>
+    <w:abstractNumId w:val="12"/>
   </w:num>
   <w:num w:numId="8" w16cid:durableId="185141817">
     <w:abstractNumId w:val="9"/>
   </w:num>
   <w:num w:numId="9" w16cid:durableId="1398824409">
-    <w:abstractNumId w:val="10"/>
+    <w:abstractNumId w:val="11"/>
   </w:num>
   <w:num w:numId="10" w16cid:durableId="267391491">
     <w:abstractNumId w:val="8"/>
   </w:num>
   <w:num w:numId="11" w16cid:durableId="413861032">
-    <w:abstractNumId w:val="16"/>
+    <w:abstractNumId w:val="17"/>
   </w:num>
   <w:num w:numId="12" w16cid:durableId="771164075">
     <w:abstractNumId w:val="7"/>
@@ -11962,7 +12275,7 @@
     <w:abstractNumId w:val="6"/>
   </w:num>
   <w:num w:numId="15" w16cid:durableId="1065252378">
-    <w:abstractNumId w:val="21"/>
+    <w:abstractNumId w:val="22"/>
   </w:num>
   <w:num w:numId="16" w16cid:durableId="1041245015">
     <w:abstractNumId w:val="0"/>
@@ -11971,7 +12284,7 @@
     <w:abstractNumId w:val="4"/>
   </w:num>
   <w:num w:numId="18" w16cid:durableId="1019889030">
-    <w:abstractNumId w:val="17"/>
+    <w:abstractNumId w:val="18"/>
     <w:lvlOverride w:ilvl="0">
       <w:startOverride w:val="1"/>
     </w:lvlOverride>
@@ -12001,22 +12314,25 @@
     </w:lvlOverride>
   </w:num>
   <w:num w:numId="19" w16cid:durableId="801119751">
-    <w:abstractNumId w:val="12"/>
+    <w:abstractNumId w:val="13"/>
   </w:num>
   <w:num w:numId="20" w16cid:durableId="1832600420">
     <w:abstractNumId w:val="3"/>
   </w:num>
   <w:num w:numId="21" w16cid:durableId="214969792">
-    <w:abstractNumId w:val="19"/>
+    <w:abstractNumId w:val="20"/>
   </w:num>
   <w:num w:numId="22" w16cid:durableId="617025433">
     <w:abstractNumId w:val="1"/>
+  </w:num>
+  <w:num w:numId="23" w16cid:durableId="1603802593">
+    <w:abstractNumId w:val="10"/>
   </w:num>
 </w:numbering>
 </file>
 
 <file path=word/styles.xml><?xml version="1.0" encoding="utf-8"?>
-<w:styles xmlns:mc="http://schemas.openxmlformats.org/markup-compatibility/2006" xmlns:r="http://schemas.openxmlformats.org/officeDocument/2006/relationships" xmlns:w="http://schemas.openxmlformats.org/wordprocessingml/2006/main" xmlns:w14="http://schemas.microsoft.com/office/word/2010/wordml" xmlns:w15="http://schemas.microsoft.com/office/word/2012/wordml" xmlns:w16cex="http://schemas.microsoft.com/office/word/2018/wordml/cex" xmlns:w16cid="http://schemas.microsoft.com/office/word/2016/wordml/cid" xmlns:w16="http://schemas.microsoft.com/office/word/2018/wordml" xmlns:w16sdtdh="http://schemas.microsoft.com/office/word/2020/wordml/sdtdatahash" xmlns:w16sdtfl="http://schemas.microsoft.com/office/word/2024/wordml/sdtformatlock" xmlns:w16se="http://schemas.microsoft.com/office/word/2015/wordml/symex" xmlns:w16du="http://schemas.microsoft.com/office/word/2023/wordml/word16du" mc:Ignorable="w14 w15 w16se w16cid w16 w16cex w16sdtdh w16sdtfl w16du">
+<w:styles xmlns:mc="http://schemas.openxmlformats.org/markup-compatibility/2006" xmlns:r="http://schemas.openxmlformats.org/officeDocument/2006/relationships" xmlns:w="http://schemas.openxmlformats.org/wordprocessingml/2006/main" xmlns:w14="http://schemas.microsoft.com/office/word/2010/wordml" xmlns:w15="http://schemas.microsoft.com/office/word/2012/wordml" xmlns:w16cex="http://schemas.microsoft.com/office/word/2018/wordml/cex" xmlns:w16cid="http://schemas.microsoft.com/office/word/2016/wordml/cid" xmlns:w16="http://schemas.microsoft.com/office/word/2018/wordml" xmlns:w16sdtdh="http://schemas.microsoft.com/office/word/2020/wordml/sdtdatahash" xmlns:w16se="http://schemas.microsoft.com/office/word/2015/wordml/symex" mc:Ignorable="w14 w15 w16se w16cid w16 w16cex w16sdtdh">
   <w:docDefaults>
     <w:rPrDefault>
       <w:rPr>

</xml_diff>

<commit_message>
Small update on the doc
</commit_message>
<xml_diff>
--- a/Documentation/Analysis/System Proposal/System proposal.docx
+++ b/Documentation/Analysis/System Proposal/System proposal.docx
@@ -11,12 +11,6 @@
           <w:lang w:bidi="fa-IR"/>
         </w:rPr>
       </w:pPr>
-      <w:r>
-        <w:rPr>
-          <w:lang w:bidi="fa-IR"/>
-        </w:rPr>
-        <w:t>This is a test</w:t>
-      </w:r>
       <w:r>
         <w:rPr>
           <w:rFonts w:hint="cs"/>
@@ -815,7 +809,6 @@
       <w:pPr>
         <w:jc w:val="center"/>
         <w:rPr>
-          <w:rtl/>
           <w:lang w:bidi="fa-IR"/>
         </w:rPr>
       </w:pPr>
@@ -824,6 +817,20 @@
           <w:lang w:bidi="fa-IR"/>
         </w:rPr>
         <w:t>1405/4/25</w:t>
+      </w:r>
+      <w:r>
+        <w:rPr>
+          <w:rFonts w:hint="cs"/>
+          <w:rtl/>
+          <w:lang w:bidi="fa-IR"/>
+        </w:rPr>
+        <w:t>‍‍</w:t>
+      </w:r>
+      <w:r>
+        <w:rPr>
+          <w:lang w:bidi="fa-IR"/>
+        </w:rPr>
+        <w:t>~</w:t>
       </w:r>
     </w:p>
     <w:bookmarkStart w:id="0" w:name="_Toc234084107" w:displacedByCustomXml="next"/>
@@ -6770,6 +6777,11 @@
     <w:p>
       <w:pPr>
         <w:pStyle w:val="Heading2"/>
+        <w:rPr>
+          <w:rFonts w:hint="cs"/>
+          <w:rtl/>
+          <w:lang w:bidi="fa-IR"/>
+        </w:rPr>
       </w:pPr>
       <w:bookmarkStart w:id="2" w:name="_Toc234084109"/>
       <w:r>
@@ -6786,10 +6798,19 @@
         <w:t>ر</w:t>
       </w:r>
       <w:bookmarkEnd w:id="2"/>
+      <w:r>
+        <w:rPr>
+          <w:rFonts w:hint="cs"/>
+          <w:rtl/>
+        </w:rPr>
+        <w:t>:</w:t>
+      </w:r>
     </w:p>
     <w:p>
       <w:pPr>
         <w:rPr>
+          <w:rFonts w:hint="cs"/>
+          <w:rtl/>
           <w:lang w:bidi="fa-IR"/>
         </w:rPr>
       </w:pPr>
@@ -6833,6 +6854,13 @@
         <w:t>بیان مسئله</w:t>
       </w:r>
       <w:bookmarkEnd w:id="3"/>
+      <w:r>
+        <w:rPr>
+          <w:rFonts w:hint="cs"/>
+          <w:rtl/>
+        </w:rPr>
+        <w:t>:</w:t>
+      </w:r>
     </w:p>
     <w:p>
       <w:r>

</xml_diff>